<commit_message>
Update Spanish Bible reference text for 2026-09-01
</commit_message>
<xml_diff>
--- a/spa/docx/01.content.docx
+++ b/spa/docx/01.content.docx
@@ -256,7 +256,7 @@
         <w:rPr>
           <w:lang w:val="es_ES" w:bidi="es_ES"/>
         </w:rPr>
-        <w:t xml:space="preserve"> Entonces Dios dijo:—¡Que haya luz! Y apareció la luz.</w:t>
+        <w:t xml:space="preserve"> Entonces Dios dijo: —¡Que haya luz! Y apareció la luz.</w:t>
       </w:r>
     </w:p>
     <w:p>
@@ -298,7 +298,7 @@
         <w:rPr>
           <w:lang w:val="es_ES" w:bidi="es_ES"/>
         </w:rPr>
-        <w:t xml:space="preserve"> A la luz Dios la llamó «día», y a la oscuridad la llamó «noche». Y pasó la tarde y luego la mañana: ese fue el primer día.</w:t>
+        <w:t xml:space="preserve"> A la luz Dios la llamó “día”, y a la oscuridad la llamó “noche”. Y pasó la tarde y luego la mañana: ese fue el primer día.</w:t>
       </w:r>
     </w:p>
     <w:p>
@@ -361,7 +361,7 @@
         <w:rPr>
           <w:lang w:val="es_ES" w:bidi="es_ES"/>
         </w:rPr>
-        <w:t xml:space="preserve"> A la expansión Dios la llamó «cielo». Y pasó la tarde y luego la mañana: ese fue el segundo día.</w:t>
+        <w:t xml:space="preserve"> A la expansión Dios la llamó “cielo”. Y pasó la tarde y luego la mañana: ese fue el segundo día.</w:t>
       </w:r>
     </w:p>
     <w:p>
@@ -403,22 +403,22 @@
         <w:rPr>
           <w:lang w:val="es_ES" w:bidi="es_ES"/>
         </w:rPr>
-        <w:t xml:space="preserve"> Y a lo seco Dios lo llamó «tierra», y a las aguas las llamó «mares». Y Dios vio que era bueno.</w:t>
-      </w:r>
-    </w:p>
-    <w:p>
-      <w:pPr/>
-      <w:r>
-        <w:rPr>
-          <w:lang w:val="es_ES" w:bidi="es_ES"/>
-        </w:rPr>
-      </w:r>
-      <w:r>
-        <w:rPr>
-          <w:vertAlign w:val="superscript"/>
-          <w:lang w:val="es_ES" w:bidi="es_ES"/>
-        </w:rPr>
-        <w:t>12</w:t>
+        <w:t xml:space="preserve"> Y a lo seco Dios lo llamó “tierra”, y a las aguas las llamó “mares”. Y Dios vio que era bueno.</w:t>
+      </w:r>
+    </w:p>
+    <w:p>
+      <w:pPr/>
+      <w:r>
+        <w:rPr>
+          <w:lang w:val="es_ES" w:bidi="es_ES"/>
+        </w:rPr>
+      </w:r>
+      <w:r>
+        <w:rPr>
+          <w:vertAlign w:val="superscript"/>
+          <w:lang w:val="es_ES" w:bidi="es_ES"/>
+        </w:rPr>
+        <w:t>11-12</w:t>
       </w:r>
       <w:r>
         <w:rPr>
@@ -460,13 +460,13 @@
           <w:vertAlign w:val="superscript"/>
           <w:lang w:val="es_ES" w:bidi="es_ES"/>
         </w:rPr>
-        <w:t>15</w:t>
-      </w:r>
-      <w:r>
-        <w:rPr>
-          <w:lang w:val="es_ES" w:bidi="es_ES"/>
-        </w:rPr>
-        <w:t xml:space="preserve"> Después Dios dijo: —Que haya luces en el cielo, para que separen el día de la noche, y para que marquen las estaciones, los días y los años. Que alumbren la tierra desde la expansión del cielo.Y así fue.</w:t>
+        <w:t>14-15</w:t>
+      </w:r>
+      <w:r>
+        <w:rPr>
+          <w:lang w:val="es_ES" w:bidi="es_ES"/>
+        </w:rPr>
+        <w:t xml:space="preserve"> Después Dios dijo: —Que haya luces en el cielo, para que separen el día de la noche, y para que marquen las estaciones, los días y los años. Que alumbren la tierra desde la expansión del cielo. Y así fue.</w:t>
       </w:r>
     </w:p>
     <w:p>
@@ -502,7 +502,7 @@
           <w:vertAlign w:val="superscript"/>
           <w:lang w:val="es_ES" w:bidi="es_ES"/>
         </w:rPr>
-        <w:t>18</w:t>
+        <w:t>17-18</w:t>
       </w:r>
       <w:r>
         <w:rPr>
@@ -676,7 +676,7 @@
         <w:rPr>
           <w:lang w:val="es_ES" w:bidi="es_ES"/>
         </w:rPr>
-        <w:t xml:space="preserve"> Entonces Dios dijo:—Hagamos al ser humano1 a nuestra imagen, conforme a nuestra semejanza, para que cuide y reine sobre los peces del mar, las aves del cielo, los animales domésticos y salvajes, y los reptiles.</w:t>
+        <w:t xml:space="preserve"> Entonces Dios dijo: —Hagamos al ser humano a nuestra imagen, conforme a nuestra semejanza, para que cuide y reine sobre los peces del mar, las aves del cielo, los animales domésticos y salvajes, y los reptiles.</w:t>
       </w:r>
     </w:p>
     <w:p>
@@ -718,7 +718,7 @@
         <w:rPr>
           <w:lang w:val="es_ES" w:bidi="es_ES"/>
         </w:rPr>
-        <w:t xml:space="preserve"> Luego Dios los bendijo y les dijo: —Sean fructíferos y multiplíquense. Llenen la tierra, y cuíden y reinen sobre ella. Cuiden y reinen sobre los peces del mar, las aves del cielo y todos los seres vivos de la tierra.</w:t>
+        <w:t xml:space="preserve"> Luego Dios los bendijo y les dijo: —Sean fructíferos y multiplíquense. Llenen la tierra, y cuiden y reinen sobre ella. Cuiden y reinen sobre los peces del mar, las aves del cielo y todos los seres vivos de la tierra.</w:t>
       </w:r>
     </w:p>
     <w:p>
@@ -1007,22 +1007,22 @@
         <w:rPr>
           <w:lang w:val="es_ES" w:bidi="es_ES"/>
         </w:rPr>
-        <w:t xml:space="preserve"> De Edén salía un río que atravesaba el jardín para regarlo. Después el río se dividía en cuatro ríos menores.</w:t>
-      </w:r>
-    </w:p>
-    <w:p>
-      <w:pPr/>
-      <w:r>
-        <w:rPr>
-          <w:lang w:val="es_ES" w:bidi="es_ES"/>
-        </w:rPr>
-      </w:r>
-      <w:r>
-        <w:rPr>
-          <w:vertAlign w:val="superscript"/>
-          <w:lang w:val="es_ES" w:bidi="es_ES"/>
-        </w:rPr>
-        <w:t>12</w:t>
+        <w:t xml:space="preserve"> De Edén salía un río que atravesaba el jardín para regarlo. Después el río se dividía en 4 ríos menores.</w:t>
+      </w:r>
+    </w:p>
+    <w:p>
+      <w:pPr/>
+      <w:r>
+        <w:rPr>
+          <w:lang w:val="es_ES" w:bidi="es_ES"/>
+        </w:rPr>
+      </w:r>
+      <w:r>
+        <w:rPr>
+          <w:vertAlign w:val="superscript"/>
+          <w:lang w:val="es_ES" w:bidi="es_ES"/>
+        </w:rPr>
+        <w:t>11-12</w:t>
       </w:r>
       <w:r>
         <w:rPr>
@@ -1169,7 +1169,7 @@
           <w:vertAlign w:val="superscript"/>
           <w:lang w:val="es_ES" w:bidi="es_ES"/>
         </w:rPr>
-        <w:t>20</w:t>
+        <w:t>19-20</w:t>
       </w:r>
       <w:r>
         <w:rPr>
@@ -1238,7 +1238,7 @@
         <w:rPr>
           <w:lang w:val="es_ES" w:bidi="es_ES"/>
         </w:rPr>
-        <w:t xml:space="preserve"> Al verla, el hombre dijo: «Esta es ahora hueso de mis huesos y carne de mi carne; por eso se llamará "mujer","mujer": En hebreo, mujer (’ishah) suena como la palabra que significa hombre (’ish)." class="footnote-marker"&gt;1 porque fue sacada del hombre».</w:t>
+        <w:t xml:space="preserve"> Al verla, el hombre dijo: —Esta es ahora hueso de mis huesos y carne de mi carne; por eso se llamará “mujer”, porque fue sacada del hombre.</w:t>
       </w:r>
     </w:p>
     <w:p>
@@ -1317,7 +1317,7 @@
         <w:rPr>
           <w:lang w:val="es_ES" w:bidi="es_ES"/>
         </w:rPr>
-        <w:t xml:space="preserve"> La serpiente, que era el más astuto de todos los animales salvajes que Dios el Señor había creado, se acercó a la mujer y le preguntó: ―¿Así que Dios no les permite comer de ningún árbol del jardín?</w:t>
+        <w:t xml:space="preserve"> La serpiente, que era el más astuto de todos los animales salvajes que Dios el Señor había creado, se acercó a la mujer y le preguntó: —¿Así que Dios no les permite comer de ningún árbol del jardín?</w:t>
       </w:r>
     </w:p>
     <w:p>
@@ -1338,7 +1338,7 @@
         <w:rPr>
           <w:lang w:val="es_ES" w:bidi="es_ES"/>
         </w:rPr>
-        <w:t xml:space="preserve"> La mujer le contestó: ―Podemos comer del fruto de todos los árboles del jardín,</w:t>
+        <w:t xml:space="preserve"> La mujer le contestó: —Podemos comer del fruto de todos los árboles del jardín,</w:t>
       </w:r>
     </w:p>
     <w:p>
@@ -1380,7 +1380,7 @@
         <w:rPr>
           <w:lang w:val="es_ES" w:bidi="es_ES"/>
         </w:rPr>
-        <w:t xml:space="preserve"> ―¡Mentira! —dijo la serpiente—. ¡No morirán!</w:t>
+        <w:t xml:space="preserve"> —¡Mentira! —dijo la serpiente—. ¡No morirán!</w:t>
       </w:r>
     </w:p>
     <w:p>
@@ -1485,7 +1485,7 @@
         <w:rPr>
           <w:lang w:val="es_ES" w:bidi="es_ES"/>
         </w:rPr>
-        <w:t xml:space="preserve"> Pero Dios el Señor llamó al hombre y le preguntó: ―¿Dónde estás?</w:t>
+        <w:t xml:space="preserve"> Pero Dios el Señor llamó al hombre y le preguntó: —¿Dónde estás?</w:t>
       </w:r>
     </w:p>
     <w:p>
@@ -1716,7 +1716,7 @@
         <w:rPr>
           <w:lang w:val="es_ES" w:bidi="es_ES"/>
         </w:rPr>
-        <w:t xml:space="preserve"> Luego el hombre llamó a su esposa Eva,Eva: En hebreo, Eva significa vida." class="footnote-marker"&gt;1 porque ella fue la madre de todos los vivientes.</w:t>
+        <w:t xml:space="preserve"> Luego el hombre llamó a su esposa Eva, porque ella fue la madre de todos los vivientes.</w:t>
       </w:r>
     </w:p>
     <w:p>
@@ -1837,7 +1837,7 @@
         <w:rPr>
           <w:lang w:val="es_ES" w:bidi="es_ES"/>
         </w:rPr>
-        <w:t xml:space="preserve"> Adán se acostó con su esposa Eva, y ella quedó embarazada. Dio a luz a su hijo Caín, y dijo:—Es con la ayuda del Señor que he tenido un hijo varón.</w:t>
+        <w:t xml:space="preserve"> Adán se acostó con su esposa Eva, y ella quedó embarazada. Dio a luz a su hijo Caín, y dijo: —Es con la ayuda del Señor que he tenido un hijo varón.</w:t>
       </w:r>
     </w:p>
     <w:p>
@@ -1942,7 +1942,7 @@
         <w:rPr>
           <w:lang w:val="es_ES" w:bidi="es_ES"/>
         </w:rPr>
-        <w:t xml:space="preserve"> Entonces el Señor le preguntó: ―¿Por qué te enojaste tanto y andas tan amargado?</w:t>
+        <w:t xml:space="preserve"> Entonces el Señor le preguntó: —¿Por qué te enojaste tanto y andas tan amargado?</w:t>
       </w:r>
     </w:p>
     <w:p>
@@ -1984,7 +1984,7 @@
         <w:rPr>
           <w:lang w:val="es_ES" w:bidi="es_ES"/>
         </w:rPr>
-        <w:t xml:space="preserve"> Un día Caín invitó a su hermano a salir al campo. Cuando estaban en el campo, Caín atacó a su hermano y lo mató.</w:t>
+        <w:t xml:space="preserve"> Un día, Caín invitó a su hermano a salir al campo. Cuando estaban en el campo, Caín atacó a su hermano y lo mató.</w:t>
       </w:r>
     </w:p>
     <w:p>
@@ -2005,7 +2005,7 @@
         <w:rPr>
           <w:lang w:val="es_ES" w:bidi="es_ES"/>
         </w:rPr>
-        <w:t xml:space="preserve"> El Señor le preguntó a Caín: ―¿Dónde está Abel, tu hermano? Caín le contestó: ―No lo sé. ¿Acaso tengo la obligación de cuidar a mi hermano?</w:t>
+        <w:t xml:space="preserve"> El Señor le preguntó a Caín: —¿Dónde está Abel, tu hermano? Caín le contestó: —No lo sé. ¿Acaso tengo la obligación de cuidar a mi hermano?</w:t>
       </w:r>
     </w:p>
     <w:p>
@@ -2026,7 +2026,7 @@
         <w:rPr>
           <w:lang w:val="es_ES" w:bidi="es_ES"/>
         </w:rPr>
-        <w:t xml:space="preserve"> Pero el Señor le dijo: ―¿Qué has hecho? La sangre de tu hermano me reclama justicia desde la tierra.</w:t>
+        <w:t xml:space="preserve"> Pero el Señor le dijo: —¿Qué has hecho? La sangre de tu hermano me reclama justicia desde la tierra.</w:t>
       </w:r>
     </w:p>
     <w:p>
@@ -2089,7 +2089,7 @@
         <w:rPr>
           <w:lang w:val="es_ES" w:bidi="es_ES"/>
         </w:rPr>
-        <w:t xml:space="preserve"> Caín le dijo al Señor: ―Mi castigo es demasiado grande para soportarlo.</w:t>
+        <w:t xml:space="preserve"> Caín le dijo al Señor: —Mi castigo es demasiado grande para soportarlo.</w:t>
       </w:r>
     </w:p>
     <w:p>
@@ -2131,7 +2131,7 @@
         <w:rPr>
           <w:lang w:val="es_ES" w:bidi="es_ES"/>
         </w:rPr>
-        <w:t xml:space="preserve"> El Señor le contestó: ―No será así. Cualquiera que mate a Caín sufrirá venganza siete veces. Entonces el Señor puso una marca sobre Caín, para que nadie lo matara.</w:t>
+        <w:t xml:space="preserve"> El Señor le contestó: —No será así. Cualquiera que mate a Caín sufrirá venganza 7 veces. Entonces el Señor puso una marca sobre Caín, para que nadie lo matara.</w:t>
       </w:r>
     </w:p>
     <w:p>
@@ -2152,7 +2152,7 @@
         <w:rPr>
           <w:lang w:val="es_ES" w:bidi="es_ES"/>
         </w:rPr>
-        <w:t xml:space="preserve"> Entonces Caín se alejó de la presencia del Señor y fue a vivir a la región de Nod,Nod: En hebreo, Nod quiere decir errante." class="footnote-marker"&gt;1 al oriente del Edén.</w:t>
+        <w:t xml:space="preserve"> Entonces Caín se alejó de la presencia del Señor y fue a vivir a la región de Nod, al oriente del Edén.</w:t>
       </w:r>
     </w:p>
     <w:p>
@@ -2341,7 +2341,7 @@
         <w:rPr>
           <w:lang w:val="es_ES" w:bidi="es_ES"/>
         </w:rPr>
-        <w:t xml:space="preserve"> Adán volvió a acostarse con su esposa, y ella dio a luz un hijo. Lo llamó Set, pues dijo:—Dios me ha dado otro hijo en lugar de Abel, al que Caín mató.</w:t>
+        <w:t xml:space="preserve"> Adán volvió a acostarse con su esposa, y ella dio a luz un hijo. Lo llamó Set, pues dijo: —Dios me ha dado otro hijo en lugar de Abel, al que Caín mató.</w:t>
       </w:r>
     </w:p>
     <w:p>
@@ -2420,22 +2420,22 @@
         <w:rPr>
           <w:lang w:val="es_ES" w:bidi="es_ES"/>
         </w:rPr>
-        <w:t xml:space="preserve"> Los creó varón y mujer, y los bendijo. En el día que los creó, los llamó «seres humanos».</w:t>
-      </w:r>
-    </w:p>
-    <w:p>
-      <w:pPr/>
-      <w:r>
-        <w:rPr>
-          <w:lang w:val="es_ES" w:bidi="es_ES"/>
-        </w:rPr>
-      </w:r>
-      <w:r>
-        <w:rPr>
-          <w:vertAlign w:val="superscript"/>
-          <w:lang w:val="es_ES" w:bidi="es_ES"/>
-        </w:rPr>
-        <w:t>5</w:t>
+        <w:t xml:space="preserve"> Los creó varón y mujer, y los bendijo. En el día que los creó, los llamó “seres humanos”.</w:t>
+      </w:r>
+    </w:p>
+    <w:p>
+      <w:pPr/>
+      <w:r>
+        <w:rPr>
+          <w:lang w:val="es_ES" w:bidi="es_ES"/>
+        </w:rPr>
+      </w:r>
+      <w:r>
+        <w:rPr>
+          <w:vertAlign w:val="superscript"/>
+          <w:lang w:val="es_ES" w:bidi="es_ES"/>
+        </w:rPr>
+        <w:t>3-5</w:t>
       </w:r>
       <w:r>
         <w:rPr>
@@ -2456,7 +2456,7 @@
           <w:vertAlign w:val="superscript"/>
           <w:lang w:val="es_ES" w:bidi="es_ES"/>
         </w:rPr>
-        <w:t>8</w:t>
+        <w:t>6-8</w:t>
       </w:r>
       <w:r>
         <w:rPr>
@@ -2477,7 +2477,7 @@
           <w:vertAlign w:val="superscript"/>
           <w:lang w:val="es_ES" w:bidi="es_ES"/>
         </w:rPr>
-        <w:t>11</w:t>
+        <w:t>9-11</w:t>
       </w:r>
       <w:r>
         <w:rPr>
@@ -2498,7 +2498,7 @@
           <w:vertAlign w:val="superscript"/>
           <w:lang w:val="es_ES" w:bidi="es_ES"/>
         </w:rPr>
-        <w:t>14</w:t>
+        <w:t>12-14</w:t>
       </w:r>
       <w:r>
         <w:rPr>
@@ -2519,7 +2519,7 @@
           <w:vertAlign w:val="superscript"/>
           <w:lang w:val="es_ES" w:bidi="es_ES"/>
         </w:rPr>
-        <w:t>17</w:t>
+        <w:t>15-17</w:t>
       </w:r>
       <w:r>
         <w:rPr>
@@ -2540,7 +2540,7 @@
           <w:vertAlign w:val="superscript"/>
           <w:lang w:val="es_ES" w:bidi="es_ES"/>
         </w:rPr>
-        <w:t>20</w:t>
+        <w:t>18-20</w:t>
       </w:r>
       <w:r>
         <w:rPr>
@@ -2561,7 +2561,7 @@
           <w:vertAlign w:val="superscript"/>
           <w:lang w:val="es_ES" w:bidi="es_ES"/>
         </w:rPr>
-        <w:t>24</w:t>
+        <w:t>21-24</w:t>
       </w:r>
       <w:r>
         <w:rPr>
@@ -2582,7 +2582,7 @@
           <w:vertAlign w:val="superscript"/>
           <w:lang w:val="es_ES" w:bidi="es_ES"/>
         </w:rPr>
-        <w:t>27</w:t>
+        <w:t>25-27</w:t>
       </w:r>
       <w:r>
         <w:rPr>
@@ -2603,13 +2603,13 @@
           <w:vertAlign w:val="superscript"/>
           <w:lang w:val="es_ES" w:bidi="es_ES"/>
         </w:rPr>
-        <w:t>31</w:t>
-      </w:r>
-      <w:r>
-        <w:rPr>
-          <w:lang w:val="es_ES" w:bidi="es_ES"/>
-        </w:rPr>
-        <w:t xml:space="preserve"> Lamec tenía 182 años cuando nació su hijo Noé. Lamec lo llamó Noé1 porque se dijo: «Él nos aliviará del duro trabajo que significa labrar la tierra que Dios maldijo». Después del nacimiento de Noé, Lamec vivió 595 años, tuvo hijos e hijas, y murió a la edad de 777 años.</w:t>
+        <w:t>28-31</w:t>
+      </w:r>
+      <w:r>
+        <w:rPr>
+          <w:lang w:val="es_ES" w:bidi="es_ES"/>
+        </w:rPr>
+        <w:t xml:space="preserve"> Lamec tenía 182 años cuando nació su hijo Noé. Lamec lo llamó Noé porque se dijo: “Él nos aliviará del duro trabajo que significa labrar la tierra que Dios maldijo”. Después del nacimiento de Noé, Lamec vivió 595 años, tuvo hijos e hijas, y murió a la edad de 777 años.</w:t>
       </w:r>
     </w:p>
     <w:p>
@@ -2709,7 +2709,7 @@
         <w:rPr>
           <w:lang w:val="es_ES" w:bidi="es_ES"/>
         </w:rPr>
-        <w:t xml:space="preserve"> Por eso el Señor dijo: «No permanecerá mi espíritu en el ser humano para siempre, porque es un simple mortal; así que solo vivirá 120 años».</w:t>
+        <w:t xml:space="preserve"> Por eso el Señor dijo: —No permanecerá mi espíritu en el ser humano para siempre, porque es un simple mortal. Solo vivirá 120 años.</w:t>
       </w:r>
     </w:p>
     <w:p>
@@ -2745,7 +2745,7 @@
           <w:vertAlign w:val="superscript"/>
           <w:lang w:val="es_ES" w:bidi="es_ES"/>
         </w:rPr>
-        <w:t>6</w:t>
+        <w:t>5-6</w:t>
       </w:r>
       <w:r>
         <w:rPr>
@@ -2772,7 +2772,7 @@
         <w:rPr>
           <w:lang w:val="es_ES" w:bidi="es_ES"/>
         </w:rPr>
-        <w:t xml:space="preserve"> Entonces Dios dijo:—Voy a borrar de la tierra todo lo que he creado: seres humanos, animales, reptiles y aves. ¡Me duele haberlos creado!</w:t>
+        <w:t xml:space="preserve"> Entonces Dios dijo: —Voy a borrar de la tierra todo lo que he creado: seres humanos, animales, reptiles y aves. ¡Me duele haberlos creado!</w:t>
       </w:r>
     </w:p>
     <w:p>
@@ -2850,7 +2850,7 @@
           <w:vertAlign w:val="superscript"/>
           <w:lang w:val="es_ES" w:bidi="es_ES"/>
         </w:rPr>
-        <w:t>13</w:t>
+        <w:t>11-13</w:t>
       </w:r>
       <w:r>
         <w:rPr>
@@ -2976,7 +2976,7 @@
           <w:vertAlign w:val="superscript"/>
           <w:lang w:val="es_ES" w:bidi="es_ES"/>
         </w:rPr>
-        <w:t>20</w:t>
+        <w:t>19-20</w:t>
       </w:r>
       <w:r>
         <w:rPr>
@@ -3160,7 +3160,7 @@
           <w:vertAlign w:val="superscript"/>
           <w:lang w:val="es_ES" w:bidi="es_ES"/>
         </w:rPr>
-        <w:t>7</w:t>
+        <w:t>6-7</w:t>
       </w:r>
       <w:r>
         <w:rPr>
@@ -3181,7 +3181,7 @@
           <w:vertAlign w:val="superscript"/>
           <w:lang w:val="es_ES" w:bidi="es_ES"/>
         </w:rPr>
-        <w:t>9</w:t>
+        <w:t>8-9</w:t>
       </w:r>
       <w:r>
         <w:rPr>
@@ -3286,7 +3286,7 @@
           <w:vertAlign w:val="superscript"/>
           <w:lang w:val="es_ES" w:bidi="es_ES"/>
         </w:rPr>
-        <w:t>15</w:t>
+        <w:t>14-15</w:t>
       </w:r>
       <w:r>
         <w:rPr>
@@ -3412,7 +3412,7 @@
           <w:vertAlign w:val="superscript"/>
           <w:lang w:val="es_ES" w:bidi="es_ES"/>
         </w:rPr>
-        <w:t>22</w:t>
+        <w:t>21-22</w:t>
       </w:r>
       <w:r>
         <w:rPr>
@@ -3539,7 +3539,7 @@
         <w:rPr>
           <w:lang w:val="es_ES" w:bidi="es_ES"/>
         </w:rPr>
-        <w:t xml:space="preserve"> El nivel de las aguas fue bajando poco a poco. Después de ciento cincuenta días las aguas habían bajado bastante.</w:t>
+        <w:t xml:space="preserve"> El nivel de las aguas fue bajando poco a poco. Después de 150 días, las aguas habían bajado bastante.</w:t>
       </w:r>
     </w:p>
     <w:p>
@@ -3806,7 +3806,7 @@
           <w:vertAlign w:val="superscript"/>
           <w:lang w:val="es_ES" w:bidi="es_ES"/>
         </w:rPr>
-        <w:t>17</w:t>
+        <w:t>16-17</w:t>
       </w:r>
       <w:r>
         <w:rPr>
@@ -3896,7 +3896,7 @@
         <w:rPr>
           <w:lang w:val="es_ES" w:bidi="es_ES"/>
         </w:rPr>
-        <w:t xml:space="preserve"> Al Señor le agradó el aroma de los sacrificios, y se dijo a sí mismo: «Nunca más volveré a maldecir la tierra por culpa de la humanidad, pues todos los seres humanos están inclinados hacia el mal desde que son niños. ¡No volveré a destruir a los seres vivos como lo he hecho con este diluvio!</w:t>
+        <w:t xml:space="preserve"> Al Señor le agradó el aroma de los sacrificios, y se dijo a sí mismo: “Nunca más volveré a maldecir la tierra por culpa de la humanidad, pues todos los seres humanos están inclinados hacia el mal desde que son niños. ¡No volveré a destruir a los seres vivos como lo he hecho con este diluvio!</w:t>
       </w:r>
     </w:p>
     <w:p>
@@ -3917,7 +3917,7 @@
         <w:rPr>
           <w:lang w:val="es_ES" w:bidi="es_ES"/>
         </w:rPr>
-        <w:t xml:space="preserve"> Mientras exista la tierra, habrá siembra y cosecha; habrá frío y calor, verano e invierno, día y noche».</w:t>
+        <w:t xml:space="preserve"> Mientras exista la tierra, habrá siembra y cosecha; habrá frío y calor, verano e invierno, día y noche”.</w:t>
       </w:r>
     </w:p>
     <w:p>
@@ -4095,7 +4095,7 @@
           <w:vertAlign w:val="superscript"/>
           <w:lang w:val="es_ES" w:bidi="es_ES"/>
         </w:rPr>
-        <w:t>11</w:t>
+        <w:t>8-11</w:t>
       </w:r>
       <w:r>
         <w:rPr>
@@ -4116,28 +4116,28 @@
           <w:vertAlign w:val="superscript"/>
           <w:lang w:val="es_ES" w:bidi="es_ES"/>
         </w:rPr>
-        <w:t>13</w:t>
-      </w:r>
-      <w:r>
-        <w:rPr>
-          <w:lang w:val="es_ES" w:bidi="es_ES"/>
-        </w:rPr>
-        <w:t xml:space="preserve"> Dios dijo también:—Habrá una señal del pacto que acabo de hacer con ustedes y con todos los animales. Será el arcoíris. Cada vez que aparezca el arcoíris en las nubes, les recordará la promesa que he hecho a toda la tierra.</w:t>
-      </w:r>
-    </w:p>
-    <w:p>
-      <w:pPr/>
-      <w:r>
-        <w:rPr>
-          <w:lang w:val="es_ES" w:bidi="es_ES"/>
-        </w:rPr>
-      </w:r>
-      <w:r>
-        <w:rPr>
-          <w:vertAlign w:val="superscript"/>
-          <w:lang w:val="es_ES" w:bidi="es_ES"/>
-        </w:rPr>
-        <w:t>16</w:t>
+        <w:t>12-13</w:t>
+      </w:r>
+      <w:r>
+        <w:rPr>
+          <w:lang w:val="es_ES" w:bidi="es_ES"/>
+        </w:rPr>
+        <w:t xml:space="preserve"> Dios dijo también: —Habrá una señal del pacto que acabo de hacer con ustedes y con todos los animales. Será el arcoíris. Cada vez que aparezca el arcoíris en las nubes, les recordará la promesa que he hecho a toda la tierra.</w:t>
+      </w:r>
+    </w:p>
+    <w:p>
+      <w:pPr/>
+      <w:r>
+        <w:rPr>
+          <w:lang w:val="es_ES" w:bidi="es_ES"/>
+        </w:rPr>
+      </w:r>
+      <w:r>
+        <w:rPr>
+          <w:vertAlign w:val="superscript"/>
+          <w:lang w:val="es_ES" w:bidi="es_ES"/>
+        </w:rPr>
+        <w:t>14-16</w:t>
       </w:r>
       <w:r>
         <w:rPr>
@@ -4164,7 +4164,7 @@
         <w:rPr>
           <w:lang w:val="es_ES" w:bidi="es_ES"/>
         </w:rPr>
-        <w:t xml:space="preserve"> Dios le dijo a Noé:—Esta es la señal del pacto que hago con todos los seres vivos de la tierra.</w:t>
+        <w:t xml:space="preserve"> Dios le dijo a Noé: —Esta es la señal del pacto que hago con todos los seres vivos de la tierra.</w:t>
       </w:r>
     </w:p>
     <w:p>
@@ -4221,7 +4221,7 @@
           <w:vertAlign w:val="superscript"/>
           <w:lang w:val="es_ES" w:bidi="es_ES"/>
         </w:rPr>
-        <w:t>21</w:t>
+        <w:t>20-21</w:t>
       </w:r>
       <w:r>
         <w:rPr>
@@ -4284,13 +4284,13 @@
           <w:vertAlign w:val="superscript"/>
           <w:lang w:val="es_ES" w:bidi="es_ES"/>
         </w:rPr>
-        <w:t>25</w:t>
-      </w:r>
-      <w:r>
-        <w:rPr>
-          <w:lang w:val="es_ES" w:bidi="es_ES"/>
-        </w:rPr>
-        <w:t xml:space="preserve"> Cuando Noé despertó de su borrachera y supo lo que su hijo menor le había hecho, dijo:—Maldito sea Canaán. Malditos sean sus descendientes. Serán esclavos para sus hermanos. ¡Los más bajos de sus esclavos!</w:t>
+        <w:t>24-25</w:t>
+      </w:r>
+      <w:r>
+        <w:rPr>
+          <w:lang w:val="es_ES" w:bidi="es_ES"/>
+        </w:rPr>
+        <w:t xml:space="preserve"> Cuando Noé despertó de su borrachera y supo lo que su hijo menor le había hecho, dijo: —Maldito sea Canaán. Malditos sean sus descendientes. Serán esclavos para sus hermanos. ¡Los más bajos de sus esclavos!</w:t>
       </w:r>
     </w:p>
     <w:p>
@@ -4311,7 +4311,7 @@
         <w:rPr>
           <w:lang w:val="es_ES" w:bidi="es_ES"/>
         </w:rPr>
-        <w:t xml:space="preserve"> Luego Noé dijo:—¡Bendito sea el Señor, Dios de Sem! ¡Que Canaán sea su esclavo!</w:t>
+        <w:t xml:space="preserve"> Luego Noé dijo: —¡Bendito sea el Señor, Dios de Sem! ¡Que Canaán sea su esclavo!</w:t>
       </w:r>
     </w:p>
     <w:p>
@@ -4537,7 +4537,7 @@
         <w:rPr>
           <w:lang w:val="es_ES" w:bidi="es_ES"/>
         </w:rPr>
-        <w:t xml:space="preserve"> Los hijos de Cus fueron Seba, Javilá, Sabtá, Ragama y Sabteca. Los hijos de Ragama fueron: Sabá y Dedán.</w:t>
+        <w:t xml:space="preserve"> Los hijos de Cus fueron Seba, Javilá, Sabtá, Ragama y Sabteca. Los hijos de Ragama fueron Sabá y Dedán.</w:t>
       </w:r>
     </w:p>
     <w:p>
@@ -4579,7 +4579,7 @@
         <w:rPr>
           <w:lang w:val="es_ES" w:bidi="es_ES"/>
         </w:rPr>
-        <w:t xml:space="preserve"> Nimrod llegó a ser un cazador muy valiente delante del Señor. Por eso se extendió el dicho: «Tan valiente como Nimrod, valiente cazador delante del Señor».</w:t>
+        <w:t xml:space="preserve"> Nimrod llegó a ser un cazador muy valiente delante del Señor. Por eso se extendió el dicho: “Tan valiente como Nimrod, valiente cazador delante del Señor”.</w:t>
       </w:r>
     </w:p>
     <w:p>
@@ -4615,7 +4615,7 @@
           <w:vertAlign w:val="superscript"/>
           <w:lang w:val="es_ES" w:bidi="es_ES"/>
         </w:rPr>
-        <w:t>12</w:t>
+        <w:t>11-12</w:t>
       </w:r>
       <w:r>
         <w:rPr>
@@ -4636,7 +4636,7 @@
           <w:vertAlign w:val="superscript"/>
           <w:lang w:val="es_ES" w:bidi="es_ES"/>
         </w:rPr>
-        <w:t>14</w:t>
+        <w:t>13-14</w:t>
       </w:r>
       <w:r>
         <w:rPr>
@@ -4678,7 +4678,7 @@
           <w:vertAlign w:val="superscript"/>
           <w:lang w:val="es_ES" w:bidi="es_ES"/>
         </w:rPr>
-        <w:t>18</w:t>
+        <w:t>16-18</w:t>
       </w:r>
       <w:r>
         <w:rPr>
@@ -4831,22 +4831,22 @@
         <w:rPr>
           <w:lang w:val="es_ES" w:bidi="es_ES"/>
         </w:rPr>
-        <w:t xml:space="preserve"> Éber tuvo 2 hijos. El primero se llamó Péleg,1 porque en sus días se dividió la tierra. El otro hijo de Éber fue Joctán.</w:t>
-      </w:r>
-    </w:p>
-    <w:p>
-      <w:pPr/>
-      <w:r>
-        <w:rPr>
-          <w:lang w:val="es_ES" w:bidi="es_ES"/>
-        </w:rPr>
-      </w:r>
-      <w:r>
-        <w:rPr>
-          <w:vertAlign w:val="superscript"/>
-          <w:lang w:val="es_ES" w:bidi="es_ES"/>
-        </w:rPr>
-        <w:t>30</w:t>
+        <w:t xml:space="preserve"> Éber tuvo 2 hijos. El primero se llamó Péleg, porque en sus días se dividió la tierra. El otro hijo de Éber fue Joctán.</w:t>
+      </w:r>
+    </w:p>
+    <w:p>
+      <w:pPr/>
+      <w:r>
+        <w:rPr>
+          <w:lang w:val="es_ES" w:bidi="es_ES"/>
+        </w:rPr>
+      </w:r>
+      <w:r>
+        <w:rPr>
+          <w:vertAlign w:val="superscript"/>
+          <w:lang w:val="es_ES" w:bidi="es_ES"/>
+        </w:rPr>
+        <w:t>26-30</w:t>
       </w:r>
       <w:r>
         <w:rPr>
@@ -4994,7 +4994,7 @@
         <w:rPr>
           <w:lang w:val="es_ES" w:bidi="es_ES"/>
         </w:rPr>
-        <w:t xml:space="preserve"> Después dijeron: «Construyamos una ciudad con una torre que llegue hasta el cielo. Así nos haremos famosos y no tendremos que andar dispersados por toda la tierra».</w:t>
+        <w:t xml:space="preserve"> Después dijeron: –Construyamos una ciudad con una torre que llegue hasta el cielo. Así nos haremos famosos y no tendremos que andar dispersados por toda la tierra.</w:t>
       </w:r>
     </w:p>
     <w:p>
@@ -5036,7 +5036,7 @@
         <w:rPr>
           <w:lang w:val="es_ES" w:bidi="es_ES"/>
         </w:rPr>
-        <w:t xml:space="preserve"> Dijo: «Son un solo pueblo y tienen el mismo idioma, por eso hacen esto. Y esta torre es solo la primera de muchas otras obras que harán. ¡Harán todo lo que se propongan y nadie podrá detenerlos!</w:t>
+        <w:t xml:space="preserve"> Dijo: —Son un solo pueblo y tienen el mismo idioma, por eso hacen esto. Y esta torre es solo la primera de muchas otras obras que harán. ¡Harán todo lo que se propongan y nadie podrá detenerlos!</w:t>
       </w:r>
     </w:p>
     <w:p>
@@ -5057,7 +5057,7 @@
         <w:rPr>
           <w:lang w:val="es_ES" w:bidi="es_ES"/>
         </w:rPr>
-        <w:t xml:space="preserve"> Vamos, descendamos y hagamos que hablen idiomas diferentes, para que no puedan entenderse».</w:t>
+        <w:t xml:space="preserve"> Vamos, descendamos y hagamos que hablen idiomas diferentes, para que no puedan entenderse.</w:t>
       </w:r>
     </w:p>
     <w:p>
@@ -5120,7 +5120,7 @@
         <w:rPr>
           <w:lang w:val="es_ES" w:bidi="es_ES"/>
         </w:rPr>
-        <w:t xml:space="preserve"> La siguiente es la lista de los descendientes de Sem. Dos años después del diluvio, cuando Sem tenía 100 años, tuvo un hijo al que llamó Arfaxad.</w:t>
+        <w:t xml:space="preserve"> La siguiente es la lista de los descendientes de Sem. Pasados 2 años desde el diluvio, Sem cumplió 100 años y tuvo un hijo al que llamó Arfaxad.</w:t>
       </w:r>
     </w:p>
     <w:p>
@@ -5351,7 +5351,7 @@
         <w:rPr>
           <w:lang w:val="es_ES" w:bidi="es_ES"/>
         </w:rPr>
-        <w:t xml:space="preserve"> Después del nacimiento de Serug, Reú vivió doscientos siete años más y tuvo más hijos e hijas.</w:t>
+        <w:t xml:space="preserve"> Después del nacimiento de Serug, Reú vivió 207 años más y tuvo más hijos e hijas.</w:t>
       </w:r>
     </w:p>
     <w:p>
@@ -5372,7 +5372,7 @@
         <w:rPr>
           <w:lang w:val="es_ES" w:bidi="es_ES"/>
         </w:rPr>
-        <w:t xml:space="preserve"> Serug tenía treinta años cuando nació su hijo Najor.</w:t>
+        <w:t xml:space="preserve"> Serug tenía 30 años cuando nació su hijo Najor.</w:t>
       </w:r>
     </w:p>
     <w:p>
@@ -5561,7 +5561,7 @@
         <w:rPr>
           <w:lang w:val="es_ES" w:bidi="es_ES"/>
         </w:rPr>
-        <w:t xml:space="preserve"> Un día Téraj decidió salir de Ur de los caldeos rumbo a Canaán. Se llevó consigo a su hijo Abram, a su nieto Lot y a su nuera Saray. Pero cuando llegaron a la ciudad de Jarán, se quedaron a vivir allí.</w:t>
+        <w:t xml:space="preserve"> Un día, Téraj decidió salir de Ur de los caldeos rumbo a Canaán. Se llevó consigo a su hijo Abram, a su nieto Lot y a su nuera Saray. Pero cuando llegaron a la ciudad de Jarán, se quedaron a vivir allí.</w:t>
       </w:r>
     </w:p>
     <w:p>
@@ -5619,7 +5619,7 @@
         <w:rPr>
           <w:lang w:val="es_ES" w:bidi="es_ES"/>
         </w:rPr>
-        <w:t xml:space="preserve"> El Señor le dijo a Abram: «Sal de tu tierra, del lugar donde naciste y de la casa de tu padre, para ir a la tierra que te voy a mostrar.</w:t>
+        <w:t xml:space="preserve"> El Señor le dijo a Abram: —Sal de tu tierra, del lugar donde naciste y de la casa de tu padre, para ir a la tierra que te voy a mostrar.</w:t>
       </w:r>
     </w:p>
     <w:p>
@@ -5640,7 +5640,7 @@
         <w:rPr>
           <w:lang w:val="es_ES" w:bidi="es_ES"/>
         </w:rPr>
-        <w:t xml:space="preserve"> Te convertiré en una nación grande. Te bendeciré y haré que tu nombre sea muy improtante, y serás una bendición para otros.</w:t>
+        <w:t xml:space="preserve"> Te convertiré en una nación grande. Te bendeciré y haré que tu nombre sea muy importante, y serás una bendición para otros.</w:t>
       </w:r>
     </w:p>
     <w:p>
@@ -5661,7 +5661,7 @@
         <w:rPr>
           <w:lang w:val="es_ES" w:bidi="es_ES"/>
         </w:rPr>
-        <w:t xml:space="preserve"> Bendeciré a los que te bendigan y maldeciré a los que te maldigan. Por medio de ti serán bendecidos todos los pueblos de la tierra».</w:t>
+        <w:t xml:space="preserve"> Bendeciré a los que te bendigan y maldeciré a los que te maldigan. Por medio de ti serán bendecidos todos los pueblos de la tierra.</w:t>
       </w:r>
     </w:p>
     <w:p>
@@ -5745,7 +5745,7 @@
         <w:rPr>
           <w:lang w:val="es_ES" w:bidi="es_ES"/>
         </w:rPr>
-        <w:t xml:space="preserve"> El Señor se le apareció a Abram y le dijo: «Esta tierra se la daré a tu descendencia». Y Abram construyó allí un altar al Señor, porque se le había aparecido.</w:t>
+        <w:t xml:space="preserve"> El Señor se le apareció a Abram y le dijo: —Esta tierra se la daré a tu descendencia. Abram construyó allí un altar al Señor, porque se le había aparecido.</w:t>
       </w:r>
     </w:p>
     <w:p>
@@ -5829,7 +5829,7 @@
         <w:rPr>
           <w:lang w:val="es_ES" w:bidi="es_ES"/>
         </w:rPr>
-        <w:t xml:space="preserve"> Cuando ya estaban cerca de Egipto, y le dijo a Saray su esposa: «Mira, sé que eres una mujer muy hermosa.</w:t>
+        <w:t xml:space="preserve"> Cuando ya estaban cerca de Egipto, le dijo a Saray su esposa: —Mira, sé que eres una mujer muy hermosa.</w:t>
       </w:r>
     </w:p>
     <w:p>
@@ -5850,7 +5850,7 @@
         <w:rPr>
           <w:lang w:val="es_ES" w:bidi="es_ES"/>
         </w:rPr>
-        <w:t xml:space="preserve"> En cuanto te vean los egipcios y digan: "Esta es su esposa", me matarán, pero a ti te dejarán con vida.</w:t>
+        <w:t xml:space="preserve"> En cuanto te vean los egipcios y digan: “Esta es su esposa”, me matarán, pero a ti te dejarán con vida.</w:t>
       </w:r>
     </w:p>
     <w:p>
@@ -5871,7 +5871,7 @@
         <w:rPr>
           <w:lang w:val="es_ES" w:bidi="es_ES"/>
         </w:rPr>
-        <w:t xml:space="preserve"> Te ruego que digas que eres mi hermana, para que me traten bien por ti, y me dejen con vida».</w:t>
+        <w:t xml:space="preserve"> Te ruego que digas que eres mi hermana, para que me traten bien por ti, y me dejen con vida.</w:t>
       </w:r>
     </w:p>
     <w:p>
@@ -5976,7 +5976,7 @@
         <w:rPr>
           <w:lang w:val="es_ES" w:bidi="es_ES"/>
         </w:rPr>
-        <w:t xml:space="preserve"> Entonces el faraón mandó a llamar a Abram, y le dijo: «¿Qué me has hecho? ¿Por qué no me dijiste que Saray es tu esposa?</w:t>
+        <w:t xml:space="preserve"> Entonces el faraón mandó a llamar a Abram, y le dijo: —¿Qué me has hecho? ¿Por qué no me dijiste que Saray es tu esposa?</w:t>
       </w:r>
     </w:p>
     <w:p>
@@ -5997,7 +5997,7 @@
         <w:rPr>
           <w:lang w:val="es_ES" w:bidi="es_ES"/>
         </w:rPr>
-        <w:t xml:space="preserve"> ¿Por qué dijiste que es tu hermana? Me pusiste en situación de ¡tomarla como esposa! ¡Aquí la tienes! ¡Tómala y vete!».</w:t>
+        <w:t xml:space="preserve"> ¿Por qué dijiste que es tu hermana? Me pusiste en situación de ¡tomarla como esposa! ¡Aquí la tienes! ¡Tómala y vete!</w:t>
       </w:r>
     </w:p>
     <w:p>
@@ -6202,7 +6202,7 @@
         <w:rPr>
           <w:lang w:val="es_ES" w:bidi="es_ES"/>
         </w:rPr>
-        <w:t xml:space="preserve"> Así que un día Abram le dijo a Lot: «Tú y yo somos parientes. No debe haber pleitos entre nosotros, ni entre nuestros pastores.</w:t>
+        <w:t xml:space="preserve"> Así que un día Abram le dijo a Lot: —Tú y yo somos parientes. No debe haber pleitos entre nosotros, ni entre nuestros pastores.</w:t>
       </w:r>
     </w:p>
     <w:p>
@@ -6223,7 +6223,7 @@
         <w:rPr>
           <w:lang w:val="es_ES" w:bidi="es_ES"/>
         </w:rPr>
-        <w:t xml:space="preserve"> Mira toda la extensión de tierra que tienes delante. Por favor, sepáremonos. Si vas a la izquierda, yo iré a la derecha; y si vas a la derecha, yo iré a la izquierda».</w:t>
+        <w:t xml:space="preserve"> Mira toda la extensión de tierra que tienes delante. Por favor, separémonos. Si vas a la izquierda, yo iré a la derecha; y si vas a la derecha, yo iré a la izquierda.</w:t>
       </w:r>
     </w:p>
     <w:p>
@@ -6322,13 +6322,13 @@
           <w:vertAlign w:val="superscript"/>
           <w:lang w:val="es_ES" w:bidi="es_ES"/>
         </w:rPr>
-        <w:t>15</w:t>
-      </w:r>
-      <w:r>
-        <w:rPr>
-          <w:lang w:val="es_ES" w:bidi="es_ES"/>
-        </w:rPr>
-        <w:t xml:space="preserve"> Después de que Lot se fue por su lado, el Señor le dijo a Abram:—Mira toda la tierra que tienes a tu alrededor, por el norte, el sur, el oriente y el occidente. Toda esa tierra te la daré para ti y para tus descendientes.</w:t>
+        <w:t>14-15</w:t>
+      </w:r>
+      <w:r>
+        <w:rPr>
+          <w:lang w:val="es_ES" w:bidi="es_ES"/>
+        </w:rPr>
+        <w:t xml:space="preserve"> Después de que Lot se fue por su lado, el Señor le dijo a Abram: —Mira toda la tierra que tienes a tu alrededor, por el norte, el sur, el oriente y el occidente. Toda esa tierra te la daré para ti y para tus descendientes.</w:t>
       </w:r>
     </w:p>
     <w:p>
@@ -6370,7 +6370,7 @@
         <w:rPr>
           <w:lang w:val="es_ES" w:bidi="es_ES"/>
         </w:rPr>
-        <w:t xml:space="preserve"> Ahora, pues, levántate y recorre toda esa región, a lo largo y a lo ancho, porque te la voy a dar a ti».</w:t>
+        <w:t xml:space="preserve"> Ahora, pues, levántate y recorre toda esa región, a lo largo y a lo ancho, porque te la voy a dar a ti.</w:t>
       </w:r>
     </w:p>
     <w:p>
@@ -6470,7 +6470,7 @@
         <w:rPr>
           <w:lang w:val="es_ES" w:bidi="es_ES"/>
         </w:rPr>
-        <w:t xml:space="preserve"> Estos cinco últimos reyes reunieron sus ejércitos en el valle de Sidín, que es el valle del mar Muerto.</w:t>
+        <w:t xml:space="preserve"> Estos 5 últimos reyes reunieron sus ejércitos en el valle de Sidín, que es el valle del mar Muerto.</w:t>
       </w:r>
     </w:p>
     <w:p>
@@ -6491,7 +6491,7 @@
         <w:rPr>
           <w:lang w:val="es_ES" w:bidi="es_ES"/>
         </w:rPr>
-        <w:t xml:space="preserve"> Durante doce años habían estado bajo el dominio del rey Quedorlaómer, pero en el año decimotercero se rebelaron contra él.</w:t>
+        <w:t xml:space="preserve"> Durante 12 años habían estado bajo el dominio del rey Quedorlaómer, pero en el año decimotercero se rebelaron contra él.</w:t>
       </w:r>
     </w:p>
     <w:p>
@@ -6569,7 +6569,7 @@
           <w:vertAlign w:val="superscript"/>
           <w:lang w:val="es_ES" w:bidi="es_ES"/>
         </w:rPr>
-        <w:t>9</w:t>
+        <w:t>8-9</w:t>
       </w:r>
       <w:r>
         <w:rPr>
@@ -6680,7 +6680,7 @@
         <w:rPr>
           <w:lang w:val="es_ES" w:bidi="es_ES"/>
         </w:rPr>
-        <w:t xml:space="preserve"> Cuando Abram oyó que se habían llevado cautivo a su sobrino, reunió a los trescientos dieciocho criados que habían nacido en su casa. Fue con ellos y persiguió a los que habían capturado a Lot. Los alcanzó en la ciudad de Dan.</w:t>
+        <w:t xml:space="preserve"> Cuando Abram oyó que se habían llevado cautivo a su sobrino, reunió a los 318 criados que habían nacido en su casa. Fue con ellos y persiguió a los que habían capturado a Lot. Los alcanzó en la ciudad de Dan.</w:t>
       </w:r>
     </w:p>
     <w:p>
@@ -6764,7 +6764,7 @@
         <w:rPr>
           <w:lang w:val="es_ES" w:bidi="es_ES"/>
         </w:rPr>
-        <w:t xml:space="preserve"> Melquisedec, rey de Salem y sacerdote del Dios Altísimo, le ofreció pan y vino.</w:t>
+        <w:t xml:space="preserve"> Melquisedec, rey de Salén y sacerdote del Dios Altísimo, le ofreció pan y vino.</w:t>
       </w:r>
     </w:p>
     <w:p>
@@ -6785,7 +6785,7 @@
         <w:rPr>
           <w:lang w:val="es_ES" w:bidi="es_ES"/>
         </w:rPr>
-        <w:t xml:space="preserve"> Luego lo bendijo con estas palabras: «Que el Dios Altísimo, Creador del cielo y de la tierra, bendiga a Abram.</w:t>
+        <w:t xml:space="preserve"> Luego lo bendijo con estas palabras: —Que el Dios Altísimo, Creador del cielo y de la tierra, bendiga a Abram.</w:t>
       </w:r>
     </w:p>
     <w:p>
@@ -6806,7 +6806,7 @@
         <w:rPr>
           <w:lang w:val="es_ES" w:bidi="es_ES"/>
         </w:rPr>
-        <w:t xml:space="preserve"> Bendito sea el Dios Altísimo, que entregó a tus enemigos en tu mano». Entonces Abram le dio a Melquisedec la décima parte de todo lo que había recuperado.</w:t>
+        <w:t xml:space="preserve"> Bendito sea el Dios Altísimo, que entregó a tus enemigos en tu mano. Entonces Abram le dio a Melquisedec la décima parte de todo lo que había recuperado.</w:t>
       </w:r>
     </w:p>
     <w:p>
@@ -6842,7 +6842,7 @@
           <w:vertAlign w:val="superscript"/>
           <w:lang w:val="es_ES" w:bidi="es_ES"/>
         </w:rPr>
-        <w:t>23</w:t>
+        <w:t>22-23</w:t>
       </w:r>
       <w:r>
         <w:rPr>
@@ -6906,28 +6906,28 @@
         <w:rPr>
           <w:lang w:val="es_ES" w:bidi="es_ES"/>
         </w:rPr>
-        <w:t xml:space="preserve"> Después de estas cosas, el Señor le dijo a Abram en una visión: ―Abram, no temas. Yo soy tu escudo. Tu recompensa será muy grande.</w:t>
-      </w:r>
-    </w:p>
-    <w:p>
-      <w:pPr/>
-      <w:r>
-        <w:rPr>
-          <w:lang w:val="es_ES" w:bidi="es_ES"/>
-        </w:rPr>
-      </w:r>
-      <w:r>
-        <w:rPr>
-          <w:vertAlign w:val="superscript"/>
-          <w:lang w:val="es_ES" w:bidi="es_ES"/>
-        </w:rPr>
-        <w:t>3</w:t>
-      </w:r>
-      <w:r>
-        <w:rPr>
-          <w:lang w:val="es_ES" w:bidi="es_ES"/>
-        </w:rPr>
-        <w:t xml:space="preserve"> Pero Abram contestó: ―Mi Señor y Dios, ¿para qué me vas a dar algo si continúo sin hijos? Como no me has dado descendencia, mi heredero va a ser un criado de mi casa, Eliezer de Damasco.</w:t>
+        <w:t xml:space="preserve"> Después de estas cosas, el Señor le dijo a Abram en una visión: —Abram, no temas. Yo soy tu escudo. Tu recompensa será muy grande.</w:t>
+      </w:r>
+    </w:p>
+    <w:p>
+      <w:pPr/>
+      <w:r>
+        <w:rPr>
+          <w:lang w:val="es_ES" w:bidi="es_ES"/>
+        </w:rPr>
+      </w:r>
+      <w:r>
+        <w:rPr>
+          <w:vertAlign w:val="superscript"/>
+          <w:lang w:val="es_ES" w:bidi="es_ES"/>
+        </w:rPr>
+        <w:t>2-3</w:t>
+      </w:r>
+      <w:r>
+        <w:rPr>
+          <w:lang w:val="es_ES" w:bidi="es_ES"/>
+        </w:rPr>
+        <w:t xml:space="preserve"> Pero Abram contestó: —Mi Señor y Dios, ¿para qué me vas a dar algo si continúo sin hijos? Como no me has dado descendencia, mi heredero va a ser un criado de mi casa, Eliezer de Damasco.</w:t>
       </w:r>
     </w:p>
     <w:p>
@@ -6948,7 +6948,7 @@
         <w:rPr>
           <w:lang w:val="es_ES" w:bidi="es_ES"/>
         </w:rPr>
-        <w:t xml:space="preserve"> Entonces el Señor le dijo: ―¡Ese hombre no será tu heredero! Tu heredero será un hijo tuyo.</w:t>
+        <w:t xml:space="preserve"> Entonces el Señor le dijo: —¡Ese hombre no será tu heredero! Tu heredero será un hijo tuyo.</w:t>
       </w:r>
     </w:p>
     <w:p>
@@ -7011,7 +7011,7 @@
         <w:rPr>
           <w:lang w:val="es_ES" w:bidi="es_ES"/>
         </w:rPr>
-        <w:t xml:space="preserve"> También le dijo: ―Yo soy el Señor que te sacó de Ur de los caldeos, para darte esta tierra.</w:t>
+        <w:t xml:space="preserve"> También le dijo: —Yo soy el Señor que te sacó de Ur de los caldeos, para darte esta tierra.</w:t>
       </w:r>
     </w:p>
     <w:p>
@@ -7032,7 +7032,7 @@
         <w:rPr>
           <w:lang w:val="es_ES" w:bidi="es_ES"/>
         </w:rPr>
-        <w:t xml:space="preserve"> Pero Abram le respondió: ―Mi Señor y Dios, ¿cómo sabré que voy a poseerla?</w:t>
+        <w:t xml:space="preserve"> Pero Abram le respondió: —Mi Señor y Dios, ¿cómo sabré que voy a poseerla?</w:t>
       </w:r>
     </w:p>
     <w:p>
@@ -7053,7 +7053,7 @@
         <w:rPr>
           <w:lang w:val="es_ES" w:bidi="es_ES"/>
         </w:rPr>
-        <w:t xml:space="preserve"> Entonces el Señor le dijo: ―Tráeme una ternera de 3 años, una cabra de 3 años y un carnero de 3 años, y una tórtola y un pichón.</w:t>
+        <w:t xml:space="preserve"> Entonces el Señor le dijo: —Tráeme una ternera de 3 años, una cabra de 3 años y un carnero de 3 años, y una tórtola y un pichón.</w:t>
       </w:r>
     </w:p>
     <w:p>
@@ -7137,7 +7137,7 @@
         <w:rPr>
           <w:lang w:val="es_ES" w:bidi="es_ES"/>
         </w:rPr>
-        <w:t xml:space="preserve"> Entonces el Señor le dijo: ―Debes saber que tus descendientes vivirán como extranjeros en una tierra que no es la suya, y serán esclavizados y maltratados durante 400 años.</w:t>
+        <w:t xml:space="preserve"> Entonces el Señor le dijo: —Debes saber que tus descendientes vivirán como extranjeros en una tierra que no es la suya, y serán esclavizados y maltratados durante 400 años.</w:t>
       </w:r>
     </w:p>
     <w:p>
@@ -7257,7 +7257,7 @@
           <w:vertAlign w:val="superscript"/>
           <w:lang w:val="es_ES" w:bidi="es_ES"/>
         </w:rPr>
-        <w:t>21</w:t>
+        <w:t>19-21</w:t>
       </w:r>
       <w:r>
         <w:rPr>
@@ -7315,13 +7315,13 @@
           <w:vertAlign w:val="superscript"/>
           <w:lang w:val="es_ES" w:bidi="es_ES"/>
         </w:rPr>
-        <w:t>3</w:t>
-      </w:r>
-      <w:r>
-        <w:rPr>
-          <w:lang w:val="es_ES" w:bidi="es_ES"/>
-        </w:rPr>
-        <w:t xml:space="preserve"> Así que le dijo a Abram: —Mira, el Señor no me ha permitido tener hijos. Acuéstate con mi sierva, y tal vez por medio de ella pueda tener descendencia.Abram aceptó.Entonces Saray tomó a su sierva Agar la egipcia y se la entregó. Llevaban 10 años viviendo en Canaán cuando sucedió esto.</w:t>
+        <w:t>2-3</w:t>
+      </w:r>
+      <w:r>
+        <w:rPr>
+          <w:lang w:val="es_ES" w:bidi="es_ES"/>
+        </w:rPr>
+        <w:t xml:space="preserve"> Así que le dijo a Abram: —Mira, el Señor no me ha permitido tener hijos. Acuéstate con mi sierva, y tal vez por medio de ella pueda tener descendencia. Abram aceptó. Entonces Saray tomó a su sierva Agar la egipcia y se la entregó. Llevaban 10 años viviendo en Canaán cuando sucedió esto.</w:t>
       </w:r>
     </w:p>
     <w:p>
@@ -7489,7 +7489,7 @@
         <w:rPr>
           <w:lang w:val="es_ES" w:bidi="es_ES"/>
         </w:rPr>
-        <w:t xml:space="preserve"> Estás embarazada y darás a luz un hijo. Le llamarás Ismael,Ismael: En hebreo, Ismael quiere decir Dios escucha." class="footnote-marker"&gt;1 porque el Señor ha escuchado tu aflicción.</w:t>
+        <w:t xml:space="preserve"> Estás embarazada y darás a luz un hijo. Le llamarás Ismael, porque el Señor ha escuchado tu aflicción.</w:t>
       </w:r>
     </w:p>
     <w:p>
@@ -7531,7 +7531,7 @@
         <w:rPr>
           <w:lang w:val="es_ES" w:bidi="es_ES"/>
         </w:rPr>
-        <w:t xml:space="preserve"> Al Señor que hablaba con ella, Agar le llamó «el Dios que me ve»,El Dios que me ve: En hebreo, el nombre es El Roí." class="footnote-marker"&gt;2 pues se decía en su interior: «He visto al Dios que me ve».</w:t>
+        <w:t xml:space="preserve"> Al Señor que hablaba con ella, Agar le llamó “el Dios que me ve”, pues se decía en su interior: “He visto al Dios que me ve”.</w:t>
       </w:r>
     </w:p>
     <w:p>
@@ -7552,7 +7552,7 @@
         <w:rPr>
           <w:lang w:val="es_ES" w:bidi="es_ES"/>
         </w:rPr>
-        <w:t xml:space="preserve"> También por eso llamó al pozo «Pozo del Viviente que me ve». Está entre Cades y Béred.</w:t>
+        <w:t xml:space="preserve"> También por eso llamó al pozo “Pozo del Viviente que me ve”. Está entre Cades y Béred.</w:t>
       </w:r>
     </w:p>
     <w:p>
@@ -7793,13 +7793,13 @@
           <w:vertAlign w:val="superscript"/>
           <w:lang w:val="es_ES" w:bidi="es_ES"/>
         </w:rPr>
-        <w:t>10</w:t>
-      </w:r>
-      <w:r>
-        <w:rPr>
-          <w:lang w:val="es_ES" w:bidi="es_ES"/>
-        </w:rPr>
-        <w:t xml:space="preserve"> Dios dijo además a Abraham: ―Tú y tus descendientes después de ti guardarán mi pacto por generaciones. Este es mi pacto que guardarán: todo varón entre ustedes será circuncidado.</w:t>
+        <w:t>9-10</w:t>
+      </w:r>
+      <w:r>
+        <w:rPr>
+          <w:lang w:val="es_ES" w:bidi="es_ES"/>
+        </w:rPr>
+        <w:t xml:space="preserve"> Dios dijo además a Abraham: —Tú y tus descendientes después de ti guardarán mi pacto por generaciones. Este es mi pacto que guardarán: todo varón entre ustedes será circuncidado.</w:t>
       </w:r>
     </w:p>
     <w:p>
@@ -7904,7 +7904,7 @@
         <w:rPr>
           <w:lang w:val="es_ES" w:bidi="es_ES"/>
         </w:rPr>
-        <w:t xml:space="preserve"> Dios también le dijo a Abraham: ―Tu esposa ya no se llamará Saray. Ahora se llamará Sara.</w:t>
+        <w:t xml:space="preserve"> Dios también le dijo a Abraham: —Tu esposa ya no se llamará Saray. Ahora se llamará Sara.</w:t>
       </w:r>
     </w:p>
     <w:p>
@@ -7946,7 +7946,7 @@
         <w:rPr>
           <w:lang w:val="es_ES" w:bidi="es_ES"/>
         </w:rPr>
-        <w:t xml:space="preserve"> Abraham se inclinó rostro en tierra, y se rio para sus adentros pensando en cómo iba a ser padre si él tenía cien años y Sara noventa.</w:t>
+        <w:t xml:space="preserve"> Abraham se inclinó rostro en tierra, y se rio para sus adentros pensando en cómo iba a ser padre si él tenía 100 años y Sara 90.</w:t>
       </w:r>
     </w:p>
     <w:p>
@@ -7967,7 +7967,7 @@
         <w:rPr>
           <w:lang w:val="es_ES" w:bidi="es_ES"/>
         </w:rPr>
-        <w:t xml:space="preserve"> Por eso le dijo a Dios: ―Me conformo con que Ismael viva bajo tu bendición.</w:t>
+        <w:t xml:space="preserve"> Por eso le dijo a Dios: —Me conformo con que Ismael viva bajo tu bendición.</w:t>
       </w:r>
     </w:p>
     <w:p>
@@ -7988,7 +7988,7 @@
         <w:rPr>
           <w:lang w:val="es_ES" w:bidi="es_ES"/>
         </w:rPr>
-        <w:t xml:space="preserve"> Dios le respondió: ―Pero es tu esposa Sara quien te dará un hijo, y lo llamarás Isaac.Isaac: En hebreo, Isaac quiere decir risa." class="footnote-marker"&gt;1 Con él y con sus descendientes estableceré mi pacto para siempre.</w:t>
+        <w:t xml:space="preserve"> Dios le respondió: —Pero es tu esposa Sara quien te dará un hijo, y lo llamarás Isaac. Con él y con sus descendientes estableceré mi pacto para siempre.</w:t>
       </w:r>
     </w:p>
     <w:p>
@@ -8009,7 +8009,7 @@
         <w:rPr>
           <w:lang w:val="es_ES" w:bidi="es_ES"/>
         </w:rPr>
-        <w:t xml:space="preserve"> En cuanto a Ismael, te he escuchado. Lo bendeciré con una descendencia muy numerosa, y haré que de él salga una gran nación. Él será el padre de doce príncipes.</w:t>
+        <w:t xml:space="preserve"> En cuanto a Ismael, te he escuchado. Lo bendeciré con una descendencia muy numerosa, y haré que de él salga una gran nación. Él será el padre de 12 príncipes.</w:t>
       </w:r>
     </w:p>
     <w:p>
@@ -8030,7 +8030,7 @@
         <w:rPr>
           <w:lang w:val="es_ES" w:bidi="es_ES"/>
         </w:rPr>
-        <w:t xml:space="preserve"> Pero mi pacto lo haré con Isaac, el hijo que te dará Sara dentro de un año, por estas fechas.</w:t>
+        <w:t xml:space="preserve"> Pero mi pacto lo haré con Isaac, el hijo que te dará Sara dentro de 1 año, por estas fechas.</w:t>
       </w:r>
     </w:p>
     <w:p>
@@ -8087,7 +8087,7 @@
           <w:vertAlign w:val="superscript"/>
           <w:lang w:val="es_ES" w:bidi="es_ES"/>
         </w:rPr>
-        <w:t>25</w:t>
+        <w:t>24-25</w:t>
       </w:r>
       <w:r>
         <w:rPr>
@@ -8277,7 +8277,7 @@
         <w:rPr>
           <w:lang w:val="es_ES" w:bidi="es_ES"/>
         </w:rPr>
-        <w:t xml:space="preserve"> Entonces Abraham entró corriendo a la tienda y le dijo a Sara: —Rápido, toma tres medidas de harina fina, amásala y haz unos panes.</w:t>
+        <w:t xml:space="preserve"> Entonces Abraham entró corriendo a la tienda y le dijo a Sara: —Rápido, toma 3 medidas de harina fina, amásala y haz unos panes.</w:t>
       </w:r>
     </w:p>
     <w:p>
@@ -8403,7 +8403,7 @@
         <w:rPr>
           <w:lang w:val="es_ES" w:bidi="es_ES"/>
         </w:rPr>
-        <w:t xml:space="preserve"> Por eso, Sara se rio para sus adentros y dijo: «¿Con lo mayor que soy voy a tener placer, siendo además mi marido tan viejo?».</w:t>
+        <w:t xml:space="preserve"> Por eso, Sara se rio para sus adentros y se dijo: «¿Con lo mayor que soy voy a tener placer, siendo además mi marido tan viejo?”.</w:t>
       </w:r>
     </w:p>
     <w:p>
@@ -8424,7 +8424,7 @@
         <w:rPr>
           <w:lang w:val="es_ES" w:bidi="es_ES"/>
         </w:rPr>
-        <w:t xml:space="preserve"> Entonces el Señor le dijo a Abraham: ―¿Por qué se rio Sara pensando que es demasiado vieja para quedarse embarazada?</w:t>
+        <w:t xml:space="preserve"> Entonces el Señor le dijo a Abraham: —¿Por qué se rio Sara pensando que es demasiado vieja para quedarse embarazada?</w:t>
       </w:r>
     </w:p>
     <w:p>
@@ -8466,7 +8466,7 @@
         <w:rPr>
           <w:lang w:val="es_ES" w:bidi="es_ES"/>
         </w:rPr>
-        <w:t xml:space="preserve"> Cuando Sara escuchó esto, tuvo miedo y lo negó. Por eso dijo: ―No me reí. Pero el Señor le contestó: ―Sí te reíste.</w:t>
+        <w:t xml:space="preserve"> Cuando Sara escuchó esto, tuvo miedo y lo negó. Por eso dijo: —No me reí. Pero el Señor le contestó: —Sí te reíste.</w:t>
       </w:r>
     </w:p>
     <w:p>
@@ -8550,7 +8550,7 @@
         <w:rPr>
           <w:lang w:val="es_ES" w:bidi="es_ES"/>
         </w:rPr>
-        <w:t xml:space="preserve"> Yo lo he escogido para que instruya a sus descendientes, a fin de que guarden el camino del Señor y practiquen lo que es justo y recto. Así el Señor hará venir sobre Abraham lo que ha hablado acerca de él».</w:t>
+        <w:t xml:space="preserve"> Yo lo he escogido para que instruya a sus descendientes, a fin de que guarden el camino del Señor y practiquen lo que es justo y recto. Así el Señor hará venir sobre Abraham lo que ha hablado acerca de él”.</w:t>
       </w:r>
     </w:p>
     <w:p>
@@ -8571,7 +8571,7 @@
         <w:rPr>
           <w:lang w:val="es_ES" w:bidi="es_ES"/>
         </w:rPr>
-        <w:t xml:space="preserve"> Así que el Señor le dijo a Abraham: ―El clamor contra Sodoma y Gomorra es grande, y su pecado es muy grave.</w:t>
+        <w:t xml:space="preserve"> Así que el Señor le dijo a Abraham: —El clamor contra Sodoma y Gomorra es grande, y su pecado es muy grave.</w:t>
       </w:r>
     </w:p>
     <w:p>
@@ -8607,13 +8607,13 @@
           <w:vertAlign w:val="superscript"/>
           <w:lang w:val="es_ES" w:bidi="es_ES"/>
         </w:rPr>
-        <w:t>23</w:t>
-      </w:r>
-      <w:r>
-        <w:rPr>
-          <w:lang w:val="es_ES" w:bidi="es_ES"/>
-        </w:rPr>
-        <w:t xml:space="preserve"> Siguieron su camino hacia Sodoma 2 de los varones, pero Abraham se quedó de pie delante del Señor. Entonces Abraham se acercó al Señor y le dijo:—¿De verdad vas a exterminar al justo junto con el malvado?</w:t>
+        <w:t>22-23</w:t>
+      </w:r>
+      <w:r>
+        <w:rPr>
+          <w:lang w:val="es_ES" w:bidi="es_ES"/>
+        </w:rPr>
+        <w:t xml:space="preserve"> Siguieron su camino hacia Sodoma 2 de los varones, pero Abraham se quedó de pie delante del Señor. Entonces Abraham se acercó al Señor y le dijo: —¿De verdad vas a exterminar al justo junto con el malvado?</w:t>
       </w:r>
     </w:p>
     <w:p>
@@ -8860,7 +8860,7 @@
         <w:rPr>
           <w:lang w:val="es_ES" w:bidi="es_ES"/>
         </w:rPr>
-        <w:t xml:space="preserve"> Era casi de noche cuando los dos ángeles llegaron a Sodoma. Lot estaba sentado a la entrada de la ciudad. Al verlos, se levantó para saludarlos, se postró rostro en tierra ante ellos</w:t>
+        <w:t xml:space="preserve"> Era casi de noche cuando los 2 ángeles llegaron a Sodoma. Lot estaba sentado a la entrada de la ciudad. Al verlos, se levantó para saludarlos, se postró rostro en tierra ante ellos</w:t>
       </w:r>
     </w:p>
     <w:p>
@@ -8965,7 +8965,7 @@
         <w:rPr>
           <w:lang w:val="es_ES" w:bidi="es_ES"/>
         </w:rPr>
-        <w:t xml:space="preserve"> Lot salió a hablar con ellos, cerró la puerta trás de sí</w:t>
+        <w:t xml:space="preserve"> Lot salió a hablar con ellos, cerró la puerta tras de sí</w:t>
       </w:r>
     </w:p>
     <w:p>
@@ -9133,7 +9133,7 @@
         <w:rPr>
           <w:lang w:val="es_ES" w:bidi="es_ES"/>
         </w:rPr>
-        <w:t xml:space="preserve"> Lot salió y les dijo sus futuros yernos: —¡Apresúrense! ¡Salgan de la ciudad, porque el Señor va a destruirla!Pero los jóvenes creyeron que estaba bromeando.</w:t>
+        <w:t xml:space="preserve"> Lot salió y les dijo sus futuros yernos: —¡Apresúrense! ¡Salgan de la ciudad, porque el Señor va a destruirla! Pero los jóvenes creyeron que estaba bromeando.</w:t>
       </w:r>
     </w:p>
     <w:p>
@@ -9154,7 +9154,7 @@
         <w:rPr>
           <w:lang w:val="es_ES" w:bidi="es_ES"/>
         </w:rPr>
-        <w:t xml:space="preserve"> Al amanecer, los ángeles urgieron a Lot: —¡Levántate! Toma a tu esposa y a tus dos hijas y sal de este lugar, para que no perezcas en el castigo de la ciudad.</w:t>
+        <w:t xml:space="preserve"> Al amanecer, los ángeles urgieron a Lot: —¡Levántate! Toma a tu esposa y a tus 2 hijas y sal de este lugar, para que no perezcas en el castigo de la ciudad.</w:t>
       </w:r>
     </w:p>
     <w:p>
@@ -9211,7 +9211,7 @@
           <w:vertAlign w:val="superscript"/>
           <w:lang w:val="es_ES" w:bidi="es_ES"/>
         </w:rPr>
-        <w:t>19</w:t>
+        <w:t>18-19</w:t>
       </w:r>
       <w:r>
         <w:rPr>
@@ -9253,13 +9253,13 @@
           <w:vertAlign w:val="superscript"/>
           <w:lang w:val="es_ES" w:bidi="es_ES"/>
         </w:rPr>
-        <w:t>22</w:t>
-      </w:r>
-      <w:r>
-        <w:rPr>
-          <w:lang w:val="es_ES" w:bidi="es_ES"/>
-        </w:rPr>
-        <w:t xml:space="preserve"> —Muy bien —dijo uno de los ángeles—. He escuchado tu petición y no destruiré la ciudad de la que hablas. ¡Apresúrate, porque no puedo hacer nada hasta que llegues! Por eso, desde entonces, la ciudad se llamó Zoar.1</w:t>
+        <w:t>21-22</w:t>
+      </w:r>
+      <w:r>
+        <w:rPr>
+          <w:lang w:val="es_ES" w:bidi="es_ES"/>
+        </w:rPr>
+        <w:t xml:space="preserve"> —Muy bien —dijo uno de los ángeles—. He escuchado tu petición y no destruiré la ciudad de la que hablas. ¡Apresúrate, porque no puedo hacer nada hasta que llegues! Por eso, desde entonces, la ciudad se llamó Zoar.</w:t>
       </w:r>
     </w:p>
     <w:p>
@@ -9427,7 +9427,7 @@
         <w:rPr>
           <w:lang w:val="es_ES" w:bidi="es_ES"/>
         </w:rPr>
-        <w:t xml:space="preserve"> Después, por miedo a quedarse en Zoar, Lot dejó la ciudad. Junto con sus dos hijas se fue a vivir a una cueva en la montaña.</w:t>
+        <w:t xml:space="preserve"> Después, por miedo a quedarse en Zoar, Lot dejó la ciudad. Junto con sus 2 hijas se fue a vivir a una cueva en la montaña.</w:t>
       </w:r>
     </w:p>
     <w:p>
@@ -9674,7 +9674,7 @@
         <w:rPr>
           <w:lang w:val="es_ES" w:bidi="es_ES"/>
         </w:rPr>
-        <w:t xml:space="preserve"> Pero Dios se le apareció a Abimélec en sueños esa noche y le dijo: ―Eres hombre muerto, porque la mujer que has tomado tiene marido.</w:t>
+        <w:t xml:space="preserve"> Pero Dios se le apareció a Abimélec en sueños esa noche y le dijo: —Eres hombre muerto, porque la mujer que has tomado tiene marido.</w:t>
       </w:r>
     </w:p>
     <w:p>
@@ -9695,7 +9695,7 @@
         <w:rPr>
           <w:lang w:val="es_ES" w:bidi="es_ES"/>
         </w:rPr>
-        <w:t xml:space="preserve"> Pero como Abimélec todavía no se había acostado con ella, contestó: ―Señor, ¿vas a matar a un inocente?</w:t>
+        <w:t xml:space="preserve"> Pero como Abimélec todavía no se había acostado con ella, contestó: —Señor, ¿vas a matar a un inocente?</w:t>
       </w:r>
     </w:p>
     <w:p>
@@ -9794,13 +9794,13 @@
           <w:vertAlign w:val="superscript"/>
           <w:lang w:val="es_ES" w:bidi="es_ES"/>
         </w:rPr>
-        <w:t>10</w:t>
-      </w:r>
-      <w:r>
-        <w:rPr>
-          <w:lang w:val="es_ES" w:bidi="es_ES"/>
-        </w:rPr>
-        <w:t xml:space="preserve"> Entonces Abimélec llamó a Abraham y le dijo:—¿Qué nos has hecho? ¿Yo qué te he hecho para que hayas traído sobre mí y sobre mi reino un pecado tan grande? Lo que me has hecho no se le hace a nadie. ¿Qué pretendías al actuar así?</w:t>
+        <w:t>9-10</w:t>
+      </w:r>
+      <w:r>
+        <w:rPr>
+          <w:lang w:val="es_ES" w:bidi="es_ES"/>
+        </w:rPr>
+        <w:t xml:space="preserve"> Entonces Abimélec llamó a Abraham y le dijo: —¿Qué nos has hecho? ¿Yo qué te he hecho para que hayas traído sobre mí y sobre mi reino un pecado tan grande? Lo que me has hecho no se le hace a nadie. ¿Qué pretendías al actuar así?</w:t>
       </w:r>
     </w:p>
     <w:p>
@@ -9821,7 +9821,7 @@
         <w:rPr>
           <w:lang w:val="es_ES" w:bidi="es_ES"/>
         </w:rPr>
-        <w:t xml:space="preserve"> Abraham respondió: ―Pensé que en este lugar no había temor de Dios, y que me matarían para quedarse con mi esposa.</w:t>
+        <w:t xml:space="preserve"> Abraham respondió: —Pensé que en este lugar no había temor de Dios, y que me matarían para quedarse con mi esposa.</w:t>
       </w:r>
     </w:p>
     <w:p>
@@ -9863,7 +9863,7 @@
         <w:rPr>
           <w:lang w:val="es_ES" w:bidi="es_ES"/>
         </w:rPr>
-        <w:t xml:space="preserve"> Cuando Dios me ordenó que saliera de la casa de mi padre, le dije a ella: "Hazme este favor: cuando lleguemos a algún lugar, di que soy tu hermano".</w:t>
+        <w:t xml:space="preserve"> Cuando Dios me ordenó que saliera de la casa de mi padre, le dije a ella: “Hazme este favor: cuando lleguemos a algún lugar, di que soy tu hermano”.</w:t>
       </w:r>
     </w:p>
     <w:p>
@@ -9905,7 +9905,7 @@
         <w:rPr>
           <w:lang w:val="es_ES" w:bidi="es_ES"/>
         </w:rPr>
-        <w:t xml:space="preserve"> ―Mi tierra está delante de ti —dijo el rey—. Elige para vivir el lugar que mejor te parezca.</w:t>
+        <w:t xml:space="preserve"> —Mi tierra está delante de ti —dijo el rey—. Elige para vivir el lugar que mejor te parezca.</w:t>
       </w:r>
     </w:p>
     <w:p>
@@ -9926,7 +9926,7 @@
         <w:rPr>
           <w:lang w:val="es_ES" w:bidi="es_ES"/>
         </w:rPr>
-        <w:t xml:space="preserve"> A Sara le dijo: —He dado a tu hermano mil piezas de plata. Con ese dinero quedarás compensada por todo lo ocurrido y tu buena fama quedará intacta.</w:t>
+        <w:t xml:space="preserve"> A Sara le dijo: —He dado a tu hermano 1.000 piezas de plata. Con ese dinero quedarás compensada por todo lo ocurrido y tu buena fama quedará intacta.</w:t>
       </w:r>
     </w:p>
     <w:p>
@@ -10068,7 +10068,7 @@
         <w:rPr>
           <w:lang w:val="es_ES" w:bidi="es_ES"/>
         </w:rPr>
-        <w:t xml:space="preserve"> Cuando el niño cumplió ocho días, Abraham lo circuncidó, tal como Dios le había ordenado.</w:t>
+        <w:t xml:space="preserve"> Cuando el niño cumplió 8 días, Abraham lo circuncidó, tal como Dios le había ordenado.</w:t>
       </w:r>
     </w:p>
     <w:p>
@@ -10089,7 +10089,7 @@
         <w:rPr>
           <w:lang w:val="es_ES" w:bidi="es_ES"/>
         </w:rPr>
-        <w:t xml:space="preserve"> Abraham tenía cien años cuando nació Isaac, su hijo.</w:t>
+        <w:t xml:space="preserve"> Abraham tenía 100 años cuando nació Isaac, su hijo.</w:t>
       </w:r>
     </w:p>
     <w:p>
@@ -10110,7 +10110,7 @@
         <w:rPr>
           <w:lang w:val="es_ES" w:bidi="es_ES"/>
         </w:rPr>
-        <w:t xml:space="preserve"> Sara dijo: «Dios me ha hecho reír. Cualquiera que oiga que he tenido un hijo se reirá conmigo.</w:t>
+        <w:t xml:space="preserve"> Sara dijo: —Dios me ha hecho reír. Cualquiera que oiga que he tenido un hijo se reirá conmigo.</w:t>
       </w:r>
     </w:p>
     <w:p>
@@ -10131,7 +10131,7 @@
         <w:rPr>
           <w:lang w:val="es_ES" w:bidi="es_ES"/>
         </w:rPr>
-        <w:t xml:space="preserve"> ¿Quién le hubiera dicho a Abraham que yo iba a dar el pecho a un hijo? Sin embargo, ¡le he dado un hijo a Abraham en su vejez!».</w:t>
+        <w:t xml:space="preserve"> ¿Quién le hubiera dicho a Abraham que yo iba a dar el pecho a un hijo? Sin embargo, ¡le he dado un hijo a Abraham en su vejez!</w:t>
       </w:r>
     </w:p>
     <w:p>
@@ -10236,7 +10236,7 @@
         <w:rPr>
           <w:lang w:val="es_ES" w:bidi="es_ES"/>
         </w:rPr>
-        <w:t xml:space="preserve"> Pero Dios le dijo a Abraham: «No te aflijas por el niño ni por la sierva. Haz todo lo que Sara te diga, porque tu descendencia se establecerá por medio de Isaac.</w:t>
+        <w:t xml:space="preserve"> Pero Dios le dijo a Abraham: —No te aflijas por el niño ni por la sierva. Haz todo lo que Sara te diga, porque tu descendencia se establecerá por medio de Isaac.</w:t>
       </w:r>
     </w:p>
     <w:p>
@@ -10257,7 +10257,7 @@
         <w:rPr>
           <w:lang w:val="es_ES" w:bidi="es_ES"/>
         </w:rPr>
-        <w:t xml:space="preserve"> También haré una nación del hijo de la sierva, porque es tu descendiente».</w:t>
+        <w:t xml:space="preserve"> También haré una nación del hijo de la sierva, porque es tu descendiente.</w:t>
       </w:r>
     </w:p>
     <w:p>
@@ -10320,7 +10320,7 @@
         <w:rPr>
           <w:lang w:val="es_ES" w:bidi="es_ES"/>
         </w:rPr>
-        <w:t xml:space="preserve"> Ella fue a sentarse a cierta distancia de allí, como a la distancia de un tiro de flecha, pues pensaba: «No quiero verlo morir». Cuando ella se sentó, el niño alzó su voz y se puso a llorar desconsoladamente.</w:t>
+        <w:t xml:space="preserve"> Ella fue a sentarse a cierta distancia de allí, como a la distancia de un tiro de flecha, pues pensaba: “No quiero verlo morir”. Cuando ella se sentó, el niño alzó su voz y se puso a llorar desconsoladamente.</w:t>
       </w:r>
     </w:p>
     <w:p>
@@ -10398,7 +10398,7 @@
           <w:vertAlign w:val="superscript"/>
           <w:lang w:val="es_ES" w:bidi="es_ES"/>
         </w:rPr>
-        <w:t>21</w:t>
+        <w:t>20-21</w:t>
       </w:r>
       <w:r>
         <w:rPr>
@@ -10509,7 +10509,7 @@
         <w:rPr>
           <w:lang w:val="es_ES" w:bidi="es_ES"/>
         </w:rPr>
-        <w:t xml:space="preserve"> Pero Abimélec dijo:—No sé quién pudo haber hecho eso. Yo no sabía nada. No me dijiste nada.</w:t>
+        <w:t xml:space="preserve"> Pero Abimélec dijo: —No sé quién pudo haber hecho eso. Yo no sabía nada. No me dijiste nada.</w:t>
       </w:r>
     </w:p>
     <w:p>
@@ -10593,7 +10593,7 @@
         <w:rPr>
           <w:lang w:val="es_ES" w:bidi="es_ES"/>
         </w:rPr>
-        <w:t xml:space="preserve"> Abraham contestó: —Estas siete corderas que te regalo servirán de testimonio de que este pozo lo cavé yo.</w:t>
+        <w:t xml:space="preserve"> Abraham contestó: —Estas 7 corderas que te regalo servirán de testimonio de que este pozo lo cavé yo.</w:t>
       </w:r>
     </w:p>
     <w:p>
@@ -10614,7 +10614,7 @@
         <w:rPr>
           <w:lang w:val="es_ES" w:bidi="es_ES"/>
         </w:rPr>
-        <w:t xml:space="preserve"> Desde ese momento, ese lugar se llamó Berseba,1 porque allí los 2 hicieron un juramento.</w:t>
+        <w:t xml:space="preserve"> Desde ese momento, ese lugar se llamó Berseba, porque allí los 2 hicieron un juramento.</w:t>
       </w:r>
     </w:p>
     <w:p>
@@ -10756,7 +10756,7 @@
         <w:rPr>
           <w:lang w:val="es_ES" w:bidi="es_ES"/>
         </w:rPr>
-        <w:t xml:space="preserve"> Al amanecer del día siguiente, Abraham se levantó, ensilló su burro, tomó a dos siervos y a su hijo Isaac, y cortó la leña para el sacrificio. Luego partió hacia el lugar que Dios le había indicado.</w:t>
+        <w:t xml:space="preserve"> Al amanecer del día siguiente, Abraham se levantó, ensilló su burro, tomó a 2 siervos y a su hijo Isaac, y cortó la leña para el sacrificio. Luego partió hacia el lugar que Dios le había indicado.</w:t>
       </w:r>
     </w:p>
     <w:p>
@@ -10819,7 +10819,7 @@
         <w:rPr>
           <w:lang w:val="es_ES" w:bidi="es_ES"/>
         </w:rPr>
-        <w:t xml:space="preserve"> Abraham tomó la leña del sacrificio y la puso sobre los hombros de su hijo Isaac. Él cargo con el fuego y el cuchillo. Así, los dos siguieron el camino juntos.</w:t>
+        <w:t xml:space="preserve"> Abraham tomó la leña del sacrificio y la puso sobre los hombros de su hijo Isaac. Él cargo con el fuego y el cuchillo. Así, los 2 siguieron el camino juntos.</w:t>
       </w:r>
     </w:p>
     <w:p>
@@ -10840,7 +10840,7 @@
         <w:rPr>
           <w:lang w:val="es_ES" w:bidi="es_ES"/>
         </w:rPr>
-        <w:t xml:space="preserve"> —¡Padre! —dijo Isaac.—Dime, hijo mío —respondió Abraham—Tenemos el fuego y la leña —continuó Isaac—, pero ¿dónde está el cordero para el sacrificio?</w:t>
+        <w:t xml:space="preserve"> —¡Padre! —dijo Isaac. —Dime, hijo mío —respondió Abraham —Tenemos el fuego y la leña —continuó Isaac—, pero ¿dónde está el cordero para el sacrificio?</w:t>
       </w:r>
     </w:p>
     <w:p>
@@ -10987,7 +10987,7 @@
         <w:rPr>
           <w:lang w:val="es_ES" w:bidi="es_ES"/>
         </w:rPr>
-        <w:t xml:space="preserve"> Abraham llamó a ese lugar «El Señor provee». Por eso hasta hoy se dice hoy: «En el monte el Señor proveerá».</w:t>
+        <w:t xml:space="preserve"> Abraham llamó a ese lugar “El Señor provee”. Por eso hasta hoy se dice: “En el monte el Señor proveerá”.</w:t>
       </w:r>
     </w:p>
     <w:p>
@@ -11050,7 +11050,7 @@
         <w:rPr>
           <w:lang w:val="es_ES" w:bidi="es_ES"/>
         </w:rPr>
-        <w:t xml:space="preserve"> te bendeciré en gran manera. Tu descendencia será tan numerosa como las estrellas del cielo y como la arena que está a la orilla del mar. Además, tus descendientes conquistarán las ciudades de sus enemigos.</w:t>
+        <w:t xml:space="preserve"> te bendeciré en gran manera. Tu descendencia será tan numerosa como las estrellas del cielo y como la arena que está a la orilla del mar. Además, tus descendientes habitarán las ciudades de sus enemigos.</w:t>
       </w:r>
     </w:p>
     <w:p>
@@ -11107,7 +11107,7 @@
           <w:vertAlign w:val="superscript"/>
           <w:lang w:val="es_ES" w:bidi="es_ES"/>
         </w:rPr>
-        <w:t>23</w:t>
+        <w:t>20-23</w:t>
       </w:r>
       <w:r>
         <w:rPr>
@@ -11134,7 +11134,7 @@
         <w:rPr>
           <w:lang w:val="es_ES" w:bidi="es_ES"/>
         </w:rPr>
-        <w:t xml:space="preserve"> Najor tuvo además cuatro hijos con su concubina Reumá. Estos hijos fueron Tébaj, Gaján, Tajás y Macá.</w:t>
+        <w:t xml:space="preserve"> Najor tuvo además 4 hijos con su concubina Reumá. Estos hijos fueron Tébaj, Gaján, Tajás y Macá.</w:t>
       </w:r>
     </w:p>
     <w:p>
@@ -11838,7 +11838,7 @@
         <w:rPr>
           <w:lang w:val="es_ES" w:bidi="es_ES"/>
         </w:rPr>
-        <w:t xml:space="preserve"> Entonces comenzó a orar: «Señor, Dios de mi amo Abraham, te ruego que me vaya bien y que muestres tu misericordia a mi amo Abraham.</w:t>
+        <w:t xml:space="preserve"> Entonces comenzó a orar: —Señor, Dios de mi amo Abraham, te ruego que me vaya bien y que muestres tu misericordia a mi amo Abraham.</w:t>
       </w:r>
     </w:p>
     <w:p>
@@ -11880,7 +11880,7 @@
         <w:rPr>
           <w:lang w:val="es_ES" w:bidi="es_ES"/>
         </w:rPr>
-        <w:t xml:space="preserve"> Permíteme reconocer así a la joven que tú has escogido para que sea la esposa de tu siervo Isaac. Que sea la joven a la que yo le pida: “Por favor, baja tu cántaro para que yo pueda beber”, y ella me responda: “Beba usted, y también daré de beber a sus camellos”. Así podré estar seguro de que has mostrado tu amor a mi amo».</w:t>
+        <w:t xml:space="preserve"> Permíteme reconocer así a la joven que tú has escogido para que sea la esposa de tu siervo Isaac. Que sea la joven a la que yo le pida: “Por favor, baja tu cántaro para que yo pueda beber”, y ella me responda: “Beba usted, y también daré de beber a sus camellos”. Así podré estar seguro de que has mostrado tu amor a mi amo.</w:t>
       </w:r>
     </w:p>
     <w:p>
@@ -12153,7 +12153,7 @@
         <w:rPr>
           <w:lang w:val="es_ES" w:bidi="es_ES"/>
         </w:rPr>
-        <w:t xml:space="preserve"> dijo:—Bendito sea el Señor, Dios de mi señor Abraham, que no ha dejado de mostrarle su misericordia y su fidelidad. El Señor me ha guiado a la casa de los familiares de mi amo.</w:t>
+        <w:t xml:space="preserve"> dijo: —Bendito sea el Señor, Dios de mi señor Abraham, que no ha dejado de mostrarle su misericordia y su fidelidad. El Señor me ha guiado a la casa de los familiares de mi amo.</w:t>
       </w:r>
     </w:p>
     <w:p>
@@ -12189,7 +12189,7 @@
           <w:vertAlign w:val="superscript"/>
           <w:lang w:val="es_ES" w:bidi="es_ES"/>
         </w:rPr>
-        <w:t>30</w:t>
+        <w:t>29-30</w:t>
       </w:r>
       <w:r>
         <w:rPr>
@@ -12216,7 +12216,7 @@
         <w:rPr>
           <w:lang w:val="es_ES" w:bidi="es_ES"/>
         </w:rPr>
-        <w:t xml:space="preserve"> Labán le dijo: ―¡Ven, bendito del Señor, quédate con nosotros! No tienes por qué quedarte aquí afuera. Ya he preparado un lugar para ti. También hay sitio para los camellos.</w:t>
+        <w:t xml:space="preserve"> Labán le dijo: —¡Ven, bendito del Señor, quédate con nosotros! No tienes por qué quedarte aquí afuera. Ya he preparado un lugar para ti. También hay sitio para los camellos.</w:t>
       </w:r>
     </w:p>
     <w:p>
@@ -12258,7 +12258,7 @@
         <w:rPr>
           <w:lang w:val="es_ES" w:bidi="es_ES"/>
         </w:rPr>
-        <w:t xml:space="preserve"> Cuando les sirvieron la comida, el siervo de Abraham dijo: ―No quiero comer nada hasta haber dicho lo que tengo que decir. ―Muy bien —dijo Labán—, habla.</w:t>
+        <w:t xml:space="preserve"> Cuando les sirvieron la comida, el siervo de Abraham dijo: —No quiero comer nada hasta haber dicho lo que tengo que decir. —Muy bien —dijo Labán—, habla.</w:t>
       </w:r>
     </w:p>
     <w:p>
@@ -12336,13 +12336,13 @@
           <w:vertAlign w:val="superscript"/>
           <w:lang w:val="es_ES" w:bidi="es_ES"/>
         </w:rPr>
-        <w:t>38</w:t>
-      </w:r>
-      <w:r>
-        <w:rPr>
-          <w:lang w:val="es_ES" w:bidi="es_ES"/>
-        </w:rPr>
-        <w:t xml:space="preserve"> Mi amo me hizo jurar y me dijo: "No tomarás esposa para mi hijo de entre las mujeres de Canaán, donde vivo. Irás a mi tierra, donde están mis parientes, y allí le buscarás una esposa a mi hijo".</w:t>
+        <w:t>37-38</w:t>
+      </w:r>
+      <w:r>
+        <w:rPr>
+          <w:lang w:val="es_ES" w:bidi="es_ES"/>
+        </w:rPr>
+        <w:t xml:space="preserve"> Mi amo me hizo jurar y me dijo: “No tomarás esposa para mi hijo de entre las mujeres de Canaán, donde vivo. Irás a mi tierra, donde están mis parientes, y allí le buscarás una esposa a mi hijo”.</w:t>
       </w:r>
     </w:p>
     <w:p>
@@ -12363,7 +12363,7 @@
         <w:rPr>
           <w:lang w:val="es_ES" w:bidi="es_ES"/>
         </w:rPr>
-        <w:t xml:space="preserve"> »Yo le dije a mi amo: "¿Y si la mujer no quiere seguirme?".</w:t>
+        <w:t xml:space="preserve"> »Yo le dije a mi amo: "¿Y si la mujer no quiere seguirme?”.</w:t>
       </w:r>
     </w:p>
     <w:p>
@@ -12384,7 +12384,7 @@
         <w:rPr>
           <w:lang w:val="es_ES" w:bidi="es_ES"/>
         </w:rPr>
-        <w:t xml:space="preserve"> »Él me respondió: "El Señor, en cuya presencia he caminado, enviará su ángel delante de ti para que encuentres entre mis parientes una esposa para mi hijo.</w:t>
+        <w:t xml:space="preserve"> »Él me respondió: “El Señor, en cuya presencia he caminado, enviará su ángel delante de ti para que encuentres entre mis parientes una esposa para mi hijo.</w:t>
       </w:r>
     </w:p>
     <w:p>
@@ -12405,7 +12405,7 @@
         <w:rPr>
           <w:lang w:val="es_ES" w:bidi="es_ES"/>
         </w:rPr>
-        <w:t xml:space="preserve"> Quedarás libre del juramento únicamente si mis parientes no te entregan a la joven".</w:t>
+        <w:t xml:space="preserve"> Quedarás libre del juramento únicamente si mis parientes no te entregan a la joven”.</w:t>
       </w:r>
     </w:p>
     <w:p>
@@ -12426,7 +12426,7 @@
         <w:rPr>
           <w:lang w:val="es_ES" w:bidi="es_ES"/>
         </w:rPr>
-        <w:t xml:space="preserve"> »Cuando he llegado a la fuente, he dicho: "Señor, Dios de mi amo Abraham, te ruego que me des éxito en mi misión.</w:t>
+        <w:t xml:space="preserve"> »Cuando he llegado a la fuente, he dicho: “Señor, Dios de mi amo Abraham, te ruego que me des éxito en mi misión.</w:t>
       </w:r>
     </w:p>
     <w:p>
@@ -12447,7 +12447,7 @@
         <w:rPr>
           <w:lang w:val="es_ES" w:bidi="es_ES"/>
         </w:rPr>
-        <w:t xml:space="preserve"> Mira, aquí estoy, en la fuente, a la hora en que las muchachas salen a buscar el agua. Te ruego que a la joven a la que yo le pida: 'Por favor, baja tu cántaro para que yo pueda beber',</w:t>
+        <w:t xml:space="preserve"> Mira, aquí estoy, en la fuente, a la hora en que las muchachas salen a buscar el agua. Voy a pedir a una joven que baje su cántaro para que yo pueda beber.</w:t>
       </w:r>
     </w:p>
     <w:p>
@@ -12468,7 +12468,7 @@
         <w:rPr>
           <w:lang w:val="es_ES" w:bidi="es_ES"/>
         </w:rPr>
-        <w:t xml:space="preserve"> y ella me responda: 'Bebe tú, y también daré de beber a tus camellos', sea esa la esposa que has escogido para el hijo de mi amo".</w:t>
+        <w:t xml:space="preserve"> Que una me dé de beber y también a mis camellos. Que ella sea la esposa que has escogido para el hijo de mi amo”.</w:t>
       </w:r>
     </w:p>
     <w:p>
@@ -12510,7 +12510,7 @@
         <w:rPr>
           <w:lang w:val="es_ES" w:bidi="es_ES"/>
         </w:rPr>
-        <w:t xml:space="preserve"> »En seguida ella bajó el cántaro de su hombro y dijo: "Bebe, señor. Sacaré agua también para tus camellos". Mientras yo bebía, ella abrevó también a los camellos.</w:t>
+        <w:t xml:space="preserve"> »En seguida ella bajó el cántaro de su hombro y dijo: “Bebe, señor. Sacaré agua también para tus camellos”. Mientras yo bebía, ella abrevó también a los camellos.</w:t>
       </w:r>
     </w:p>
     <w:p>
@@ -12741,7 +12741,7 @@
         <w:rPr>
           <w:lang w:val="es_ES" w:bidi="es_ES"/>
         </w:rPr>
-        <w:t xml:space="preserve"> Ellos dijeron:—Llamemos a la joven a ver qué opina.</w:t>
+        <w:t xml:space="preserve"> Ellos dijeron: —Llamemos a la joven a ver qué opina.</w:t>
       </w:r>
     </w:p>
     <w:p>
@@ -12804,7 +12804,7 @@
         <w:rPr>
           <w:lang w:val="es_ES" w:bidi="es_ES"/>
         </w:rPr>
-        <w:t xml:space="preserve"> La bendijeron con estas palabras:—Hermana nuestra, que seas madre de miles y miles, y que tus descendientes conquisten las ciudades de sus enemigos.</w:t>
+        <w:t xml:space="preserve"> La bendijeron con estas palabras: —Hermana nuestra, que seas madre de miles y miles, y que tus descendientes habiten las ciudades de sus enemigos.</w:t>
       </w:r>
     </w:p>
     <w:p>
@@ -12909,7 +12909,7 @@
         <w:rPr>
           <w:lang w:val="es_ES" w:bidi="es_ES"/>
         </w:rPr>
-        <w:t xml:space="preserve"> y le preguntó al criado:―¿Quién es ese hombre que viene hacia nosotros por el campo? ―Es el hijo de mi amo —le contestó. Entonces ella tomó el velo y se cubrió.</w:t>
+        <w:t xml:space="preserve"> y le preguntó al criado: —¿Quién es ese hombre que viene hacia nosotros por el campo? —Es el hijo de mi amo —le contestó. Entonces ella tomó el velo y se cubrió.</w:t>
       </w:r>
     </w:p>
     <w:p>
@@ -12951,7 +12951,7 @@
         <w:rPr>
           <w:lang w:val="es_ES" w:bidi="es_ES"/>
         </w:rPr>
-        <w:t xml:space="preserve"> Isaac llevó a Rebeca a la tienda de Sara, su madre. La tomó a Rebeca por esposa. Isaac amó a Rebeca y gracias a ella se consoló por la muerte de su madre.</w:t>
+        <w:t xml:space="preserve"> Isaac llevó a Rebeca a la tienda de Sara, su madre. La tomó por esposa. Isaac amó a Rebeca y gracias a ella se consoló por la muerte de su madre.</w:t>
       </w:r>
     </w:p>
     <w:p>
@@ -13093,22 +13093,22 @@
         <w:rPr>
           <w:lang w:val="es_ES" w:bidi="es_ES"/>
         </w:rPr>
-        <w:t xml:space="preserve"> A los hijos que tuvo con las concubinas les dio regalos y los apartó de su hijo Isaac. Los envió a las tierra del oriente.</w:t>
-      </w:r>
-    </w:p>
-    <w:p>
-      <w:pPr/>
-      <w:r>
-        <w:rPr>
-          <w:lang w:val="es_ES" w:bidi="es_ES"/>
-        </w:rPr>
-      </w:r>
-      <w:r>
-        <w:rPr>
-          <w:vertAlign w:val="superscript"/>
-          <w:lang w:val="es_ES" w:bidi="es_ES"/>
-        </w:rPr>
-        <w:t>8</w:t>
+        <w:t xml:space="preserve"> A los hijos que tuvo con las concubinas les dio regalos y los apartó de su hijo Isaac. Los envió a las tierras del oriente.</w:t>
+      </w:r>
+    </w:p>
+    <w:p>
+      <w:pPr/>
+      <w:r>
+        <w:rPr>
+          <w:lang w:val="es_ES" w:bidi="es_ES"/>
+        </w:rPr>
+      </w:r>
+      <w:r>
+        <w:rPr>
+          <w:vertAlign w:val="superscript"/>
+          <w:lang w:val="es_ES" w:bidi="es_ES"/>
+        </w:rPr>
+        <w:t>7-8</w:t>
       </w:r>
       <w:r>
         <w:rPr>
@@ -13129,7 +13129,7 @@
           <w:vertAlign w:val="superscript"/>
           <w:lang w:val="es_ES" w:bidi="es_ES"/>
         </w:rPr>
-        <w:t>10</w:t>
+        <w:t>9-10</w:t>
       </w:r>
       <w:r>
         <w:rPr>
@@ -13171,7 +13171,7 @@
           <w:vertAlign w:val="superscript"/>
           <w:lang w:val="es_ES" w:bidi="es_ES"/>
         </w:rPr>
-        <w:t>15</w:t>
+        <w:t>12-15</w:t>
       </w:r>
       <w:r>
         <w:rPr>
@@ -13324,7 +13324,7 @@
         <w:rPr>
           <w:lang w:val="es_ES" w:bidi="es_ES"/>
         </w:rPr>
-        <w:t xml:space="preserve"> Los niños se peleaban dentro de su vientre. Ella se dijo: «Si esto va a seguir así, ¿para qué vivir?». Entonces fue a consultar al Señor.</w:t>
+        <w:t xml:space="preserve"> Los niños se peleaban dentro de su vientre. Ella se dijo: “Si esto va a seguir así, ¿para qué vivir?”. Entonces fue a consultar al Señor.</w:t>
       </w:r>
     </w:p>
     <w:p>
@@ -13345,7 +13345,7 @@
         <w:rPr>
           <w:lang w:val="es_ES" w:bidi="es_ES"/>
         </w:rPr>
-        <w:t xml:space="preserve"> Y Dios le dijo: —En tu vientre hay dos naciones, 2 pueblos separados desde tus entrañas. Uno será más fuerte que el otro, y el mayor servirá al menor.</w:t>
+        <w:t xml:space="preserve"> Y Dios le dijo: —En tu vientre hay 2 naciones, 2 pueblos separados desde tus entrañas. Uno será más fuerte que el otro, y el mayor servirá al menor.</w:t>
       </w:r>
     </w:p>
     <w:p>
@@ -13387,7 +13387,7 @@
         <w:rPr>
           <w:lang w:val="es_ES" w:bidi="es_ES"/>
         </w:rPr>
-        <w:t xml:space="preserve"> El primero que nació era pelirrojo y muy velludo. A este lo llamaron Esaú.Esaú: En hebreo, Esaú puede significar velludo." class="footnote-marker"&gt;1</w:t>
+        <w:t xml:space="preserve"> El primero que nació era pelirrojo y muy velludo. A este lo llamaron Esaú.</w:t>
       </w:r>
     </w:p>
     <w:p>
@@ -13408,7 +13408,7 @@
         <w:rPr>
           <w:lang w:val="es_ES" w:bidi="es_ES"/>
         </w:rPr>
-        <w:t xml:space="preserve"> Luego salió su hermano, que agarraba con la mano el talón de Esaú. A este lo llamaron Jacob.Jacob: En hebreo, Jacob quiere decir él agarra el talón. Era una manera hebrea de expresar que alguien engaña a otro." class="footnote-marker"&gt;2 Isaac tenía sesenta años cuando nacieron.</w:t>
+        <w:t xml:space="preserve"> Luego salió su hermano, que agarraba con la mano el talón de Esaú. A este lo llamaron Jacob. Isaac tenía 60 años cuando nacieron.</w:t>
       </w:r>
     </w:p>
     <w:p>
@@ -13429,7 +13429,7 @@
         <w:rPr>
           <w:lang w:val="es_ES" w:bidi="es_ES"/>
         </w:rPr>
-        <w:t xml:space="preserve"> Los niños crecieron. Esaú era un hombre de campo y se conviritó en un excelente cazador. Jacob era un hombre tranquilo que pasaba el tiempo en casa.</w:t>
+        <w:t xml:space="preserve"> Los niños crecieron. Esaú era un hombre de campo y se convirtió en un excelente cazador. Jacob era un hombre tranquilo que pasaba el tiempo en casa.</w:t>
       </w:r>
     </w:p>
     <w:p>
@@ -13492,7 +13492,7 @@
         <w:rPr>
           <w:lang w:val="es_ES" w:bidi="es_ES"/>
         </w:rPr>
-        <w:t xml:space="preserve"> y le dijo: —Estoy muy cansado y hambriento, dame un poco de ese guiso rojo. Por eso a Esaú lo llamaron Edom.Edom: En hebreo, Edom significa rojo." class="footnote-marker"&gt;3</w:t>
+        <w:t xml:space="preserve"> y le dijo: —Estoy muy cansado y hambriento, dame un poco de ese guiso rojo. Por eso a Esaú lo llamaron Edom.</w:t>
       </w:r>
     </w:p>
     <w:p>
@@ -13634,7 +13634,7 @@
         <w:rPr>
           <w:lang w:val="es_ES" w:bidi="es_ES"/>
         </w:rPr>
-        <w:t xml:space="preserve"> Allí se le apareció el Señor y le dijo:—No bajes a Egipto; quédate en la región que te voy a decir.</w:t>
+        <w:t xml:space="preserve"> Allí se le apareció el Señor y le dijo: —No bajes a Egipto; quédate en la región que te voy a decir.</w:t>
       </w:r>
     </w:p>
     <w:p>
@@ -13844,7 +13844,7 @@
         <w:rPr>
           <w:lang w:val="es_ES" w:bidi="es_ES"/>
         </w:rPr>
-        <w:t xml:space="preserve"> Ese año, Isaac sembró en aquella tierra y cosechó cien veces lo sembrado, porque el Señor lo bendijo.</w:t>
+        <w:t xml:space="preserve"> Ese año, Isaac sembró en aquella tierra y cosechó 100 veces lo sembrado, porque el Señor lo bendijo.</w:t>
       </w:r>
     </w:p>
     <w:p>
@@ -14012,7 +14012,7 @@
         <w:rPr>
           <w:lang w:val="es_ES" w:bidi="es_ES"/>
         </w:rPr>
-        <w:t xml:space="preserve"> Los pastores de Guerar discutieron con los pastores de Isaac. Decían: «El agua es nuestra». Por eso Isaac llamó a ese pozo Pelea,Pelea: El nombre en hebreo es Esek, que quiere decir pelea." class="footnote-marker"&gt;1 porque habían peleado por él.</w:t>
+        <w:t xml:space="preserve"> Los pastores de Guerar discutieron con los pastores de Isaac. Decían: —El agua es nuestra. Por eso Isaac llamó a ese pozo Pelea, porque habían peleado por él.</w:t>
       </w:r>
     </w:p>
     <w:p>
@@ -14033,7 +14033,7 @@
         <w:rPr>
           <w:lang w:val="es_ES" w:bidi="es_ES"/>
         </w:rPr>
-        <w:t xml:space="preserve"> Los hombres de Isaac cavaron otro pozo, y también pelearon por él. A este pozo Isaac lo llamó Enemistad.Enemistad: El nombre en hebreo es Sitna, que quiere decir enemistad. " class="footnote-marker footnote-selected"&gt;2</w:t>
+        <w:t xml:space="preserve"> Los hombres de Isaac cavaron otro pozo, y también pelearon por él. A este pozo Isaac lo llamó Enemistad.2</w:t>
       </w:r>
     </w:p>
     <w:p>
@@ -14054,7 +14054,7 @@
         <w:rPr>
           <w:lang w:val="es_ES" w:bidi="es_ES"/>
         </w:rPr>
-        <w:t xml:space="preserve"> Isaac se fue de allí y cavó otro pozo, pero esta vez no pelearon por él. Entonces Isaac lo llamó Espacio Abierto,Espacio Abierto: El nombre en hebreo es Rejobot, que quiere decir espacio abierto. " class="footnote-marker"&gt;3 porque dijo: «Ahora el Señor nos ha dado espacio, y prosperamos en esta región».</w:t>
+        <w:t xml:space="preserve"> Isaac se fue de allí y cavó otro pozo, pero esta vez no pelearon por él. Entonces Isaac lo llamó Espacio Abierto, porque dijo: “Ahora el Señor nos ha dado espacio, y prosperamos en esta región”.</w:t>
       </w:r>
     </w:p>
     <w:p>
@@ -14285,7 +14285,7 @@
         <w:rPr>
           <w:lang w:val="es_ES" w:bidi="es_ES"/>
         </w:rPr>
-        <w:t xml:space="preserve"> Isaac le llamó Juramento;Juramento: El nombre en hebreo es Seba. Quiere decir juramento o siete." class="footnote-marker"&gt;4 por eso la ciudad se llama BersebaBerseba: En hebreo, Berseba quiere decir pozo del juramento o pozo de los siete.﻿﻿" class="footnote-marker"&gt;5 hasta el día de hoy.</w:t>
+        <w:t xml:space="preserve"> Isaac le llamó Juramento; por eso la ciudad se llama Berseba hasta el día de hoy.</w:t>
       </w:r>
     </w:p>
     <w:p>
@@ -14306,7 +14306,7 @@
         <w:rPr>
           <w:lang w:val="es_ES" w:bidi="es_ES"/>
         </w:rPr>
-        <w:t xml:space="preserve"> Cuando Esaú tenía cuarenta años, se casó con Judit, hija de Beerí el hitita. También se casó con Basemat, hija de Elón el hitita.</w:t>
+        <w:t xml:space="preserve"> Cuando Esaú tenía 40 años, se casó con Judit, hija de Beerí el hitita. También se casó con Basemat, hija de Elón el hitita.</w:t>
       </w:r>
     </w:p>
     <w:p>
@@ -14364,7 +14364,7 @@
         <w:rPr>
           <w:lang w:val="es_ES" w:bidi="es_ES"/>
         </w:rPr>
-        <w:t xml:space="preserve"> Isaac ya era muy anciano y apenas podía ver. Un día llamó a Esaú, su hijo mayor, y le dijo: —¡Hijo mío!—¿Qué quieres, padre? —respondió Esaú.</w:t>
+        <w:t xml:space="preserve"> Isaac ya era muy anciano y apenas podía ver. Un día llamó a Esaú, su hijo mayor, y le dijo: —¡Hijo mío! —¿Qué quieres, padre? —respondió Esaú.</w:t>
       </w:r>
     </w:p>
     <w:p>
@@ -14532,7 +14532,7 @@
         <w:rPr>
           <w:lang w:val="es_ES" w:bidi="es_ES"/>
         </w:rPr>
-        <w:t xml:space="preserve"> Ve al rebaño y tráeme dos de los mejores cabritos. Voy a prepararle a tu padre un guiso como a él le gusta.</w:t>
+        <w:t xml:space="preserve"> Ve al rebaño y tráeme 2 de los mejores cabritos. Voy a prepararle a tu padre un guiso como a él le gusta.</w:t>
       </w:r>
     </w:p>
     <w:p>
@@ -14574,7 +14574,7 @@
         <w:rPr>
           <w:lang w:val="es_ES" w:bidi="es_ES"/>
         </w:rPr>
-        <w:t xml:space="preserve"> ―Pero, madre —dijo Jacob—, mi hermano es muy velludo y yo apenas tengo vello.</w:t>
+        <w:t xml:space="preserve"> —Pero, madre —dijo Jacob—, mi hermano es muy velludo y yo apenas tengo vello.</w:t>
       </w:r>
     </w:p>
     <w:p>
@@ -14637,7 +14637,7 @@
         <w:rPr>
           <w:lang w:val="es_ES" w:bidi="es_ES"/>
         </w:rPr>
-        <w:t xml:space="preserve"> Jacob hizo lo que le dijo su madre y le trajo los dos cabritos. Ella preparó un guiso tal como le gustaba a Isaac.</w:t>
+        <w:t xml:space="preserve"> Jacob hizo lo que le dijo su madre y le trajo los 2 cabritos. Ella preparó un guiso tal como le gustaba a Isaac.</w:t>
       </w:r>
     </w:p>
     <w:p>
@@ -14742,7 +14742,7 @@
         <w:rPr>
           <w:lang w:val="es_ES" w:bidi="es_ES"/>
         </w:rPr>
-        <w:t xml:space="preserve"> ―Soy Esaú, tu hijo mayor —dijo Jacob—. Hice lo que me pediste. Este es el guiso que preparé con lo que he cazado. Siéntate y cómelo, para que me bendigas.</w:t>
+        <w:t xml:space="preserve"> —Soy Esaú, tu hijo mayor —dijo Jacob—. Hice lo que me pediste. Este es el guiso que preparé con lo que he cazado. Siéntate y cómelo, para que me bendigas.</w:t>
       </w:r>
     </w:p>
     <w:p>
@@ -14847,7 +14847,7 @@
         <w:rPr>
           <w:lang w:val="es_ES" w:bidi="es_ES"/>
         </w:rPr>
-        <w:t xml:space="preserve"> Isaac volvió a preguntarle: —¿Seguro que eres tú mi hijo Esaú?Y él respondió: —Sí, soy yo.</w:t>
+        <w:t xml:space="preserve"> Isaac volvió a preguntarle: —¿Seguro que eres tú mi hijo Esaú? Y él respondió: —Sí, soy yo.</w:t>
       </w:r>
     </w:p>
     <w:p>
@@ -14868,7 +14868,7 @@
         <w:rPr>
           <w:lang w:val="es_ES" w:bidi="es_ES"/>
         </w:rPr>
-        <w:t xml:space="preserve"> Entonces su padre dijo: —Pásame el guiso con tu caza, para que lo coma, y te daré mi bendición.Jacob se lo pasó, e Isaac comió; también bebió el vino que Jacob le había traído.</w:t>
+        <w:t xml:space="preserve"> Entonces su padre dijo: —Pásame el guiso con tu caza, para que lo coma, y te daré mi bendición. Jacob se lo pasó, e Isaac comió; también bebió el vino que Jacob le había traído.</w:t>
       </w:r>
     </w:p>
     <w:p>
@@ -15015,7 +15015,7 @@
         <w:rPr>
           <w:lang w:val="es_ES" w:bidi="es_ES"/>
         </w:rPr>
-        <w:t xml:space="preserve"> Isaac le preguntó: —¿Quién eres tú?Él respondió: —Soy Esaú, tu primogénito.</w:t>
+        <w:t xml:space="preserve"> Isaac le preguntó: —¿Quién eres tú? Él respondió: —Soy Esaú, tu primogénito.</w:t>
       </w:r>
     </w:p>
     <w:p>
@@ -15099,7 +15099,7 @@
         <w:rPr>
           <w:lang w:val="es_ES" w:bidi="es_ES"/>
         </w:rPr>
-        <w:t xml:space="preserve"> —¡Con razón le pusieron Jacob!Jacob: En hebreo, Jacob puede entenderse como suplanta o engaña." class="footnote-marker"&gt;1 —dijo Esaú con amargura—. Me ha engañado dos veces: primero me quitó mis derechos de hermano mayor, y ahora se ha llevado mi bendición. ¿No has guardado una bendición para mí, padre?</w:t>
+        <w:t xml:space="preserve"> —¡Con razón le pusieron Jacob! —dijo Esaú con amargura—. Me ha engañado 2 veces. Primero me quitó mis derechos de hermano mayor, y ahora se ha llevado mi bendición. ¿No has guardado una bendición para mí, padre?</w:t>
       </w:r>
     </w:p>
     <w:p>
@@ -15141,7 +15141,7 @@
         <w:rPr>
           <w:lang w:val="es_ES" w:bidi="es_ES"/>
         </w:rPr>
-        <w:t xml:space="preserve"> Esaú insistió: —¿Solo tienes una bendición? ¡Padre mío, bendíceme también a mí!Y se puso a llorar con grandes gritos.</w:t>
+        <w:t xml:space="preserve"> Esaú insistió: —¿Solo tienes una bendición? ¡Padre mío, bendíceme también a mí! Y se puso a llorar con grandes gritos.</w:t>
       </w:r>
     </w:p>
     <w:p>
@@ -15204,7 +15204,7 @@
         <w:rPr>
           <w:lang w:val="es_ES" w:bidi="es_ES"/>
         </w:rPr>
-        <w:t xml:space="preserve"> Desde entonces, Esaú le guardó un profundo rencor a Jacob por la bendición que su padre le había dado, y pensaba: «Se acercan los días de luto por mi padre; cuando pasen, mataré a mi hermano Jacob».</w:t>
+        <w:t xml:space="preserve"> Desde entonces, Esaú le guardó un profundo rencor a Jacob por la bendición que su padre le había dado, y pensaba: “Se acercan los días de luto por mi padre; cuando pasen, mataré a mi hermano Jacob”.</w:t>
       </w:r>
     </w:p>
     <w:p>
@@ -15261,7 +15261,7 @@
           <w:vertAlign w:val="superscript"/>
           <w:lang w:val="es_ES" w:bidi="es_ES"/>
         </w:rPr>
-        <w:t>45</w:t>
+        <w:t>44-45</w:t>
       </w:r>
       <w:r>
         <w:rPr>
@@ -15577,7 +15577,7 @@
         <w:rPr>
           <w:lang w:val="es_ES" w:bidi="es_ES"/>
         </w:rPr>
-        <w:t xml:space="preserve"> En el sueño, también vio que el Señor estaba de pie junto a él y le decía:—Yo soy el Señor, el Dios de tu abuelo Abraham y de tu padre Isaac. A ti y a tus descendientes les daré esta tierra sobre la que estás acostado.</w:t>
+        <w:t xml:space="preserve"> En el sueño, también vio que el Señor estaba de pie junto a él y le decía: —Yo soy el Señor, el Dios de tu abuelo Abraham y de tu padre Isaac. A ti y a tus descendientes les daré esta tierra sobre la que estás acostado.</w:t>
       </w:r>
     </w:p>
     <w:p>
@@ -15634,13 +15634,13 @@
           <w:vertAlign w:val="superscript"/>
           <w:lang w:val="es_ES" w:bidi="es_ES"/>
         </w:rPr>
-        <w:t>17</w:t>
-      </w:r>
-      <w:r>
-        <w:rPr>
-          <w:lang w:val="es_ES" w:bidi="es_ES"/>
-        </w:rPr>
-        <w:t xml:space="preserve"> Al despertar Jacob de su sueño, tuvo miedo y dijo:—Sin duda, el Señor está en este lugar y yo no lo sabía.leno de temor, añadió:—¡Qué asombroso es este lugar! ¡Es nada menos que la casa de Dios y la puerta del cielo!</w:t>
+        <w:t>16-17</w:t>
+      </w:r>
+      <w:r>
+        <w:rPr>
+          <w:lang w:val="es_ES" w:bidi="es_ES"/>
+        </w:rPr>
+        <w:t xml:space="preserve"> Al despertar Jacob de su sueño, tuvo miedo y dijo: —Sin duda, el Señor está en este lugar y yo no lo sabía. Lleno de temor, añadió: —¡Qué asombroso es este lugar! ¡Es nada menos que la casa de Dios y la puerta del cielo!</w:t>
       </w:r>
     </w:p>
     <w:p>
@@ -15682,28 +15682,28 @@
         <w:rPr>
           <w:lang w:val="es_ES" w:bidi="es_ES"/>
         </w:rPr>
-        <w:t xml:space="preserve"> En ese lugar había una ciudad que se llamaba Luz, pero Jacob le cambió el nombre y la llamó Betel.Betel: En hebreo, Betel quiere decir casa de Dios." class="footnote-marker"&gt;1</w:t>
-      </w:r>
-    </w:p>
-    <w:p>
-      <w:pPr/>
-      <w:r>
-        <w:rPr>
-          <w:lang w:val="es_ES" w:bidi="es_ES"/>
-        </w:rPr>
-      </w:r>
-      <w:r>
-        <w:rPr>
-          <w:vertAlign w:val="superscript"/>
-          <w:lang w:val="es_ES" w:bidi="es_ES"/>
-        </w:rPr>
-        <w:t>22</w:t>
-      </w:r>
-      <w:r>
-        <w:rPr>
-          <w:lang w:val="es_ES" w:bidi="es_ES"/>
-        </w:rPr>
-        <w:t xml:space="preserve"> Jacob hizo esta promesa:—Que Dios esté conmigo y me guarde en este camino. Que me dé alimento y vestido, y que regrese yo en paz a la casa de mi padre. Si todo esto ocurre, entonces el Señor será mi Dios. Esta piedra que he puesto como monumento recordatorio será casa de Dios. Y le daré a Dios la décima parte de todo lo que me dé.</w:t>
+        <w:t xml:space="preserve"> En ese lugar había una ciudad que se llamaba Luz, pero Jacob le cambió el nombre y la llamó Betel.</w:t>
+      </w:r>
+    </w:p>
+    <w:p>
+      <w:pPr/>
+      <w:r>
+        <w:rPr>
+          <w:lang w:val="es_ES" w:bidi="es_ES"/>
+        </w:rPr>
+      </w:r>
+      <w:r>
+        <w:rPr>
+          <w:vertAlign w:val="superscript"/>
+          <w:lang w:val="es_ES" w:bidi="es_ES"/>
+        </w:rPr>
+        <w:t>20-22</w:t>
+      </w:r>
+      <w:r>
+        <w:rPr>
+          <w:lang w:val="es_ES" w:bidi="es_ES"/>
+        </w:rPr>
+        <w:t xml:space="preserve"> Jacob hizo esta promesa: —Que Dios esté conmigo y me guarde en este camino. Que me dé alimento y vestido, y que regrese yo en paz a la casa de mi padre. Si todo esto ocurre, entonces el Señor será mi Dios. Esta piedra que he puesto como monumento recordatorio será casa de Dios. Y le daré a Dios la décima parte de todo lo que me dé.</w:t>
       </w:r>
     </w:p>
     <w:p>
@@ -15803,7 +15803,7 @@
         <w:rPr>
           <w:lang w:val="es_ES" w:bidi="es_ES"/>
         </w:rPr>
-        <w:t xml:space="preserve"> Jacob preguntó a los pastores: ―Amigos, ¿de dónde son ustedes? ―Somos de Jarán —respondieron.</w:t>
+        <w:t xml:space="preserve"> Jacob preguntó a los pastores: —Amigos, ¿de dónde son ustedes? —Somos de Jarán —respondieron.</w:t>
       </w:r>
     </w:p>
     <w:p>
@@ -15824,7 +15824,7 @@
         <w:rPr>
           <w:lang w:val="es_ES" w:bidi="es_ES"/>
         </w:rPr>
-        <w:t xml:space="preserve"> ―¿Conocen a Labán, el nieto de Najor? —les volvió a preguntar. ―¡Claro que sí! —le contestaron.</w:t>
+        <w:t xml:space="preserve"> —¿Conocen a Labán, el nieto de Najor? —les volvió a preguntar. —¡Claro que sí! —le contestaron.</w:t>
       </w:r>
     </w:p>
     <w:p>
@@ -15845,7 +15845,7 @@
         <w:rPr>
           <w:lang w:val="es_ES" w:bidi="es_ES"/>
         </w:rPr>
-        <w:t xml:space="preserve"> Jacob continuó preguntando: ―¿Cómo le va? ―Está bien —contestaron—. Mira, allí viene su hija Raquel con las ovejas.</w:t>
+        <w:t xml:space="preserve"> Jacob continuó preguntando: —¿Cómo le va? —Está bien —contestaron—. Mira, allí viene su hija Raquel con las ovejas.</w:t>
       </w:r>
     </w:p>
     <w:p>
@@ -15866,7 +15866,7 @@
         <w:rPr>
           <w:lang w:val="es_ES" w:bidi="es_ES"/>
         </w:rPr>
-        <w:t xml:space="preserve"> Entonces Jacob dijo:—Estamos a pleno día, no es hora de recoger el rebaño. ¿Por qué no dan de beber a las ovejas y las llevan a pastar?</w:t>
+        <w:t xml:space="preserve"> Entonces Jacob dijo: —Estamos a pleno día, no es hora de recoger el rebaño. ¿Por qué no dan de beber a las ovejas y las llevan a pastar?</w:t>
       </w:r>
     </w:p>
     <w:p>
@@ -16013,7 +16013,7 @@
         <w:rPr>
           <w:lang w:val="es_ES" w:bidi="es_ES"/>
         </w:rPr>
-        <w:t xml:space="preserve"> Labán le dijo:—Desde luego, tú eres de mi misma sangre!Jacob llevaba ya un mes con Labán</w:t>
+        <w:t xml:space="preserve"> Labán le dijo: —Desde luego, tú eres de mi misma sangre! Jacob llevaba ya un mes con Labán</w:t>
       </w:r>
     </w:p>
     <w:p>
@@ -16097,7 +16097,7 @@
         <w:rPr>
           <w:lang w:val="es_ES" w:bidi="es_ES"/>
         </w:rPr>
-        <w:t xml:space="preserve"> Jacob estaba enamorado de Raquel, así que le dijo a Labán: —Trabajaré siete años para ti por Raquel, tu hija menor.</w:t>
+        <w:t xml:space="preserve"> Jacob estaba enamorado de Raquel, así que le dijo a Labán: —Trabajaré 7 años para ti por Raquel, tu hija menor.</w:t>
       </w:r>
     </w:p>
     <w:p>
@@ -16139,7 +16139,7 @@
         <w:rPr>
           <w:lang w:val="es_ES" w:bidi="es_ES"/>
         </w:rPr>
-        <w:t xml:space="preserve"> Así que Jacob trabajó siete años para poder casarse con Raquel, y le parecieron como un solo día, por lo enamorado que estaba de ella.</w:t>
+        <w:t xml:space="preserve"> Así que Jacob trabajó 7 años para poder casarse con Raquel, y le parecieron como un solo día, por lo enamorado que estaba de ella.</w:t>
       </w:r>
     </w:p>
     <w:p>
@@ -16160,7 +16160,7 @@
         <w:rPr>
           <w:lang w:val="es_ES" w:bidi="es_ES"/>
         </w:rPr>
-        <w:t xml:space="preserve"> Al fin llegó el día en que Jacob podía casarse con Raquel. —Ya han pasado los siete años —le dijo a Labán—; ahora dame a Raquel para unirme a ella.</w:t>
+        <w:t xml:space="preserve"> Al fin llegó el día en que Jacob podía casarse con Raquel. —Ya han pasado los 7 años —le dijo a Labán—; ahora dame a Raquel para unirme a ella.</w:t>
       </w:r>
     </w:p>
     <w:p>
@@ -16244,7 +16244,7 @@
         <w:rPr>
           <w:lang w:val="es_ES" w:bidi="es_ES"/>
         </w:rPr>
-        <w:t xml:space="preserve"> La mañana siguiente, al levantarse, Jacob descubrió que en realidad había dormido con Lea. Entonces fue a ver a Labán para reclamarle:—¿Qué clase de engaño es este? ¿Acaso no trabajé siete años para poder casarme con Raquel? ¿Por qué me has engañado de este modo?</w:t>
+        <w:t xml:space="preserve"> La mañana siguiente, al levantarse, Jacob descubrió que en realidad había dormido con Lea. Entonces fue a ver a Labán para reclamarle: —¿Qué clase de engaño es este? ¿Acaso no trabajé 7 años para poder casarme con Raquel? ¿Por qué me has engañado de este modo?</w:t>
       </w:r>
     </w:p>
     <w:p>
@@ -16265,7 +16265,7 @@
         <w:rPr>
           <w:lang w:val="es_ES" w:bidi="es_ES"/>
         </w:rPr>
-        <w:t xml:space="preserve"> Labán respondió: — Aquí no es costumbre casar a la hija pequeña antes que a la mayor.</w:t>
+        <w:t xml:space="preserve"> Labán respondió: —Aquí no es costumbre casar a la hija pequeña antes que a la mayor.</w:t>
       </w:r>
     </w:p>
     <w:p>
@@ -16391,7 +16391,7 @@
         <w:rPr>
           <w:lang w:val="es_ES" w:bidi="es_ES"/>
         </w:rPr>
-        <w:t xml:space="preserve"> Entonces Lea quedó embarazada y dio a luz un hijo, y lo llamó Rubén,Rubén: En hebreo, Rubén suena parecido a miren, un hijo, y también a él vio mi aflicción." class="footnote-marker"&gt;1 porque dijo: «El Señor ha visto mi aflicción; ahora me amará mi esposo».</w:t>
+        <w:t xml:space="preserve"> Entonces Lea quedó embarazada y dio a luz un hijo, y lo llamó Rubén, porque dijo: “El Señor ha visto mi aflicción; ahora me amará mi esposo”.</w:t>
       </w:r>
     </w:p>
     <w:p>
@@ -16412,7 +16412,7 @@
         <w:rPr>
           <w:lang w:val="es_ES" w:bidi="es_ES"/>
         </w:rPr>
-        <w:t xml:space="preserve"> Poco tiempo después volvió a quedar embarazada y tuvo otro hijo. A este lo llamó Simeón,Simeón: En hebreo, Simeón quiere decir el que oye." class="footnote-marker"&gt;2 porque dijo: «El Señor ha oído que no soy amada y por eso me dio también este hijo».</w:t>
+        <w:t xml:space="preserve"> Poco tiempo después volvió a quedar embarazada y tuvo otro hijo. A este lo llamó Simeón, porque dijo: “El Señor ha oído que no soy amada y por eso me dio también este hijo”.</w:t>
       </w:r>
     </w:p>
     <w:p>
@@ -16433,7 +16433,7 @@
         <w:rPr>
           <w:lang w:val="es_ES" w:bidi="es_ES"/>
         </w:rPr>
-        <w:t xml:space="preserve"> Volvió a quedar embarazada y dio a luz un tercer hijo, y lo llamó Leví,Leví: En hebreo, Leví suena como la palabra que significa unir." class="footnote-marker"&gt;3 porque dijo: «Ahora sí que se unirá mi marido a mí, porque le he dado tres hijos».</w:t>
+        <w:t xml:space="preserve"> Volvió a quedar embarazada y dio a luz un tercer hijo, y lo llamó Leví, porque dijo: “Ahora sí que se unirá mi marido a mí, porque le he dado 3 hijos”.</w:t>
       </w:r>
     </w:p>
     <w:p>
@@ -16454,7 +16454,7 @@
         <w:rPr>
           <w:lang w:val="es_ES" w:bidi="es_ES"/>
         </w:rPr>
-        <w:t xml:space="preserve"> Por cuarta vez, Lea quedó embarazada y dio a luz un hijo, al que llamó Judá,Judá: En hebreo, Judá suena como la palabra que significa alabar." class="footnote-marker"&gt;4 porque dijo: «Ahora alabaré al Señor». Y cesó de tener hijos.</w:t>
+        <w:t xml:space="preserve"> Por cuarta vez, Lea quedó embarazada y dio a luz un hijo, al que llamó Judá, porque dijo: “Ahora alabaré al Señor”. Y cesó de tener hijos.</w:t>
       </w:r>
     </w:p>
     <w:p>
@@ -16596,7 +16596,7 @@
         <w:rPr>
           <w:lang w:val="es_ES" w:bidi="es_ES"/>
         </w:rPr>
-        <w:t xml:space="preserve"> Raquel dijo:—¡Dios me ha hecho justicia! ¡Escuchó mi oración y me ha dado un hijo!Por eso lo llamó Dan.1</w:t>
+        <w:t xml:space="preserve"> Raquel dijo: —¡Dios me ha hecho justicia! ¡Escuchó mi oración y me ha dado un hijo! Por eso lo llamó Dan.</w:t>
       </w:r>
     </w:p>
     <w:p>
@@ -16638,7 +16638,7 @@
         <w:rPr>
           <w:lang w:val="es_ES" w:bidi="es_ES"/>
         </w:rPr>
-        <w:t xml:space="preserve"> Raquel dijo:—Dios me ha hecho luchar con mi hermana y he vencido. Por eso le puso por nombre Neftalí.2</w:t>
+        <w:t xml:space="preserve"> Raquel dijo: —Dios me ha hecho luchar con mi hermana y he vencido. Por eso le puso por nombre Neftalí.</w:t>
       </w:r>
     </w:p>
     <w:p>
@@ -16701,7 +16701,7 @@
         <w:rPr>
           <w:lang w:val="es_ES" w:bidi="es_ES"/>
         </w:rPr>
-        <w:t xml:space="preserve"> Lea dijo: —¡Qué buena suerte!Y llamó a su hijo Gad.3</w:t>
+        <w:t xml:space="preserve"> Lea dijo: —¡Qué buena suerte! Y llamó a su hijo Gad.</w:t>
       </w:r>
     </w:p>
     <w:p>
@@ -16743,7 +16743,7 @@
         <w:rPr>
           <w:lang w:val="es_ES" w:bidi="es_ES"/>
         </w:rPr>
-        <w:t xml:space="preserve"> Lea dijo:—¡Qué felicidad! Ahora las demás mujeres me felicitarán. Por eso le puso por nombre Aser.4</w:t>
+        <w:t xml:space="preserve"> Lea dijo: —¡Qué felicidad! Ahora las demás mujeres me felicitarán. Por eso le puso por nombre Aser.</w:t>
       </w:r>
     </w:p>
     <w:p>
@@ -16785,7 +16785,7 @@
         <w:rPr>
           <w:lang w:val="es_ES" w:bidi="es_ES"/>
         </w:rPr>
-        <w:t xml:space="preserve"> Pero Lea le respondió: —¿No tienes bastante con haberte llevado a mi marido, que también quieras quedarte con las mandrágoras de mi hijo?Raquel entonces le dijo: —Está bien, te propongo que, a cambio de las mandrágoras, Jacob se acueste contigo esta noche.</w:t>
+        <w:t xml:space="preserve"> Pero Lea le respondió: —¿No tienes bastante con haberte llevado a mi marido, que también quieres quedarte con las mandrágoras de mi hijo? Raquel entonces le dijo: —Está bien, te propongo que, a cambio de las mandrágoras, Jacob se acueste contigo esta noche.</w:t>
       </w:r>
     </w:p>
     <w:p>
@@ -16806,7 +16806,7 @@
         <w:rPr>
           <w:lang w:val="es_ES" w:bidi="es_ES"/>
         </w:rPr>
-        <w:t xml:space="preserve"> Al anochecer, cuando Jacob regresaba del campo, Lea salió a su encuentro y le dijo: —Esta noche te acostarás conmigo, porque te he alquilado por las mandrágoras de mi hijo.Y Jacob durmió con ella esa noche.</w:t>
+        <w:t xml:space="preserve"> Al anochecer, cuando Jacob regresaba del campo, Lea salió a su encuentro y le dijo: —Esta noche te acostarás conmigo, porque te he alquilado por las mandrágoras de mi hijo. Y Jacob durmió con ella esa noche.</w:t>
       </w:r>
     </w:p>
     <w:p>
@@ -16848,7 +16848,7 @@
         <w:rPr>
           <w:lang w:val="es_ES" w:bidi="es_ES"/>
         </w:rPr>
-        <w:t xml:space="preserve"> Lea dijo:—Dios me ha dado recompensa por haberle entregado mi sierva a mi esposo. Por eso lo llamó Isacar.5</w:t>
+        <w:t xml:space="preserve"> Lea dijo: —Dios me ha dado recompensa por haberle entregado mi sierva a mi esposo. Por eso lo llamó Isacar.</w:t>
       </w:r>
     </w:p>
     <w:p>
@@ -16890,7 +16890,7 @@
         <w:rPr>
           <w:lang w:val="es_ES" w:bidi="es_ES"/>
         </w:rPr>
-        <w:t xml:space="preserve"> Lea dijo: —Dios me ha hecho un buen regalo. Esta vez mi marido me honrará, pues le he dado 6 hijos. Por eso lo llamó Zabulón.6</w:t>
+        <w:t xml:space="preserve"> Lea dijo: —Dios me ha hecho un buen regalo. Esta vez mi marido me honrará, pues le he dado 6 hijos. Por eso lo llamó Zabulón.</w:t>
       </w:r>
     </w:p>
     <w:p>
@@ -16947,13 +16947,13 @@
           <w:vertAlign w:val="superscript"/>
           <w:lang w:val="es_ES" w:bidi="es_ES"/>
         </w:rPr>
-        <w:t>24</w:t>
-      </w:r>
-      <w:r>
-        <w:rPr>
-          <w:lang w:val="es_ES" w:bidi="es_ES"/>
-        </w:rPr>
-        <w:t xml:space="preserve"> Ella quedó embarazada y dio a luz un hijo. Entonces dijo:—Dios ha quitado mi desgracia.Le puso por nombre José,7 y dijo:—Quiera el Señor añadirme un hijo más.</w:t>
+        <w:t>23-24</w:t>
+      </w:r>
+      <w:r>
+        <w:rPr>
+          <w:lang w:val="es_ES" w:bidi="es_ES"/>
+        </w:rPr>
+        <w:t xml:space="preserve"> Ella quedó embarazada y dio a luz un hijo. Entonces dijo: —Dios ha quitado mi desgracia. Le puso por nombre José, y dijo: —Quiera el Señor añadirme un hijo más.</w:t>
       </w:r>
     </w:p>
     <w:p>
@@ -17016,7 +17016,7 @@
         <w:rPr>
           <w:lang w:val="es_ES" w:bidi="es_ES"/>
         </w:rPr>
-        <w:t xml:space="preserve"> Labán respondió:—No me dejes, te lo ruego. He sabido por oráculo que el Señor me ha bendecido gracias a ti.</w:t>
+        <w:t xml:space="preserve"> Labán respondió: —No me dejes, te lo ruego. He sabido por oráculo que el Señor me ha bendecido gracias a ti.</w:t>
       </w:r>
     </w:p>
     <w:p>
@@ -17094,13 +17094,13 @@
           <w:vertAlign w:val="superscript"/>
           <w:lang w:val="es_ES" w:bidi="es_ES"/>
         </w:rPr>
-        <w:t>32</w:t>
-      </w:r>
-      <w:r>
-        <w:rPr>
-          <w:lang w:val="es_ES" w:bidi="es_ES"/>
-        </w:rPr>
-        <w:t xml:space="preserve"> ―¿Qué salario quieres que te pague? —volvió a preguntarle Labán.Jacob respondió:―No me tienes que pagar nada. Si aceptas lo que te voy a proponer, seguiré cuidando tus rebaños. Hoy pasaré por todo tu rebaño y apartaré las ovejas manchadas, moteadas y negras, así como todas las cabras manchadas y moteadas. Ese será mi salario.</w:t>
+        <w:t>31-32</w:t>
+      </w:r>
+      <w:r>
+        <w:rPr>
+          <w:lang w:val="es_ES" w:bidi="es_ES"/>
+        </w:rPr>
+        <w:t xml:space="preserve"> —¿Qué salario quieres que te pague? —volvió a preguntarle Labán. Jacob respondió: —No me tienes que pagar nada. Si aceptas lo que te voy a proponer, seguiré cuidando tus rebaños. Hoy pasaré por todo tu rebaño y apartaré las ovejas manchadas, moteadas y negras, así como todas las cabras manchadas y moteadas. Ese será mi salario.</w:t>
       </w:r>
     </w:p>
     <w:p>
@@ -17142,22 +17142,22 @@
         <w:rPr>
           <w:lang w:val="es_ES" w:bidi="es_ES"/>
         </w:rPr>
-        <w:t xml:space="preserve"> ―De acuerdo —respondió Labán—. Trato hecho.</w:t>
-      </w:r>
-    </w:p>
-    <w:p>
-      <w:pPr/>
-      <w:r>
-        <w:rPr>
-          <w:lang w:val="es_ES" w:bidi="es_ES"/>
-        </w:rPr>
-      </w:r>
-      <w:r>
-        <w:rPr>
-          <w:vertAlign w:val="superscript"/>
-          <w:lang w:val="es_ES" w:bidi="es_ES"/>
-        </w:rPr>
-        <w:t>36</w:t>
+        <w:t xml:space="preserve"> —De acuerdo —respondió Labán—. Trato hecho.</w:t>
+      </w:r>
+    </w:p>
+    <w:p>
+      <w:pPr/>
+      <w:r>
+        <w:rPr>
+          <w:lang w:val="es_ES" w:bidi="es_ES"/>
+        </w:rPr>
+      </w:r>
+      <w:r>
+        <w:rPr>
+          <w:vertAlign w:val="superscript"/>
+          <w:lang w:val="es_ES" w:bidi="es_ES"/>
+        </w:rPr>
+        <w:t>35-36</w:t>
       </w:r>
       <w:r>
         <w:rPr>
@@ -17220,7 +17220,7 @@
           <w:vertAlign w:val="superscript"/>
           <w:lang w:val="es_ES" w:bidi="es_ES"/>
         </w:rPr>
-        <w:t>40</w:t>
+        <w:t>39-40</w:t>
       </w:r>
       <w:r>
         <w:rPr>
@@ -17368,7 +17368,7 @@
         <w:rPr>
           <w:lang w:val="es_ES" w:bidi="es_ES"/>
         </w:rPr>
-        <w:t xml:space="preserve"> Entonces el Señor le dijo a Jacob:—Vuelve a la tierra de tus padres, donde están tus parientes, que yo estaré contigo.</w:t>
+        <w:t xml:space="preserve"> Entonces el Señor le dijo a Jacob: —Vuelve a la tierra de tus padres, donde están tus parientes, que yo estaré contigo.</w:t>
       </w:r>
     </w:p>
     <w:p>
@@ -17410,7 +17410,7 @@
         <w:rPr>
           <w:lang w:val="es_ES" w:bidi="es_ES"/>
         </w:rPr>
-        <w:t xml:space="preserve"> ―He notado que su padre ya no me trata como antes, pero el Dios de mi padre siempre ha estado conmigo.</w:t>
+        <w:t xml:space="preserve"> —He notado que su padre ya no me trata como antes, pero el Dios de mi padre siempre ha estado conmigo.</w:t>
       </w:r>
     </w:p>
     <w:p>
@@ -17452,7 +17452,7 @@
         <w:rPr>
           <w:lang w:val="es_ES" w:bidi="es_ES"/>
         </w:rPr>
-        <w:t xml:space="preserve"> pero él me ha engañado y ha cambiado mi salario diez veces. Sin embargo, Dios no le ha permitido hacerme ningún daño.</w:t>
+        <w:t xml:space="preserve"> pero él me ha engañado y ha cambiado mi salario 10 veces. Sin embargo, Dios no le ha permitido hacerme ningún daño.</w:t>
       </w:r>
     </w:p>
     <w:p>
@@ -17473,7 +17473,7 @@
         <w:rPr>
           <w:lang w:val="es_ES" w:bidi="es_ES"/>
         </w:rPr>
-        <w:t xml:space="preserve"> Si me decía: "Tu salario serán los animales manchados", entonces todo el rebaño paría crías manchadas. Y si me decía: "Tu salario serán los animales rayados", entonces todas las crías nacían rayadas.</w:t>
+        <w:t xml:space="preserve"> Si me decía: “Tu salario serán los animales manchados”, entonces todo el rebaño paría crías manchadas. Y si me decía: “Tu salario serán los animales rayados”, entonces todas las crías nacían rayadas.</w:t>
       </w:r>
     </w:p>
     <w:p>
@@ -17536,28 +17536,28 @@
         <w:rPr>
           <w:lang w:val="es_ES" w:bidi="es_ES"/>
         </w:rPr>
-        <w:t xml:space="preserve"> En ese sueño, el ángel de Dios me dijo: "Jacob", y yo respondí: "Aquí estoy".</w:t>
-      </w:r>
-    </w:p>
-    <w:p>
-      <w:pPr/>
-      <w:r>
-        <w:rPr>
-          <w:lang w:val="es_ES" w:bidi="es_ES"/>
-        </w:rPr>
-      </w:r>
-      <w:r>
-        <w:rPr>
-          <w:vertAlign w:val="superscript"/>
-          <w:lang w:val="es_ES" w:bidi="es_ES"/>
-        </w:rPr>
-        <w:t>13</w:t>
-      </w:r>
-      <w:r>
-        <w:rPr>
-          <w:lang w:val="es_ES" w:bidi="es_ES"/>
-        </w:rPr>
-        <w:t xml:space="preserve"> Entonces él me dijo: "Levanta la vista y verás que los machos que cubren a las hembras son manchados, rayados o moteados. Yo estoy al tanto de lo que Labán te ha hecho. Yo soy el Dios de Betel, el lugar donde ungiste la piedra y me hiciste una promesa. Deja ahora este país y vete a la tierra donde naciste".</w:t>
+        <w:t xml:space="preserve"> En ese sueño, el ángel de Dios me dijo: “Jacob”, y yo respondí: “Aquí estoy”.</w:t>
+      </w:r>
+    </w:p>
+    <w:p>
+      <w:pPr/>
+      <w:r>
+        <w:rPr>
+          <w:lang w:val="es_ES" w:bidi="es_ES"/>
+        </w:rPr>
+      </w:r>
+      <w:r>
+        <w:rPr>
+          <w:vertAlign w:val="superscript"/>
+          <w:lang w:val="es_ES" w:bidi="es_ES"/>
+        </w:rPr>
+        <w:t>12-13</w:t>
+      </w:r>
+      <w:r>
+        <w:rPr>
+          <w:lang w:val="es_ES" w:bidi="es_ES"/>
+        </w:rPr>
+        <w:t xml:space="preserve"> Entonces él me dijo: “Levanta la vista y verás que los machos que cubren a las hembras son manchados, rayados o moteados. Yo estoy al tanto de lo que Labán te ha hecho. Yo soy el Dios de Betel, el lugar donde ungiste la piedra y me hiciste una promesa. Deja ahora este país y vete a la tierra donde naciste”.</w:t>
       </w:r>
     </w:p>
     <w:p>
@@ -17578,7 +17578,7 @@
         <w:rPr>
           <w:lang w:val="es_ES" w:bidi="es_ES"/>
         </w:rPr>
-        <w:t xml:space="preserve"> Raquel y Lea respondieron: ―Aquí ya no tenemos nada, ni parte ni herencia en la casa de nuestro padre.</w:t>
+        <w:t xml:space="preserve"> Raquel y Lea respondieron: —Aquí ya no tenemos nada, ni parte ni herencia en la casa de nuestro padre.</w:t>
       </w:r>
     </w:p>
     <w:p>
@@ -17635,7 +17635,7 @@
           <w:vertAlign w:val="superscript"/>
           <w:lang w:val="es_ES" w:bidi="es_ES"/>
         </w:rPr>
-        <w:t>20</w:t>
+        <w:t>17-20</w:t>
       </w:r>
       <w:r>
         <w:rPr>
@@ -17704,7 +17704,7 @@
         <w:rPr>
           <w:lang w:val="es_ES" w:bidi="es_ES"/>
         </w:rPr>
-        <w:t xml:space="preserve"> Entonces juntó a sus familiares y salió en su busca, hasta que los alcanzó siete días después en los montes de Galaad.</w:t>
+        <w:t xml:space="preserve"> Entonces juntó a sus familiares y salió en su busca, hasta que los alcanzó 7 días después en los montes de Galaad.</w:t>
       </w:r>
     </w:p>
     <w:p>
@@ -17767,7 +17767,7 @@
         <w:rPr>
           <w:lang w:val="es_ES" w:bidi="es_ES"/>
         </w:rPr>
-        <w:t xml:space="preserve"> y le dijo a Jacob: ―¿Por qué me hiciste esto? ¿Por qué me engañaste y has tratado a mis hijas como si fueran prisioneras de guerra?</w:t>
+        <w:t xml:space="preserve"> y le dijo a Jacob: —¿Por qué me hiciste esto? ¿Por qué me engañaste y has tratado a mis hijas como si fueran prisioneras de guerra?</w:t>
       </w:r>
     </w:p>
     <w:p>
@@ -17830,7 +17830,7 @@
         <w:rPr>
           <w:lang w:val="es_ES" w:bidi="es_ES"/>
         </w:rPr>
-        <w:t xml:space="preserve"> Ahora yo podría causarte daño, pero anoche se me apareció el Dios de tu padre y me dijo: "¡Mucho cuidado con lo que le dices a Jacob!".</w:t>
+        <w:t xml:space="preserve"> Ahora yo podría causarte daño, pero anoche se me apareció el Dios de tu padre y me dijo: "¡Mucho cuidado con lo que le dices a Jacob!”.</w:t>
       </w:r>
     </w:p>
     <w:p>
@@ -17914,7 +17914,7 @@
         <w:rPr>
           <w:lang w:val="es_ES" w:bidi="es_ES"/>
         </w:rPr>
-        <w:t xml:space="preserve"> Entonces Labán entró en la tienda de Jacob, luego en la de Lea, y después en las de las dos siervas, pero no encontró nada. Cuando salió de la tienda de Lea entró en la de Raquel.</w:t>
+        <w:t xml:space="preserve"> Entonces Labán entró en la tienda de Jacob, luego en la de Lea. Después entró en las de las 2 siervas, pero no encontró nada. Cuando salió de la tienda de Lea entró en la de Raquel.</w:t>
       </w:r>
     </w:p>
     <w:p>
@@ -18187,7 +18187,7 @@
         <w:rPr>
           <w:lang w:val="es_ES" w:bidi="es_ES"/>
         </w:rPr>
-        <w:t xml:space="preserve"> Entonces dijo a sus parientes: —Recojan piedras.Ellos recogieron piedras, las amontonaron, y comieron allí, junto al montón.</w:t>
+        <w:t xml:space="preserve"> Entonces dijo a sus parientes: —Recojan piedras. Ellos recogieron piedras, las amontonaron, y comieron allí, junto al montón.</w:t>
       </w:r>
     </w:p>
     <w:p>
@@ -18208,7 +18208,7 @@
         <w:rPr>
           <w:lang w:val="es_ES" w:bidi="es_ES"/>
         </w:rPr>
-        <w:t xml:space="preserve"> A ese montón de piedras Labán le puso el nombre de Yegar Saduta, y Jacob lo llamó Galaad.Yegar Saduta ... Galaad: Yegar Saduta en arameo y Galaad en hebreo. Se traducen como montículo del testimonio." class="footnote-marker"&gt;1</w:t>
+        <w:t xml:space="preserve"> A ese montón de piedras Labán le puso el nombre de Yegar Saduta, y Jacob lo llamó Galaad.</w:t>
       </w:r>
     </w:p>
     <w:p>
@@ -18286,7 +18286,7 @@
           <w:vertAlign w:val="superscript"/>
           <w:lang w:val="es_ES" w:bidi="es_ES"/>
         </w:rPr>
-        <w:t>52</w:t>
+        <w:t>51-52</w:t>
       </w:r>
       <w:r>
         <w:rPr>
@@ -18413,7 +18413,7 @@
         <w:rPr>
           <w:lang w:val="es_ES" w:bidi="es_ES"/>
         </w:rPr>
-        <w:t xml:space="preserve"> Entonces exclamó: «¡Este es el campamento de Dios!». Así que llamó a ese lugar Majanayin.Majanayin: En hebreo, Majanayin quiere decir dos campamentos." class="footnote-marker"&gt;1</w:t>
+        <w:t xml:space="preserve"> Entonces exclamó: —¡Este es el campamento de Dios! Así que llamó a ese lugar Majanayin.</w:t>
       </w:r>
     </w:p>
     <w:p>
@@ -18455,7 +18455,7 @@
         <w:rPr>
           <w:lang w:val="es_ES" w:bidi="es_ES"/>
         </w:rPr>
-        <w:t xml:space="preserve"> con este encargo:—Díganle a mi señor Esaú que su siervo Jacob dice: "He estado viviendo con Labán hasta hace poco.</w:t>
+        <w:t xml:space="preserve"> con este encargo: —Díganle a mi señor Esaú que su siervo Jacob dice: “He estado viviendo con Labán hasta hace poco.</w:t>
       </w:r>
     </w:p>
     <w:p>
@@ -18476,7 +18476,7 @@
         <w:rPr>
           <w:lang w:val="es_ES" w:bidi="es_ES"/>
         </w:rPr>
-        <w:t xml:space="preserve"> Tengo bueyes, burros, ovejas, siervos y siervas. Envío este mensaje a mi señor con la esperanza de ganarme su favor".</w:t>
+        <w:t xml:space="preserve"> Tengo bueyes, burros, ovejas, siervos y siervas. Envío este mensaje a mi señor con la esperanza de ganarme su favor”.</w:t>
       </w:r>
     </w:p>
     <w:p>
@@ -18539,7 +18539,7 @@
         <w:rPr>
           <w:lang w:val="es_ES" w:bidi="es_ES"/>
         </w:rPr>
-        <w:t xml:space="preserve"> Lo hizo porque pensó: «Si Esaú ataca a un grupo, al menos el otro podrá escapar».</w:t>
+        <w:t xml:space="preserve"> Lo hizo porque pensó: “Si Esaú ataca a un grupo, al menos el otro podrá escapar”.</w:t>
       </w:r>
     </w:p>
     <w:p>
@@ -18560,7 +18560,7 @@
         <w:rPr>
           <w:lang w:val="es_ES" w:bidi="es_ES"/>
         </w:rPr>
-        <w:t xml:space="preserve"> Entonces Jacob oró:—Señor, Dios de mi abuelo Abraham y de mi padre Isaac, tú me dijiste que regresara a la tierra donde nací. Me dijiste que estarías conmigo y que me iría bien.</w:t>
+        <w:t xml:space="preserve"> Entonces Jacob oró: —Señor, Dios de mi abuelo Abraham y de mi padre Isaac, tú me dijiste que regresara a la tierra donde nací. Me dijiste que estarías conmigo y que me iría bien.</w:t>
       </w:r>
     </w:p>
     <w:p>
@@ -18581,7 +18581,7 @@
         <w:rPr>
           <w:lang w:val="es_ES" w:bidi="es_ES"/>
         </w:rPr>
-        <w:t xml:space="preserve"> No soy digno de toda la bondad y toda la fidelidad que me has mostrado. Cuando crucé este río Jordán, no tenía más que mi bastón, y ahora puedo formar dos campamentos.</w:t>
+        <w:t xml:space="preserve"> No soy digno de toda la bondad y toda la fidelidad que me has mostrado. Cuando crucé este río Jordán, no tenía más que mi bastón, y ahora puedo formar 2 campamentos.</w:t>
       </w:r>
     </w:p>
     <w:p>
@@ -18638,13 +18638,13 @@
           <w:vertAlign w:val="superscript"/>
           <w:lang w:val="es_ES" w:bidi="es_ES"/>
         </w:rPr>
-        <w:t>15</w:t>
-      </w:r>
-      <w:r>
-        <w:rPr>
-          <w:lang w:val="es_ES" w:bidi="es_ES"/>
-        </w:rPr>
-        <w:t xml:space="preserve"> Jacob pasó allí la noche y preparó presentes para su hermano Esaú: 200 cabras, 20 chivos, 200 ovejas, 20 carneros, 30 camellas con sus crías, 40 vacas, 10 toros, 20 burras y 10 burros.doscientas cabras, veinte chivos, doscientas ovejas, veinte carneros, treinta camellas con sus crías, cuarenta vacas, diez toros, veinte burras y diez burros.</w:t>
+        <w:t>13-15</w:t>
+      </w:r>
+      <w:r>
+        <w:rPr>
+          <w:lang w:val="es_ES" w:bidi="es_ES"/>
+        </w:rPr>
+        <w:t xml:space="preserve"> Jacob pasó allí la noche y preparó presentes para su hermano Esaú: 200 cabras, 20 chivos, 200 ovejas, 20 carneros, 30 camellas con sus crías, 40 vacas, 10 toros, 20 burras y 10 burros.</w:t>
       </w:r>
     </w:p>
     <w:p>
@@ -18686,7 +18686,7 @@
         <w:rPr>
           <w:lang w:val="es_ES" w:bidi="es_ES"/>
         </w:rPr>
-        <w:t xml:space="preserve"> Al que llevaba el primer grupo le ordenó:—Cuando te encuentres con mi hermano Esaú y él te pregunte: "¿Quién eres? ¿A dónde vas? ¿De quién son estos animales?",</w:t>
+        <w:t xml:space="preserve"> Al que llevaba el primer grupo le ordenó: —Cuando te encuentres con mi hermano Esaú y él te pregunte: "¿Quién eres? ¿A dónde vas? ¿De quién son estos animales?”,</w:t>
       </w:r>
     </w:p>
     <w:p>
@@ -18707,7 +18707,7 @@
         <w:rPr>
           <w:lang w:val="es_ES" w:bidi="es_ES"/>
         </w:rPr>
-        <w:t xml:space="preserve"> tú le responderás: "Esto es un regalo que envía mi señor Jacob a mi señor Esaú. Además, él también viene detrás de nosotros".</w:t>
+        <w:t xml:space="preserve"> tú le responderás: “Esto es un regalo que envía mi señor Jacob a mi señor Esaú. Además, él también viene detrás de nosotros”.</w:t>
       </w:r>
     </w:p>
     <w:p>
@@ -18728,7 +18728,7 @@
         <w:rPr>
           <w:lang w:val="es_ES" w:bidi="es_ES"/>
         </w:rPr>
-        <w:t xml:space="preserve"> Jacob dio las mismas instrucciones al segundo grupo, al tercero y a todos los demás que iban detrás de los rebaños. Les dijo:—Cuando encuentren a Esaú, les dirán todo esto</w:t>
+        <w:t xml:space="preserve"> Jacob dio las mismas instrucciones al segundo grupo, al tercero y a todos los demás que iban detrás de los rebaños. Les dijo: —Cuando encuentren a Esaú, les dirán todo esto</w:t>
       </w:r>
     </w:p>
     <w:p>
@@ -18749,7 +18749,7 @@
         <w:rPr>
           <w:lang w:val="es_ES" w:bidi="es_ES"/>
         </w:rPr>
-        <w:t xml:space="preserve"> y añadirán: "Su siervo Jacob viene detrás de nosotros". Jacob pensaba: «Primero apaciguaré su ira con el regalo que le envío por delante y luego me presentaré yo; quizá así me reciba bien».</w:t>
+        <w:t xml:space="preserve"> y añadirán: “Su siervo Jacob viene detrás de nosotros”. Jacob pensaba: “Primero apaciguaré su ira con el regalo que le envío por delante y luego me presentaré yo; quizá así me reciba bien”.</w:t>
       </w:r>
     </w:p>
     <w:p>
@@ -18785,7 +18785,7 @@
           <w:vertAlign w:val="superscript"/>
           <w:lang w:val="es_ES" w:bidi="es_ES"/>
         </w:rPr>
-        <w:t>24</w:t>
+        <w:t>22-24</w:t>
       </w:r>
       <w:r>
         <w:rPr>
@@ -18833,7 +18833,7 @@
         <w:rPr>
           <w:lang w:val="es_ES" w:bidi="es_ES"/>
         </w:rPr>
-        <w:t xml:space="preserve"> Entonces le dijo: —Déjame ir, porque está a punto de amanecer.Pero Jacob respondió: —No te soltaré hasta que me bendigas.</w:t>
+        <w:t xml:space="preserve"> Entonces le dijo: —Déjame ir, porque está a punto de amanecer. Pero Jacob respondió: —No te soltaré hasta que me bendigas.</w:t>
       </w:r>
     </w:p>
     <w:p>
@@ -18854,7 +18854,7 @@
         <w:rPr>
           <w:lang w:val="es_ES" w:bidi="es_ES"/>
         </w:rPr>
-        <w:t xml:space="preserve"> —¿Cómo te llamas? —le preguntó aquel hombre.—Jacob —respondió él.</w:t>
+        <w:t xml:space="preserve"> —¿Cómo te llamas? —le preguntó aquel hombre. —Jacob —respondió él.</w:t>
       </w:r>
     </w:p>
     <w:p>
@@ -18875,7 +18875,7 @@
         <w:rPr>
           <w:lang w:val="es_ES" w:bidi="es_ES"/>
         </w:rPr>
-        <w:t xml:space="preserve"> Entonces le dijo: —Ya no te llamarás Jacob; desde ahora te llamarás Israel,Israel: En hebreo, Israel quiere decir él lucha con Dios." class="footnote-marker"&gt;2 porque has luchado con Dios y con los hombres y has vencido.</w:t>
+        <w:t xml:space="preserve"> Entonces le dijo: —Ya no te llamarás Jacob; desde ahora te llamarás Israel, porque has luchado con Dios y con los hombres y has vencido.</w:t>
       </w:r>
     </w:p>
     <w:p>
@@ -18896,7 +18896,7 @@
         <w:rPr>
           <w:lang w:val="es_ES" w:bidi="es_ES"/>
         </w:rPr>
-        <w:t xml:space="preserve"> Jacob le preguntó: —¿Cómo te llamas tú?Él respondió: —¿Por qué preguntas cómo me llamo?Y allí mismo bendijo a Jacob.</w:t>
+        <w:t xml:space="preserve"> Jacob le preguntó: —¿Cómo te llamas tú? Él respondió: —¿Por qué preguntas cómo me llamo? Y allí mismo bendijo a Jacob.</w:t>
       </w:r>
     </w:p>
     <w:p>
@@ -18917,7 +18917,7 @@
         <w:rPr>
           <w:lang w:val="es_ES" w:bidi="es_ES"/>
         </w:rPr>
-        <w:t xml:space="preserve"> A ese lugar Jacob le llamó Peniel,Peniel: En hebreo, Peniel quiere decir cara de Dios." class="footnote-marker"&gt;3 porque dijo: «Vi a Dios cara a cara, y sigo con vida».</w:t>
+        <w:t xml:space="preserve"> A ese lugar Jacob le llamó Peniel, porque dijo: “Vi a Dios cara a cara, y sigo con vida”.</w:t>
       </w:r>
     </w:p>
     <w:p>
@@ -18996,7 +18996,7 @@
         <w:rPr>
           <w:lang w:val="es_ES" w:bidi="es_ES"/>
         </w:rPr>
-        <w:t xml:space="preserve"> Jacob levantó la vista y vio que Esaú venía con cuatrocientos hombres. Entonces repartió a sus hijos entre Lea, Raquel y las dos siervas.</w:t>
+        <w:t xml:space="preserve"> Jacob levantó la vista y vio que Esaú venía con 400 hombres. Entonces repartió a sus hijos entre Lea, Raquel y las 2 siervas.</w:t>
       </w:r>
     </w:p>
     <w:p>
@@ -19017,7 +19017,7 @@
         <w:rPr>
           <w:lang w:val="es_ES" w:bidi="es_ES"/>
         </w:rPr>
-        <w:t xml:space="preserve"> Puso delante a las dos siervas con sus hijos, luego a Lea con sus hijos, y por último a Raquel con su hijo José.</w:t>
+        <w:t xml:space="preserve"> Puso delante a las 2 siervas con sus hijos, luego a Lea con sus hijos, y por último a Raquel con su hijo José.</w:t>
       </w:r>
     </w:p>
     <w:p>
@@ -19038,7 +19038,7 @@
         <w:rPr>
           <w:lang w:val="es_ES" w:bidi="es_ES"/>
         </w:rPr>
-        <w:t xml:space="preserve"> Jacob se adelantó a ellos y se postró siete veces en tierra a medida que se iba acercando a su hermano.</w:t>
+        <w:t xml:space="preserve"> Jacob se adelantó a ellos y se postró 7 veces en tierra a medida que se iba acercando a su hermano.</w:t>
       </w:r>
     </w:p>
     <w:p>
@@ -19227,7 +19227,7 @@
         <w:rPr>
           <w:lang w:val="es_ES" w:bidi="es_ES"/>
         </w:rPr>
-        <w:t xml:space="preserve"> Luego Esaú dijo:—Vamos, sigamos nuestro viaje, yo iré contigo.</w:t>
+        <w:t xml:space="preserve"> Luego Esaú dijo: —Vamos, sigamos nuestro viaje, yo iré contigo.</w:t>
       </w:r>
     </w:p>
     <w:p>
@@ -19290,7 +19290,7 @@
         <w:rPr>
           <w:lang w:val="es_ES" w:bidi="es_ES"/>
         </w:rPr>
-        <w:t xml:space="preserve"> ―Está bien, pero deja que te ceda ahora algunos de mis hombres —dijo Esaú. —No te molestes —contestó Jacob—. Estoy más que satisfecho con haber sido bien recibido por ti.</w:t>
+        <w:t xml:space="preserve"> —Está bien, pero deja que te ceda ahora algunos de mis hombres —dijo Esaú. —No te molestes —contestó Jacob—. Estoy más que satisfecho con haber sido bien recibido por ti.</w:t>
       </w:r>
     </w:p>
     <w:p>
@@ -19332,7 +19332,7 @@
         <w:rPr>
           <w:lang w:val="es_ES" w:bidi="es_ES"/>
         </w:rPr>
-        <w:t xml:space="preserve"> Por su parte, Jacob se fue a Sucot. Allí se hizo una casa para él y cabañas para su ganado. Por eso el lugar se llama Sucot.Sucot: En hebreo, Sucot quiere decircabañas, cobertizos oenramadas." class="footnote-marker"&gt;1</w:t>
+        <w:t xml:space="preserve"> Por su parte, Jacob se fue a Sucot. Allí se hizo una casa para él y cabañas para su ganado. Por eso el lugar se llama Sucot.</w:t>
       </w:r>
     </w:p>
     <w:p>
@@ -19374,7 +19374,7 @@
         <w:rPr>
           <w:lang w:val="es_ES" w:bidi="es_ES"/>
         </w:rPr>
-        <w:t xml:space="preserve"> A los hijos de Jamor, padre de Siquén, les compró el terreno donde había acampado. Pagó cien piezas de plata por él.</w:t>
+        <w:t xml:space="preserve"> A los hijos de Jamor, padre de Siquén, les compró el terreno donde había acampado. Pagó 100 piezas de plata por él.</w:t>
       </w:r>
     </w:p>
     <w:p>
@@ -19395,7 +19395,7 @@
         <w:rPr>
           <w:lang w:val="es_ES" w:bidi="es_ES"/>
         </w:rPr>
-        <w:t xml:space="preserve"> Allí edificó un altar y lo llamó El Elohé Israel.El Elohé Israel: En hebreo, El Elohé Israel puede significar Dios, el Dios de Israel o poderoso es el Dios de Israel." class="footnote-marker"&gt;2</w:t>
+        <w:t xml:space="preserve"> Allí edificó un altar y lo llamó El Elohé Israel.</w:t>
       </w:r>
     </w:p>
     <w:p>
@@ -19495,7 +19495,7 @@
         <w:rPr>
           <w:lang w:val="es_ES" w:bidi="es_ES"/>
         </w:rPr>
-        <w:t xml:space="preserve"> Por eso le dijo a su padre:—Consígueme a esa muchacha para que sea mi esposa.</w:t>
+        <w:t xml:space="preserve"> Por eso le dijo a su padre: —Consígueme a esa muchacha para que sea mi esposa.</w:t>
       </w:r>
     </w:p>
     <w:p>
@@ -19531,7 +19531,7 @@
           <w:vertAlign w:val="superscript"/>
           <w:lang w:val="es_ES" w:bidi="es_ES"/>
         </w:rPr>
-        <w:t>7</w:t>
+        <w:t>6-7</w:t>
       </w:r>
       <w:r>
         <w:rPr>
@@ -19573,7 +19573,7 @@
           <w:vertAlign w:val="superscript"/>
           <w:lang w:val="es_ES" w:bidi="es_ES"/>
         </w:rPr>
-        <w:t>10</w:t>
+        <w:t>9-10</w:t>
       </w:r>
       <w:r>
         <w:rPr>
@@ -19663,22 +19663,22 @@
         <w:rPr>
           <w:lang w:val="es_ES" w:bidi="es_ES"/>
         </w:rPr>
-        <w:t xml:space="preserve"> ―Nosotros no podemos entregarle nuestra hermana a un hombre que no está circuncidado. Eso sería una deshonra para nosotros.</w:t>
-      </w:r>
-    </w:p>
-    <w:p>
-      <w:pPr/>
-      <w:r>
-        <w:rPr>
-          <w:lang w:val="es_ES" w:bidi="es_ES"/>
-        </w:rPr>
-      </w:r>
-      <w:r>
-        <w:rPr>
-          <w:vertAlign w:val="superscript"/>
-          <w:lang w:val="es_ES" w:bidi="es_ES"/>
-        </w:rPr>
-        <w:t>16</w:t>
+        <w:t xml:space="preserve"> —Nosotros no podemos entregarle nuestra hermana a un hombre que no está circuncidado. Eso sería una deshonra para nosotros.</w:t>
+      </w:r>
+    </w:p>
+    <w:p>
+      <w:pPr/>
+      <w:r>
+        <w:rPr>
+          <w:lang w:val="es_ES" w:bidi="es_ES"/>
+        </w:rPr>
+      </w:r>
+      <w:r>
+        <w:rPr>
+          <w:vertAlign w:val="superscript"/>
+          <w:lang w:val="es_ES" w:bidi="es_ES"/>
+        </w:rPr>
+        <w:t>15-16</w:t>
       </w:r>
       <w:r>
         <w:rPr>
@@ -19720,7 +19720,7 @@
           <w:vertAlign w:val="superscript"/>
           <w:lang w:val="es_ES" w:bidi="es_ES"/>
         </w:rPr>
-        <w:t>19</w:t>
+        <w:t>18-19</w:t>
       </w:r>
       <w:r>
         <w:rPr>
@@ -19783,7 +19783,7 @@
           <w:vertAlign w:val="superscript"/>
           <w:lang w:val="es_ES" w:bidi="es_ES"/>
         </w:rPr>
-        <w:t>23</w:t>
+        <w:t>22-23</w:t>
       </w:r>
       <w:r>
         <w:rPr>
@@ -19825,7 +19825,7 @@
           <w:vertAlign w:val="superscript"/>
           <w:lang w:val="es_ES" w:bidi="es_ES"/>
         </w:rPr>
-        <w:t>26</w:t>
+        <w:t>25-26</w:t>
       </w:r>
       <w:r>
         <w:rPr>
@@ -19973,7 +19973,7 @@
         <w:rPr>
           <w:lang w:val="es_ES" w:bidi="es_ES"/>
         </w:rPr>
-        <w:t xml:space="preserve"> Dios le dijo a Jacob:—Ve a Betel y quédate a vivir allí. Levantarás un altar al Dios que se te apareció cuando huías de tu hermano Esaú.</w:t>
+        <w:t xml:space="preserve"> Dios le dijo a Jacob: —Ve a Betel y quédate a vivir allí. Levantarás un altar al Dios que se te apareció cuando huías de tu hermano Esaú.</w:t>
       </w:r>
     </w:p>
     <w:p>
@@ -19994,7 +19994,7 @@
         <w:rPr>
           <w:lang w:val="es_ES" w:bidi="es_ES"/>
         </w:rPr>
-        <w:t xml:space="preserve"> Entonces Jacob dijo a su familia y a todos los que lo acompañaban:—Desháganse de todos los dioses extranjeros que haya entre ustedes, purifíquense y cámbiense de ropa.</w:t>
+        <w:t xml:space="preserve"> Entonces Jacob dijo a su familia y a todos los que lo acompañaban: —Desháganse de todos los dioses extranjeros que haya entre ustedes, purifíquense y cámbiense de ropa.</w:t>
       </w:r>
     </w:p>
     <w:p>
@@ -20099,7 +20099,7 @@
         <w:rPr>
           <w:lang w:val="es_ES" w:bidi="es_ES"/>
         </w:rPr>
-        <w:t xml:space="preserve"> Jacob levantó allí un altar y llamó al lugar El Betel,Betel: En hebreo, El Betel quiere decir Dios de Betel." class="footnote-marker"&gt;1 porque allí se le reveló Dios cuando huía de su hermano.</w:t>
+        <w:t xml:space="preserve"> Jacob levantó allí un altar y llamó al lugar El Betel, porque allí se le reveló Dios cuando huía de su hermano.</w:t>
       </w:r>
     </w:p>
     <w:p>
@@ -20120,7 +20120,7 @@
         <w:rPr>
           <w:lang w:val="es_ES" w:bidi="es_ES"/>
         </w:rPr>
-        <w:t xml:space="preserve"> Por esos días murió Débora, la nodriza de Rebeca, y fue sepultada cerca de Betel, bajo una encina. Por eso Jacob llamó a ese lugar Elón Bacut.Elón Bacut: En hebreo, Elón Bacut quiere decir roble del llanto." class="footnote-marker"&gt;2</w:t>
+        <w:t xml:space="preserve"> Por esos días murió Débora, la nodriza de Rebeca, y fue sepultada cerca de Betel, bajo una encina. Por eso Jacob llamó a ese lugar Elón Bacut.</w:t>
       </w:r>
     </w:p>
     <w:p>
@@ -20162,7 +20162,7 @@
         <w:rPr>
           <w:lang w:val="es_ES" w:bidi="es_ES"/>
         </w:rPr>
-        <w:t xml:space="preserve"> con estas palabras:—Tu nombre es Jacob, pero a partir de ahora ya no te llamarás así, sino Israel. Y, efectivamente, Dios lo llamó Israel.</w:t>
+        <w:t xml:space="preserve"> con estas palabras: —Tu nombre es Jacob, pero a partir de ahora ya no te llamarás así, sino Israel. Y, efectivamente, Dios lo llamó Israel.</w:t>
       </w:r>
     </w:p>
     <w:p>
@@ -20183,7 +20183,7 @@
         <w:rPr>
           <w:lang w:val="es_ES" w:bidi="es_ES"/>
         </w:rPr>
-        <w:t xml:space="preserve"> Luego Dios le dijo:—Yo soy el Dios Todopoderoso. Sé fructífero y multiplícate. De ti saldrá un pueblo, muchas naciones. Entre tus descendientes habrá reyes.</w:t>
+        <w:t xml:space="preserve"> Luego Dios le dijo: —Yo soy el Dios Todopoderoso. Sé fructífero y multiplícate. De ti saldrá un pueblo, muchas naciones. Entre tus descendientes habrá reyes.</w:t>
       </w:r>
     </w:p>
     <w:p>
@@ -20246,7 +20246,7 @@
         <w:rPr>
           <w:lang w:val="es_ES" w:bidi="es_ES"/>
         </w:rPr>
-        <w:t xml:space="preserve"> Entonces Jacob levantó una piedra como monumento en el lugar donde Dios le había hablado. Derramó sobre ella un ofrenda líquida y la ungió con aceite.</w:t>
+        <w:t xml:space="preserve"> Entonces Jacob levantó una piedra como monumento en el lugar donde Dios le había hablado. Derramó sobre ella una ofrenda líquida y la ungió con aceite.</w:t>
       </w:r>
     </w:p>
     <w:p>
@@ -20309,7 +20309,7 @@
         <w:rPr>
           <w:lang w:val="es_ES" w:bidi="es_ES"/>
         </w:rPr>
-        <w:t xml:space="preserve"> Durante el parto, la partera le dijo:—No temas, vas a tener otro niño.</w:t>
+        <w:t xml:space="preserve"> Durante el parto, la partera le dijo: —No temas, vas a tener otro niño.</w:t>
       </w:r>
     </w:p>
     <w:p>
@@ -20330,7 +20330,7 @@
         <w:rPr>
           <w:lang w:val="es_ES" w:bidi="es_ES"/>
         </w:rPr>
-        <w:t xml:space="preserve"> Pero Raquel se estaba muriendo. En su último aliento logró decir que su hijo se llamaría Benoní.Benoní: En hebreo, Benoní quiere decir hijo de mi tristeza." class="footnote-marker"&gt;3 Pero Jacob lo llamó Benjamín.Benjamín: En hebreo, Benjamín significa hijo de mi mano derecha." class="footnote-marker"&gt;4</w:t>
+        <w:t xml:space="preserve"> Pero Raquel se estaba muriendo. En su último aliento logró decir que su hijo se llamaría Benoní. Pero Jacob lo llamó Benjamín.</w:t>
       </w:r>
     </w:p>
     <w:p>
@@ -20414,7 +20414,7 @@
         <w:rPr>
           <w:lang w:val="es_ES" w:bidi="es_ES"/>
         </w:rPr>
-        <w:t xml:space="preserve"> Mientras Israel estaba allí, Rubén fue y se acostó con Bilhá, la concubina de su padre. Este se enteró de lo sucedido. Jacob tuvo doce hijos.</w:t>
+        <w:t xml:space="preserve"> Mientras Israel estaba allí, Rubén fue y se acostó con Bilhá, la concubina de su padre. Este se enteró de lo sucedido. Jacob tuvo 12 hijos.</w:t>
       </w:r>
     </w:p>
     <w:p>
@@ -20534,7 +20534,7 @@
           <w:vertAlign w:val="superscript"/>
           <w:lang w:val="es_ES" w:bidi="es_ES"/>
         </w:rPr>
-        <w:t>29</w:t>
+        <w:t>28-29</w:t>
       </w:r>
       <w:r>
         <w:rPr>
@@ -20592,13 +20592,13 @@
           <w:vertAlign w:val="superscript"/>
           <w:lang w:val="es_ES" w:bidi="es_ES"/>
         </w:rPr>
-        <w:t>3</w:t>
-      </w:r>
-      <w:r>
-        <w:rPr>
-          <w:lang w:val="es_ES" w:bidi="es_ES"/>
-        </w:rPr>
-        <w:t xml:space="preserve"> Se casó Esaú con mujeres cananesas: con Ada, hija de Elón, el hitita; con Aholibama, hija de Aná y nieta de Zibeón, el heveo; y con Basemat, hija de Ismael y hermana de Nebayot.</w:t>
+        <w:t>2-3</w:t>
+      </w:r>
+      <w:r>
+        <w:rPr>
+          <w:lang w:val="es_ES" w:bidi="es_ES"/>
+        </w:rPr>
+        <w:t xml:space="preserve"> Se casó Esaú con mujeres cananeas: con Ada, hija de Elón, el hitita; con Aholibama, hija de Aná y nieta de Zibeón, el heveo; y con Basemat, hija de Ismael y hermana de Nebayot.</w:t>
       </w:r>
     </w:p>
     <w:p>
@@ -20655,7 +20655,7 @@
           <w:vertAlign w:val="superscript"/>
           <w:lang w:val="es_ES" w:bidi="es_ES"/>
         </w:rPr>
-        <w:t>8</w:t>
+        <w:t>6-8</w:t>
       </w:r>
       <w:r>
         <w:rPr>
@@ -20697,7 +20697,7 @@
           <w:vertAlign w:val="superscript"/>
           <w:lang w:val="es_ES" w:bidi="es_ES"/>
         </w:rPr>
-        <w:t>12</w:t>
+        <w:t>10-12</w:t>
       </w:r>
       <w:r>
         <w:rPr>
@@ -20760,7 +20760,7 @@
           <w:vertAlign w:val="superscript"/>
           <w:lang w:val="es_ES" w:bidi="es_ES"/>
         </w:rPr>
-        <w:t>16</w:t>
+        <w:t>15-16</w:t>
       </w:r>
       <w:r>
         <w:rPr>
@@ -20844,7 +20844,7 @@
           <w:vertAlign w:val="superscript"/>
           <w:lang w:val="es_ES" w:bidi="es_ES"/>
         </w:rPr>
-        <w:t>21</w:t>
+        <w:t>20-21</w:t>
       </w:r>
       <w:r>
         <w:rPr>
@@ -21012,7 +21012,7 @@
           <w:vertAlign w:val="superscript"/>
           <w:lang w:val="es_ES" w:bidi="es_ES"/>
         </w:rPr>
-        <w:t>30</w:t>
+        <w:t>29-30</w:t>
       </w:r>
       <w:r>
         <w:rPr>
@@ -21033,7 +21033,7 @@
           <w:vertAlign w:val="superscript"/>
           <w:lang w:val="es_ES" w:bidi="es_ES"/>
         </w:rPr>
-        <w:t>39</w:t>
+        <w:t>31-39</w:t>
       </w:r>
       <w:r>
         <w:rPr>
@@ -21054,7 +21054,7 @@
           <w:vertAlign w:val="superscript"/>
           <w:lang w:val="es_ES" w:bidi="es_ES"/>
         </w:rPr>
-        <w:t>43</w:t>
+        <w:t>40-43</w:t>
       </w:r>
       <w:r>
         <w:rPr>
@@ -21118,7 +21118,7 @@
         <w:rPr>
           <w:lang w:val="es_ES" w:bidi="es_ES"/>
         </w:rPr>
-        <w:t xml:space="preserve"> Esta es la historia de Jacob y su familia.Cuando tenía 17 años, José apacentaba el rebaño con sus hermanos, los hijos de Bilhá y de Zilpá, las concubinas de su padre. José le contaba a su padre sobre la mala conducta de sus hermanos.</w:t>
+        <w:t xml:space="preserve"> Esta es la historia de Jacob y su familia. Cuando tenía 17 años, José apacentaba el rebaño con sus hermanos, los hijos de Bilhá y de Zilpá, las concubinas de su padre. José le contaba a su padre sobre la mala conducta de sus hermanos.</w:t>
       </w:r>
     </w:p>
     <w:p>
@@ -21244,7 +21244,7 @@
         <w:rPr>
           <w:lang w:val="es_ES" w:bidi="es_ES"/>
         </w:rPr>
-        <w:t xml:space="preserve"> Sus hermanos le respondieron:—¿Qué te crees, que vas a reinar sobre nosotros? Y lo odiaron aún más por los sueños que contaba.</w:t>
+        <w:t xml:space="preserve"> Sus hermanos le respondieron: —¿Qué te crees, que vas a reinar sobre nosotros? Y lo odiaron aún más por los sueños que contaba.</w:t>
       </w:r>
     </w:p>
     <w:p>
@@ -21265,7 +21265,7 @@
         <w:rPr>
           <w:lang w:val="es_ES" w:bidi="es_ES"/>
         </w:rPr>
-        <w:t xml:space="preserve"> Luego tuvo otro sueño y también se lo contó a sus hermanos: —He tenido otro sueño. Soñé que el sol, la luna y once estrellas se inclinaban ante mí.</w:t>
+        <w:t xml:space="preserve"> Luego tuvo otro sueño y también se lo contó a sus hermanos: —He tenido otro sueño. Soñé que el sol, la luna y 11 estrellas se inclinaban ante mí.</w:t>
       </w:r>
     </w:p>
     <w:p>
@@ -21343,13 +21343,13 @@
           <w:vertAlign w:val="superscript"/>
           <w:lang w:val="es_ES" w:bidi="es_ES"/>
         </w:rPr>
-        <w:t>14</w:t>
-      </w:r>
-      <w:r>
-        <w:rPr>
-          <w:lang w:val="es_ES" w:bidi="es_ES"/>
-        </w:rPr>
-        <w:t xml:space="preserve"> Entonces Israel llamó a José y le dijo: —Tus hermanos están apacentando en Siquén. Quiero que vayas a verlos.José respondió:—Sí, iré.Su padre continuó:—Ve a ver cómo están tus hermanos y el rebaño y tráeme noticias.Así que lo envió desde el valle de Hebrón y José fue a Siquén.</w:t>
+        <w:t>13-14</w:t>
+      </w:r>
+      <w:r>
+        <w:rPr>
+          <w:lang w:val="es_ES" w:bidi="es_ES"/>
+        </w:rPr>
+        <w:t xml:space="preserve"> Entonces Israel llamó a José y le dijo: —Tus hermanos están apacentando en Siquén. Quiero que vayas a verlos. José respondió: —Sí, iré. Su padre continuó: —Ve a ver cómo están tus hermanos y el rebaño y tráeme noticias. Así que lo envió desde el valle de Hebrón y José fue a Siquén.</w:t>
       </w:r>
     </w:p>
     <w:p>
@@ -21412,7 +21412,7 @@
         <w:rPr>
           <w:lang w:val="es_ES" w:bidi="es_ES"/>
         </w:rPr>
-        <w:t xml:space="preserve"> El hombre respondió: —Ya se han ido de aquí. Los oí decir que se iban a Dotán.Entonces José fue en busca de sus hermanos y los encontró en Dotán.</w:t>
+        <w:t xml:space="preserve"> El hombre respondió: —Ya se han ido de aquí. Los oí decir que se iban a Dotán. Entonces José fue en busca de sus hermanos y los encontró en Dotán.</w:t>
       </w:r>
     </w:p>
     <w:p>
@@ -21448,7 +21448,7 @@
           <w:vertAlign w:val="superscript"/>
           <w:lang w:val="es_ES" w:bidi="es_ES"/>
         </w:rPr>
-        <w:t>20</w:t>
+        <w:t>19-20</w:t>
       </w:r>
       <w:r>
         <w:rPr>
@@ -21469,13 +21469,13 @@
           <w:vertAlign w:val="superscript"/>
           <w:lang w:val="es_ES" w:bidi="es_ES"/>
         </w:rPr>
-        <w:t>22</w:t>
-      </w:r>
-      <w:r>
-        <w:rPr>
-          <w:lang w:val="es_ES" w:bidi="es_ES"/>
-        </w:rPr>
-        <w:t xml:space="preserve"> Cuando Rubén escuchó esto, intentó librarlo de las manos de sus hermanos. Dijo: —No lo matemos. No derramen sangre. Arrójenlo vivo a esta cisterna en el desierto, pero no le pongan la mano encima.Lo que Rubén quería era rescatarlo y llevarlo de vuelta con su padre.</w:t>
+        <w:t>21-22</w:t>
+      </w:r>
+      <w:r>
+        <w:rPr>
+          <w:lang w:val="es_ES" w:bidi="es_ES"/>
+        </w:rPr>
+        <w:t xml:space="preserve"> Cuando Rubén escuchó esto, intentó librarlo de las manos de sus hermanos. Dijo: —No lo matemos. No derramen sangre. Arrójenlo vivo a esta cisterna en el desierto, pero no le pongan la mano encima. Lo que Rubén quería era rescatarlo y llevarlo de vuelta con su padre.</w:t>
       </w:r>
     </w:p>
     <w:p>
@@ -21553,13 +21553,13 @@
           <w:vertAlign w:val="superscript"/>
           <w:lang w:val="es_ES" w:bidi="es_ES"/>
         </w:rPr>
-        <w:t>27</w:t>
-      </w:r>
-      <w:r>
-        <w:rPr>
-          <w:lang w:val="es_ES" w:bidi="es_ES"/>
-        </w:rPr>
-        <w:t xml:space="preserve"> Entonces Judá dijo a sus hermanos:―¡Miren! ¿Qué ganamos con matar a nuestro hermano y encubrir su muerte? Mejor se lo vendemos a los ismaelitas, en vez de ponerle la mano encima. Después de todo, es nuestro hermano, de nuestra propia sangre. Sus hermanos estuvieron de acuerdo.</w:t>
+        <w:t>26-27</w:t>
+      </w:r>
+      <w:r>
+        <w:rPr>
+          <w:lang w:val="es_ES" w:bidi="es_ES"/>
+        </w:rPr>
+        <w:t xml:space="preserve"> Entonces Judá dijo a sus hermanos: —¡Miren! ¿Qué ganamos con matar a nuestro hermano y encubrir su muerte? Mejor se lo vendemos a los ismaelitas, en vez de ponerle la mano encima. Después de todo, es nuestro hermano, de nuestra propia sangre. Sus hermanos estuvieron de acuerdo.</w:t>
       </w:r>
     </w:p>
     <w:p>
@@ -21664,7 +21664,7 @@
         <w:rPr>
           <w:lang w:val="es_ES" w:bidi="es_ES"/>
         </w:rPr>
-        <w:t xml:space="preserve"> Luego le hicieron llegar la túnica de colores a su padre, con este mensaje: «Mira lo que hemos encontrado. ¿Esta es la túnica de tu hijo?».</w:t>
+        <w:t xml:space="preserve"> Luego le hicieron llegar la túnica de colores a su padre, con este mensaje: “Mira lo que hemos encontrado. ¿Esta es la túnica de tu hijo?”.</w:t>
       </w:r>
     </w:p>
     <w:p>
@@ -21685,7 +21685,7 @@
         <w:rPr>
           <w:lang w:val="es_ES" w:bidi="es_ES"/>
         </w:rPr>
-        <w:t xml:space="preserve"> El padre la reconoció de inmediato y dijo: —¡Sí, es la túnica de mi hijo! ¡Seguro que algun animal salvaje lo despedazó y lo devoró.</w:t>
+        <w:t xml:space="preserve"> El padre la reconoció de inmediato y dijo: —¡Sí, es la túnica de mi hijo! ¡Seguro que algún animal salvaje lo despedazó y lo devoró.</w:t>
       </w:r>
     </w:p>
     <w:p>
@@ -21727,7 +21727,7 @@
         <w:rPr>
           <w:lang w:val="es_ES" w:bidi="es_ES"/>
         </w:rPr>
-        <w:t xml:space="preserve"> Todos sus hijos y sus hijas intentaban consolarlo, pero era en vano. Jacob decía: «No abandonaré el duelo hasta que me reúna con mi hijo en el lugar de los muertos», y continuó llorando a su hijo.</w:t>
+        <w:t xml:space="preserve"> Todos sus hijos y sus hijas intentaban consolarlo, pero era en vano. Jacob decía: —No abandonaré el duelo hasta que me reúna con mi hijo en el lugar de los muertos. Y continuó llorando a su hijo.</w:t>
       </w:r>
     </w:p>
     <w:p>
@@ -21932,7 +21932,7 @@
         <w:rPr>
           <w:lang w:val="es_ES" w:bidi="es_ES"/>
         </w:rPr>
-        <w:t xml:space="preserve"> Entonces Judá le dijo a Onán:—Cásate con la esposa de tu hermano. Cumple con el deber de cuñado, para que puedas darle descendencia a tu hermano.</w:t>
+        <w:t xml:space="preserve"> Entonces Judá le dijo a Onán: —Cásate con la esposa de tu hermano. Cumple con el deber de cuñado, para que puedas darle descendencia a tu hermano.</w:t>
       </w:r>
     </w:p>
     <w:p>
@@ -21995,7 +21995,7 @@
         <w:rPr>
           <w:lang w:val="es_ES" w:bidi="es_ES"/>
         </w:rPr>
-        <w:t xml:space="preserve"> Entonces Judá le dijo a su nuera Tamar:—Quédate como viuda en la casa de tu padre hasta que mi hijo Selá tenga edad para casarse. En realidad, Judá tenía miedo de que este hijo muriera igual que sus hermanos. Así que Tamar se quedó en la casa de su padre.</w:t>
+        <w:t xml:space="preserve"> Entonces Judá le dijo a su nuera Tamar: —Quédate como viuda en la casa de tu padre hasta que mi hijo Selá tenga edad para casarse. En realidad, Judá tenía miedo de que este hijo muriera igual que sus hermanos. Así que Tamar se quedó en la casa de su padre.</w:t>
       </w:r>
     </w:p>
     <w:p>
@@ -22100,7 +22100,7 @@
         <w:rPr>
           <w:lang w:val="es_ES" w:bidi="es_ES"/>
         </w:rPr>
-        <w:t xml:space="preserve"> Se acercó adonde ella estaba. Sin saber que era su nuera, le dijo: —Déjame acostarme contigo.Ella le preguntó: —¿Qué me darás si acepto?</w:t>
+        <w:t xml:space="preserve"> Se acercó adonde ella estaba. Sin saber que era su nuera, le dijo: —Déjame acostarme contigo. Ella le preguntó: —¿Qué me darás si acepto?</w:t>
       </w:r>
     </w:p>
     <w:p>
@@ -22205,7 +22205,7 @@
         <w:rPr>
           <w:lang w:val="es_ES" w:bidi="es_ES"/>
         </w:rPr>
-        <w:t xml:space="preserve"> Entonces preguntó a la gente del lugar: —¿Dónde está la prostituta que estaba junto al camino, a la entrada del pueblo?—Aquí nunca ha habido una prostituta —le respondieron.</w:t>
+        <w:t xml:space="preserve"> Entonces preguntó a la gente del lugar: —¿Dónde está la prostituta que estaba junto al camino, a la entrada del pueblo? —Aquí nunca ha habido una prostituta —le respondieron.</w:t>
       </w:r>
     </w:p>
     <w:p>
@@ -22268,7 +22268,7 @@
         <w:rPr>
           <w:lang w:val="es_ES" w:bidi="es_ES"/>
         </w:rPr>
-        <w:t xml:space="preserve"> Tres meses después, le contaron a Judá:—Tamar, tu nuera, se ha prostituido y ha quedado embarazada. —¡Sáquenla y quémenla! —ordenó Judá.</w:t>
+        <w:t xml:space="preserve"> Pasados 3 meses, le contaron a Judá: —Tamar, tu nuera, se ha prostituido y ha quedado embarazada. —¡Sáquenla y quémenla! —ordenó Judá.</w:t>
       </w:r>
     </w:p>
     <w:p>
@@ -22289,7 +22289,7 @@
         <w:rPr>
           <w:lang w:val="es_ES" w:bidi="es_ES"/>
         </w:rPr>
-        <w:t xml:space="preserve"> Pero cuando la estaban sacando, ella envió un mensaje a su suegro: «El dueño de este sello, este cordón y este bastón es el padre de mi hijo. ¿Los reconoces?».</w:t>
+        <w:t xml:space="preserve"> Pero cuando la estaban sacando, ella envió un mensaje a su suegro: “El dueño de este sello, este cordón y este bastón es el padre de mi hijo. ¿Los reconoces?”.</w:t>
       </w:r>
     </w:p>
     <w:p>
@@ -22310,7 +22310,7 @@
         <w:rPr>
           <w:lang w:val="es_ES" w:bidi="es_ES"/>
         </w:rPr>
-        <w:t xml:space="preserve"> Judá los reconoció y dijo: «Ella tiene razón, y no yo, porque no le di a mi hijo Selá por esposo». Judá nunca más se acostó con ella.</w:t>
+        <w:t xml:space="preserve"> Judá los reconoció y dijo: —Ella tiene razón, y no yo, porque no le di a mi hijo Selá por esposo. Judá nunca más se acostó con ella.</w:t>
       </w:r>
     </w:p>
     <w:p>
@@ -22352,7 +22352,7 @@
         <w:rPr>
           <w:lang w:val="es_ES" w:bidi="es_ES"/>
         </w:rPr>
-        <w:t xml:space="preserve"> En el momento de nacer, uno de los niños sacó la mano. La partera le ató un hilo rojo en la mano, diciendo:—Este salió primero.</w:t>
+        <w:t xml:space="preserve"> En el momento de nacer, uno de los niños sacó la mano. La partera le ató un hilo rojo en la mano, diciendo: —Este salió primero.</w:t>
       </w:r>
     </w:p>
     <w:p>
@@ -22373,7 +22373,7 @@
         <w:rPr>
           <w:lang w:val="es_ES" w:bidi="es_ES"/>
         </w:rPr>
-        <w:t xml:space="preserve"> Pero el niño volvió a meter la mano, y salió primero el otro mellizo. Entonces la partera dijo:—¡Cómo abriste brecha! Por eso al niño lo llamaron Fares.Fares: En hebreo, Fares quiere decir abertura, brecha." class="footnote-marker"&gt;1</w:t>
+        <w:t xml:space="preserve"> Pero el niño volvió a meter la mano, y salió primero el otro mellizo. Entonces la partera dijo: —¡Cómo abriste brecha! Por eso al niño lo llamaron Fares.</w:t>
       </w:r>
     </w:p>
     <w:p>
@@ -22394,7 +22394,7 @@
         <w:rPr>
           <w:lang w:val="es_ES" w:bidi="es_ES"/>
         </w:rPr>
-        <w:t xml:space="preserve"> Luego salió el bebé que tenía el hilo rojo en la mano. Lo llamaron Zera.Zera: En hebreo, Zera quiere decir rojo, brillo o resplandor." class="footnote-marker"&gt;2</w:t>
+        <w:t xml:space="preserve"> Luego salió el bebé que tenía el hilo rojo en la mano. Lo llamaron Zera.</w:t>
       </w:r>
     </w:p>
     <w:p>
@@ -22557,7 +22557,7 @@
         <w:rPr>
           <w:lang w:val="es_ES" w:bidi="es_ES"/>
         </w:rPr>
-        <w:t xml:space="preserve"> Pasado un tiempo, cierto día, la mujer de su amo se fijó en José. Le dijo:—Acuéstate conmigo.</w:t>
+        <w:t xml:space="preserve"> Pasado un tiempo, cierto día, la mujer de su amo se fijó en José. Le dijo: —Acuéstate conmigo.</w:t>
       </w:r>
     </w:p>
     <w:p>
@@ -22578,7 +22578,7 @@
         <w:rPr>
           <w:lang w:val="es_ES" w:bidi="es_ES"/>
         </w:rPr>
-        <w:t xml:space="preserve"> Pero José se negó y le dijo: ―Señora, mi amo me lo ha confiado todo y no tiene que preocuparse por nada de la casa.</w:t>
+        <w:t xml:space="preserve"> Pero José se negó y le dijo: —Señora, mi amo me lo ha confiado todo y no tiene que preocuparse por nada de la casa.</w:t>
       </w:r>
     </w:p>
     <w:p>
@@ -22698,13 +22698,13 @@
           <w:vertAlign w:val="superscript"/>
           <w:lang w:val="es_ES" w:bidi="es_ES"/>
         </w:rPr>
-        <w:t>15</w:t>
-      </w:r>
-      <w:r>
-        <w:rPr>
-          <w:lang w:val="es_ES" w:bidi="es_ES"/>
-        </w:rPr>
-        <w:t xml:space="preserve"> Entonces llamó a sus siervos y les dijo:—¡Miren, el hebreo que mi esposo nos ha traído está aquí para burlarse de nosotros! Entró en mis aposentos queriendo acostarse conmigo. Yo grité con todas mis fuerzas. En cuanto me oyó gritar, salió corriendo y se dejó el manto.</w:t>
+        <w:t>14-15</w:t>
+      </w:r>
+      <w:r>
+        <w:rPr>
+          <w:lang w:val="es_ES" w:bidi="es_ES"/>
+        </w:rPr>
+        <w:t xml:space="preserve"> Entonces llamó a sus siervos y les dijo: —¡Miren, el hebreo que mi esposo nos ha traído está aquí para burlarse de nosotros! Entró en mis aposentos queriendo acostarse conmigo. Yo grité con todas mis fuerzas. En cuanto me oyó gritar, salió corriendo y se dejó el manto.</w:t>
       </w:r>
     </w:p>
     <w:p>
@@ -22746,7 +22746,7 @@
         <w:rPr>
           <w:lang w:val="es_ES" w:bidi="es_ES"/>
         </w:rPr>
-        <w:t xml:space="preserve"> Entonces le contó:—El esclavo hebreo que has traído quiso aprovecharse de mí.</w:t>
+        <w:t xml:space="preserve"> Entonces le contó: —El esclavo hebreo que has traído quiso aprovecharse de mí.</w:t>
       </w:r>
     </w:p>
     <w:p>
@@ -22924,7 +22924,7 @@
           <w:vertAlign w:val="superscript"/>
           <w:lang w:val="es_ES" w:bidi="es_ES"/>
         </w:rPr>
-        <w:t>3</w:t>
+        <w:t>2-3</w:t>
       </w:r>
       <w:r>
         <w:rPr>
@@ -23035,28 +23035,28 @@
         <w:rPr>
           <w:lang w:val="es_ES" w:bidi="es_ES"/>
         </w:rPr>
-        <w:t xml:space="preserve"> Ellos le contestaron: —Ambos tuvimos un sueño, uno cada uno, pero no hay quien los interprete.José les respondió:—Dios es quien da la interpretación de los sueños. ¿Pueden contármelos?</w:t>
-      </w:r>
-    </w:p>
-    <w:p>
-      <w:pPr/>
-      <w:r>
-        <w:rPr>
-          <w:lang w:val="es_ES" w:bidi="es_ES"/>
-        </w:rPr>
-      </w:r>
-      <w:r>
-        <w:rPr>
-          <w:vertAlign w:val="superscript"/>
-          <w:lang w:val="es_ES" w:bidi="es_ES"/>
-        </w:rPr>
-        <w:t>10</w:t>
-      </w:r>
-      <w:r>
-        <w:rPr>
-          <w:lang w:val="es_ES" w:bidi="es_ES"/>
-        </w:rPr>
-        <w:t xml:space="preserve"> Entonces el jefe de los coperos contó su sueño:—Soñé que delante de mí había una vid con 3 ramas. La vid echó brotes, floreció y maduraron uvas en los racimos.</w:t>
+        <w:t xml:space="preserve"> Ellos le contestaron: —Ambos tuvimos un sueño, uno cada uno, pero no hay quien los interprete. José les respondió: —Dios es quien da la interpretación de los sueños. ¿Pueden contármelos?</w:t>
+      </w:r>
+    </w:p>
+    <w:p>
+      <w:pPr/>
+      <w:r>
+        <w:rPr>
+          <w:lang w:val="es_ES" w:bidi="es_ES"/>
+        </w:rPr>
+      </w:r>
+      <w:r>
+        <w:rPr>
+          <w:vertAlign w:val="superscript"/>
+          <w:lang w:val="es_ES" w:bidi="es_ES"/>
+        </w:rPr>
+        <w:t>9-10</w:t>
+      </w:r>
+      <w:r>
+        <w:rPr>
+          <w:lang w:val="es_ES" w:bidi="es_ES"/>
+        </w:rPr>
+        <w:t xml:space="preserve"> Entonces el jefe de los coperos contó su sueño: —Soñé que delante de mí había una vid con 3 ramas. La vid echó brotes, floreció y maduraron uvas en los racimos.</w:t>
       </w:r>
     </w:p>
     <w:p>
@@ -23098,7 +23098,7 @@
         <w:rPr>
           <w:lang w:val="es_ES" w:bidi="es_ES"/>
         </w:rPr>
-        <w:t xml:space="preserve"> José le dijo: —Esta es la interpretación del sueño: las tres ramas son tres días.</w:t>
+        <w:t xml:space="preserve"> José le dijo: —Esta es la interpretación del sueño: las 3 ramas son 3 días.</w:t>
       </w:r>
     </w:p>
     <w:p>
@@ -23224,7 +23224,7 @@
         <w:rPr>
           <w:lang w:val="es_ES" w:bidi="es_ES"/>
         </w:rPr>
-        <w:t xml:space="preserve"> José respondió: —Esta es la interpretación del sueño: las tres canastas son tres días.</w:t>
+        <w:t xml:space="preserve"> José respondió: —Esta es la interpretación del sueño: las 3 canastas son 3 días.</w:t>
       </w:r>
     </w:p>
     <w:p>
@@ -23513,7 +23513,7 @@
         <w:rPr>
           <w:lang w:val="es_ES" w:bidi="es_ES"/>
         </w:rPr>
-        <w:t xml:space="preserve"> A la mañana siguiente, estaba muy preocupado pensando en esos sueños. Mandó llamar a todos los magos y sabios de Egipto, y les contó los dos sueños. Pero no hubo quien supiera interpretarlos.</w:t>
+        <w:t xml:space="preserve"> A la mañana siguiente, estaba muy preocupado pensando en esos sueños. Mandó llamar a todos los magos y sabios de Egipto, y les contó los 2 sueños. Pero no hubo quien supiera interpretarlos.</w:t>
       </w:r>
     </w:p>
     <w:p>
@@ -23534,7 +23534,7 @@
         <w:rPr>
           <w:lang w:val="es_ES" w:bidi="es_ES"/>
         </w:rPr>
-        <w:t xml:space="preserve"> Entonces el jefe de los coperos le dijo al faraón:—Ahora recuerdo mi falta.</w:t>
+        <w:t xml:space="preserve"> Entonces el jefe de los coperos le dijo al faraón: —Ahora recuerdo mi falta.</w:t>
       </w:r>
     </w:p>
     <w:p>
@@ -23555,7 +23555,7 @@
         <w:rPr>
           <w:lang w:val="es_ES" w:bidi="es_ES"/>
         </w:rPr>
-        <w:t xml:space="preserve"> Hace algún tiempo, el faraón se enojó conmigo y con el jefe de los panaderos. Nos mandó a la cárcel, custudiados por el capitán de la guardia.</w:t>
+        <w:t xml:space="preserve"> Hace algún tiempo, el faraón se enojó conmigo y con el jefe de los panaderos. Nos mandó a la cárcel, custodiados por el capitán de la guardia.</w:t>
       </w:r>
     </w:p>
     <w:p>
@@ -23660,7 +23660,7 @@
         <w:rPr>
           <w:lang w:val="es_ES" w:bidi="es_ES"/>
         </w:rPr>
-        <w:t xml:space="preserve"> El faraón dijo:—He tenido un sueño y no hay quien lo interprete. Me han dicho que tú puedes interpretar los sueños.</w:t>
+        <w:t xml:space="preserve"> El faraón dijo: —He tenido un sueño y no hay quien lo interprete. Me han dicho que tú puedes interpretar los sueños.</w:t>
       </w:r>
     </w:p>
     <w:p>
@@ -24017,7 +24017,7 @@
         <w:rPr>
           <w:lang w:val="es_ES" w:bidi="es_ES"/>
         </w:rPr>
-        <w:t xml:space="preserve"> Dado que el faraón tuvo el sueño dos veces, se trata de algo que Dios ha determinado firmemente hacer, y que va a suceder pronto.</w:t>
+        <w:t xml:space="preserve"> Dado que el faraón tuvo el sueño 2 veces, se trata de algo que Dios ha determinado firmemente hacer, y que va a suceder pronto.</w:t>
       </w:r>
     </w:p>
     <w:p>
@@ -24053,7 +24053,7 @@
           <w:vertAlign w:val="superscript"/>
           <w:lang w:val="es_ES" w:bidi="es_ES"/>
         </w:rPr>
-        <w:t>35</w:t>
+        <w:t>34-35</w:t>
       </w:r>
       <w:r>
         <w:rPr>
@@ -24080,7 +24080,7 @@
         <w:rPr>
           <w:lang w:val="es_ES" w:bidi="es_ES"/>
         </w:rPr>
-        <w:t xml:space="preserve"> Esa reserva servirá para que los habitantes de Egipto no mueran durante los siete años de hambre que vendrán después.</w:t>
+        <w:t xml:space="preserve"> Esa reserva servirá para que los habitantes de Egipto no mueran durante los 7 años de hambre que vendrán después.</w:t>
       </w:r>
     </w:p>
     <w:p>
@@ -24179,13 +24179,13 @@
           <w:vertAlign w:val="superscript"/>
           <w:lang w:val="es_ES" w:bidi="es_ES"/>
         </w:rPr>
-        <w:t>42</w:t>
-      </w:r>
-      <w:r>
-        <w:rPr>
-          <w:lang w:val="es_ES" w:bidi="es_ES"/>
-        </w:rPr>
-        <w:t xml:space="preserve"> Entonces el faraón dijo a José: —Mira, te he puesto al mando sobre todo Egipto.Entonces el faraón se quitó el anillo oficial de sellar y lo puso en la mano de José. Hizo que lo vistieran con vestiduras de lino y que le pusieran un collar de oro.</w:t>
+        <w:t>41-42</w:t>
+      </w:r>
+      <w:r>
+        <w:rPr>
+          <w:lang w:val="es_ES" w:bidi="es_ES"/>
+        </w:rPr>
+        <w:t xml:space="preserve"> Entonces el faraón dijo a José: —Mira, te he puesto al mando sobre todo Egipto. Entonces el faraón se quitó el anillo oficial de sellar y lo puso en la mano de José. Hizo que lo vistieran con vestiduras de lino y que le pusieran un collar de oro.</w:t>
       </w:r>
     </w:p>
     <w:p>
@@ -24206,7 +24206,7 @@
         <w:rPr>
           <w:lang w:val="es_ES" w:bidi="es_ES"/>
         </w:rPr>
-        <w:t xml:space="preserve"> Después lo invitó a subir en el carruaje del segundo del reino. Ordenó que pregonaran a su paso:—¡Inclínense! Así fue como el faraón puso a José al frente de todo Egipto.</w:t>
+        <w:t xml:space="preserve"> Después lo invitó a subir en el carruaje del segundo del reino. Ordenó que pregonaran a su paso: —¡Inclínense! Así fue como el faraón puso a José al frente de todo Egipto.</w:t>
       </w:r>
     </w:p>
     <w:p>
@@ -24353,7 +24353,7 @@
         <w:rPr>
           <w:lang w:val="es_ES" w:bidi="es_ES"/>
         </w:rPr>
-        <w:t xml:space="preserve"> Antes que llegara el primer año de escasez, José tuvo dos hijos con su esposa Asenat, hija de Potifera, sacerdote de la ciudad de On.</w:t>
+        <w:t xml:space="preserve"> Antes que llegara el primer año de escasez, José tuvo 2 hijos con su esposa Asenat. Era hija de Potifera, sacerdote de la ciudad de On.</w:t>
       </w:r>
     </w:p>
     <w:p>
@@ -24374,7 +24374,7 @@
         <w:rPr>
           <w:lang w:val="es_ES" w:bidi="es_ES"/>
         </w:rPr>
-        <w:t xml:space="preserve"> A su primogénito lo llamó Manasés,1 porque dijo:—Dios me hizo olvidar todos mis padecimientos y la casa de mi padre.</w:t>
+        <w:t xml:space="preserve"> A su primogénito lo llamó Manasés, porque dijo: “Dios me hizo olvidar todos mis padecimientos y la casa de mi padre”.</w:t>
       </w:r>
     </w:p>
     <w:p>
@@ -24395,7 +24395,7 @@
         <w:rPr>
           <w:lang w:val="es_ES" w:bidi="es_ES"/>
         </w:rPr>
-        <w:t xml:space="preserve"> Al segundo hijo lo llamó Efraín,2 porque dijo:—Dios me hizo fecundo en esta tierra de mi aflicción.</w:t>
+        <w:t xml:space="preserve"> Al segundo hijo lo llamó Efraín, porque dijo: “Dios me hizo fecundo en esta tierra de mi aflicción”.</w:t>
       </w:r>
     </w:p>
     <w:p>
@@ -24458,7 +24458,7 @@
         <w:rPr>
           <w:lang w:val="es_ES" w:bidi="es_ES"/>
         </w:rPr>
-        <w:t xml:space="preserve"> Pero cuando el hambre llegó también a la tierra de Egipto, el pueblo clamó al faraón pidiendo alimento. Entonces el faraón dijo a todo el pueblo de Egipto:—Vayan a José y hagan todo lo que él les diga.</w:t>
+        <w:t xml:space="preserve"> Pero cuando el hambre llegó también a la tierra de Egipto, el pueblo clamó al faraón pidiendo alimento. Entonces el faraón dijo a todo el pueblo de Egipto: —Vayan a José y hagan todo lo que él les diga.</w:t>
       </w:r>
     </w:p>
     <w:p>
@@ -24537,7 +24537,7 @@
         <w:rPr>
           <w:lang w:val="es_ES" w:bidi="es_ES"/>
         </w:rPr>
-        <w:t xml:space="preserve"> Cuando Jacob se enteró de que había grano en Egipto, dijo a sus hijos:—¿Qué hacen ahí mirándose sin hacer nada?</w:t>
+        <w:t xml:space="preserve"> Cuando Jacob se enteró de que había grano en Egipto, dijo a sus hijos: —¿Qué hacen ahí mirándose sin hacer nada?</w:t>
       </w:r>
     </w:p>
     <w:p>
@@ -24663,28 +24663,28 @@
         <w:rPr>
           <w:lang w:val="es_ES" w:bidi="es_ES"/>
         </w:rPr>
-        <w:t xml:space="preserve"> José los reconoció en cuanto los vio, pero fingió no reconocerlos. Les habló con dureza: —¿De dónde vienen ustedes?—Venimos de Canaán —respondieron—. Hemos venido a comprar alimento.</w:t>
-      </w:r>
-    </w:p>
-    <w:p>
-      <w:pPr/>
-      <w:r>
-        <w:rPr>
-          <w:lang w:val="es_ES" w:bidi="es_ES"/>
-        </w:rPr>
-      </w:r>
-      <w:r>
-        <w:rPr>
-          <w:vertAlign w:val="superscript"/>
-          <w:lang w:val="es_ES" w:bidi="es_ES"/>
-        </w:rPr>
-        <w:t>9</w:t>
-      </w:r>
-      <w:r>
-        <w:rPr>
-          <w:lang w:val="es_ES" w:bidi="es_ES"/>
-        </w:rPr>
-        <w:t xml:space="preserve"> Aunque José los había reconocido, ellos a él, no. Entonces José se acordó de los sueños que había tenido acerca de ellos. Les dijo:—Ustedes son espías; han venido a ver los puntos débiles de nuestro país.</w:t>
+        <w:t xml:space="preserve"> José los reconoció en cuanto los vio, pero fingió no reconocerlos. Les habló con dureza: —¿De dónde vienen ustedes? —Venimos de Canaán —respondieron—. Hemos venido a comprar alimento.</w:t>
+      </w:r>
+    </w:p>
+    <w:p>
+      <w:pPr/>
+      <w:r>
+        <w:rPr>
+          <w:lang w:val="es_ES" w:bidi="es_ES"/>
+        </w:rPr>
+      </w:r>
+      <w:r>
+        <w:rPr>
+          <w:vertAlign w:val="superscript"/>
+          <w:lang w:val="es_ES" w:bidi="es_ES"/>
+        </w:rPr>
+        <w:t>8-9</w:t>
+      </w:r>
+      <w:r>
+        <w:rPr>
+          <w:lang w:val="es_ES" w:bidi="es_ES"/>
+        </w:rPr>
+        <w:t xml:space="preserve"> Aunque José los había reconocido, ellos a él, no. Entonces José se acordó de los sueños que había tenido acerca de ellos. Les dijo: —Ustedes son espías; han venido a ver los puntos débiles de nuestro país.</w:t>
       </w:r>
     </w:p>
     <w:p>
@@ -24747,7 +24747,7 @@
         <w:rPr>
           <w:lang w:val="es_ES" w:bidi="es_ES"/>
         </w:rPr>
-        <w:t xml:space="preserve"> Pero José insistió:—¡Sí lo son! Han venido a ver si somos vulnerables.</w:t>
+        <w:t xml:space="preserve"> Pero José insistió: —¡Sí lo son! Han venido a ver si somos vulnerables.</w:t>
       </w:r>
     </w:p>
     <w:p>
@@ -24768,7 +24768,7 @@
         <w:rPr>
           <w:lang w:val="es_ES" w:bidi="es_ES"/>
         </w:rPr>
-        <w:t xml:space="preserve"> ―Señor —dijeron de nuevo—, nosotros tus siervos somos 12 hermanos, hijos de un mismo padre, de la tierra de Canaán. El menor de nuestros hermanos está con nuestro padre, y 1 de nuestros hermanos falleció.</w:t>
+        <w:t xml:space="preserve"> —Señor —dijeron de nuevo—, nosotros tus siervos somos 12 hermanos, hijos de un mismo padre, de la tierra de Canaán. El menor de nuestros hermanos está con nuestro padre, y 1 de nuestros hermanos falleció.</w:t>
       </w:r>
     </w:p>
     <w:p>
@@ -24789,7 +24789,7 @@
         <w:rPr>
           <w:lang w:val="es_ES" w:bidi="es_ES"/>
         </w:rPr>
-        <w:t xml:space="preserve"> José siguió insistiendo:―Está claro que tengo razón. Ustedes son espías.</w:t>
+        <w:t xml:space="preserve"> José siguió insistiendo: —Está claro que tengo razón. Ustedes son espías.</w:t>
       </w:r>
     </w:p>
     <w:p>
@@ -24936,7 +24936,7 @@
         <w:rPr>
           <w:lang w:val="es_ES" w:bidi="es_ES"/>
         </w:rPr>
-        <w:t xml:space="preserve"> pero se decían entre ellos: —No hay duda de que estamos sufriendo por lo que le hicimos a nuestro hermano. Vimos cómo nos suplicaba con angustia, y no tuvimos compasión. Por eso nos vemos en esta situacion.</w:t>
+        <w:t xml:space="preserve"> pero se decían entre ellos: —No hay duda de que estamos sufriendo por lo que le hicimos a nuestro hermano. Vimos cómo nos suplicaba con angustia, y no tuvimos compasión. Por eso nos vemos en esta situación.</w:t>
       </w:r>
     </w:p>
     <w:p>
@@ -25083,7 +25083,7 @@
         <w:rPr>
           <w:lang w:val="es_ES" w:bidi="es_ES"/>
         </w:rPr>
-        <w:t xml:space="preserve"> Entonces dijo a sus hermanos: —¡Me devolvieron el dinero! ¡Miren, está en mi costal!Los hermanos se asustaron mucho y se decían unos a otros, temblando:—¿Qué es esto que Dios nos ha hecho?</w:t>
+        <w:t xml:space="preserve"> Entonces dijo a sus hermanos: —¡Me devolvieron el dinero! ¡Miren, está en mi costal! Los hermanos se asustaron mucho y se decían unos a otros, temblando: —¿Qué es esto que Dios nos ha hecho?</w:t>
       </w:r>
     </w:p>
     <w:p>
@@ -25167,7 +25167,7 @@
         <w:rPr>
           <w:lang w:val="es_ES" w:bidi="es_ES"/>
         </w:rPr>
-        <w:t xml:space="preserve"> También le contamos que somos doce hermanos, hijos de un mismo padre. Le dijimos que uno ha muerto y que el menor está ahora con nuestro padre en la tierra de Canaán.</w:t>
+        <w:t xml:space="preserve"> También le contamos que somos 12 hermanos, hijos de un mismo padre. Le dijimos que uno ha muerto y que el menor está ahora con nuestro padre en la tierra de Canaán.</w:t>
       </w:r>
     </w:p>
     <w:p>
@@ -25188,7 +25188,7 @@
         <w:rPr>
           <w:lang w:val="es_ES" w:bidi="es_ES"/>
         </w:rPr>
-        <w:t xml:space="preserve"> »Entonces ese gobernador nos dijo: "Para demostrarme que son gente honrada, dejen a uno de sus hermanos aquí conmigo, lleven el trigo para su familia y regresen a su tierra.</w:t>
+        <w:t xml:space="preserve"> »Entonces ese gobernador nos dijo: “Para demostrarme que son gente honrada, dejen a uno de sus hermanos aquí conmigo, lleven el trigo para su familia y regresen a su tierra.</w:t>
       </w:r>
     </w:p>
     <w:p>
@@ -25209,7 +25209,7 @@
         <w:rPr>
           <w:lang w:val="es_ES" w:bidi="es_ES"/>
         </w:rPr>
-        <w:t xml:space="preserve"> Pero traigan acá a su hermano menor. Entonces sabré que no son espías, sino gente honrada. Yo les devolveré a su hermano y podrán hacer negocios en mi país".</w:t>
+        <w:t xml:space="preserve"> Pero traigan acá a su hermano menor. Entonces sabré que no son espías, sino gente honrada. Yo les devolveré a su hermano y podrán hacer negocios en mi país”.</w:t>
       </w:r>
     </w:p>
     <w:p>
@@ -25272,7 +25272,7 @@
         <w:rPr>
           <w:lang w:val="es_ES" w:bidi="es_ES"/>
         </w:rPr>
-        <w:t xml:space="preserve"> Entonces Rubén le dijo a su padre: —Yo me hago responsable del regreso de Benjamín. Mata a mis dos hijos si no te lo traigo de vuelta.</w:t>
+        <w:t xml:space="preserve"> Entonces Rubén le dijo a su padre: —Yo me hago responsable del regreso de Benjamín. Mata a mis 2 hijos si no te lo traigo de vuelta.</w:t>
       </w:r>
     </w:p>
     <w:p>
@@ -25366,7 +25366,7 @@
           <w:vertAlign w:val="superscript"/>
           <w:lang w:val="es_ES" w:bidi="es_ES"/>
         </w:rPr>
-        <w:t>5</w:t>
+        <w:t>3-5</w:t>
       </w:r>
       <w:r>
         <w:rPr>
@@ -25603,7 +25603,7 @@
         <w:rPr>
           <w:lang w:val="es_ES" w:bidi="es_ES"/>
         </w:rPr>
-        <w:t xml:space="preserve"> Cuando José vio que Benjamín estaba con ellos, le dijo a su mayordomo:—Lleva a estos hombres a mi casa. Prepara un gran banquete, porque estos hombres comerán conmigo al mediodía.</w:t>
+        <w:t xml:space="preserve"> Cuando José vio que Benjamín estaba con ellos, le dijo a su mayordomo: —Lleva a estos hombres a mi casa. Prepara un gran banquete, porque estos hombres comerán conmigo al mediodía.</w:t>
       </w:r>
     </w:p>
     <w:p>
@@ -25687,22 +25687,22 @@
         <w:rPr>
           <w:lang w:val="es_ES" w:bidi="es_ES"/>
         </w:rPr>
-        <w:t xml:space="preserve"> ―Escucha, señor. En nuestro anterior viaje a Egipto para comprar alimentos,</w:t>
-      </w:r>
-    </w:p>
-    <w:p>
-      <w:pPr/>
-      <w:r>
-        <w:rPr>
-          <w:lang w:val="es_ES" w:bidi="es_ES"/>
-        </w:rPr>
-      </w:r>
-      <w:r>
-        <w:rPr>
-          <w:vertAlign w:val="superscript"/>
-          <w:lang w:val="es_ES" w:bidi="es_ES"/>
-        </w:rPr>
-        <w:t>22</w:t>
+        <w:t xml:space="preserve"> —Escucha, señor. En nuestro anterior viaje a Egipto para comprar alimentos,</w:t>
+      </w:r>
+    </w:p>
+    <w:p>
+      <w:pPr/>
+      <w:r>
+        <w:rPr>
+          <w:lang w:val="es_ES" w:bidi="es_ES"/>
+        </w:rPr>
+      </w:r>
+      <w:r>
+        <w:rPr>
+          <w:vertAlign w:val="superscript"/>
+          <w:lang w:val="es_ES" w:bidi="es_ES"/>
+        </w:rPr>
+        <w:t>21-22</w:t>
       </w:r>
       <w:r>
         <w:rPr>
@@ -25729,7 +25729,7 @@
         <w:rPr>
           <w:lang w:val="es_ES" w:bidi="es_ES"/>
         </w:rPr>
-        <w:t xml:space="preserve"> ―No se preocupen por eso —les dijo el mayordomo—. Su Dios, el Dios de ustedes y de su padre, habrá puesto ese tesoro en sus costales, pues nosotros recibimos su pago completo. Luego hizo traer a Simeón a donde ellos estaban.</w:t>
+        <w:t xml:space="preserve"> —No se preocupen por eso —les dijo el mayordomo—. Su Dios, el Dios de ustedes y de su padre, habrá puesto ese tesoro en sus costales, pues nosotros recibimos su pago completo. Luego hizo traer a Simeón a donde ellos estaban.</w:t>
       </w:r>
     </w:p>
     <w:p>
@@ -25960,7 +25960,7 @@
         <w:rPr>
           <w:lang w:val="es_ES" w:bidi="es_ES"/>
         </w:rPr>
-        <w:t xml:space="preserve"> La comida de cada uno se servía desde la mesa de José. La porción de Benjamín era cinco veces más grande que la de los demás. Así bebieron todos con José y se alegraron.</w:t>
+        <w:t xml:space="preserve"> La comida de cada uno se servía desde la mesa de José. La porción de Benjamín era 5 veces más grande que la de los demás. Así bebieron todos con José y se alegraron.</w:t>
       </w:r>
     </w:p>
     <w:p>
@@ -25997,7 +25997,7 @@
         <w:rPr>
           <w:lang w:val="es_ES" w:bidi="es_ES"/>
         </w:rPr>
-        <w:t xml:space="preserve"> Más tarde, José ordenó a su mayordomo:—Llena los costales de estos hombres con todo el alimento que les quepa y pon el dinero de cada uno de ellos en sus bolsas.</w:t>
+        <w:t xml:space="preserve"> Más tarde, José ordenó a su mayordomo: —Llena los costales de estos hombres con todo el alimento que les quepa y pon el dinero de cada uno de ellos en sus bolsas.</w:t>
       </w:r>
     </w:p>
     <w:p>
@@ -26081,7 +26081,7 @@
         <w:rPr>
           <w:lang w:val="es_ES" w:bidi="es_ES"/>
         </w:rPr>
-        <w:t xml:space="preserve"> ¿No es esta la copa con la que bebe mi señor y la que usa para interpretar? ¡Han cometido un grave pecado!".</w:t>
+        <w:t xml:space="preserve"> ¿No es esta la copa con la que bebe mi señor y la que usa para interpretar? ¡Han cometido un grave pecado!”.</w:t>
       </w:r>
     </w:p>
     <w:p>
@@ -26123,7 +26123,7 @@
         <w:rPr>
           <w:lang w:val="es_ES" w:bidi="es_ES"/>
         </w:rPr>
-        <w:t xml:space="preserve"> Ellos respondieron:—Pero ¿qué dices? ¡Nosotros jamás haríamos algo así!</w:t>
+        <w:t xml:space="preserve"> Ellos respondieron: —Pero ¿qué dices? ¡Nosotros jamás haríamos algo así!</w:t>
       </w:r>
     </w:p>
     <w:p>
@@ -26291,7 +26291,7 @@
         <w:rPr>
           <w:lang w:val="es_ES" w:bidi="es_ES"/>
         </w:rPr>
-        <w:t xml:space="preserve"> —¿Qué es esto que han hecho? —les dijo José—. ¿No saben que un hombre como yo tiene el poder de intrepretar señales?</w:t>
+        <w:t xml:space="preserve"> —¿Qué es esto que han hecho? —les dijo José—. ¿No saben que un hombre como yo tiene el poder de interpretar señales?</w:t>
       </w:r>
     </w:p>
     <w:p>
@@ -26438,7 +26438,7 @@
         <w:rPr>
           <w:lang w:val="es_ES" w:bidi="es_ES"/>
         </w:rPr>
-        <w:t xml:space="preserve"> Pero nosotros te dijimos: "Señor, el muchacho no puede alejarse de su padre. Si se fuera de su lado, su padre moriría".</w:t>
+        <w:t xml:space="preserve"> Pero nosotros te dijimos: “Señor, el muchacho no puede alejarse de su padre. Si se fuera de su lado, su padre moriría”.</w:t>
       </w:r>
     </w:p>
     <w:p>
@@ -26522,7 +26522,7 @@
         <w:rPr>
           <w:lang w:val="es_ES" w:bidi="es_ES"/>
         </w:rPr>
-        <w:t xml:space="preserve"> Nosotros le respondimos: “No podemos volver sin llevar a nuestro hermano menor; pues aquel hombre no nos recibirá si no lo llevamos con nosotros".</w:t>
+        <w:t xml:space="preserve"> Nosotros le respondimos: “No podemos volver sin llevar a nuestro hermano menor; pues aquel hombre no nos recibirá si no lo llevamos con nosotros”.</w:t>
       </w:r>
     </w:p>
     <w:p>
@@ -26543,7 +26543,7 @@
         <w:rPr>
           <w:lang w:val="es_ES" w:bidi="es_ES"/>
         </w:rPr>
-        <w:t xml:space="preserve"> »Entonces mi padre nos dijo: “Ustedes saben que mi esposa me dio solo dos hijos.</w:t>
+        <w:t xml:space="preserve"> »Entonces mi padre nos dijo: “Ustedes saben que mi esposa me dio solo 2 hijos.</w:t>
       </w:r>
     </w:p>
     <w:p>
@@ -26585,22 +26585,22 @@
         <w:rPr>
           <w:lang w:val="es_ES" w:bidi="es_ES"/>
         </w:rPr>
-        <w:t xml:space="preserve"> Si también se llevan a este y le sucede algo malo, harán que descienda con mis canas al lugar de los muertos".</w:t>
-      </w:r>
-    </w:p>
-    <w:p>
-      <w:pPr/>
-      <w:r>
-        <w:rPr>
-          <w:lang w:val="es_ES" w:bidi="es_ES"/>
-        </w:rPr>
-      </w:r>
-      <w:r>
-        <w:rPr>
-          <w:vertAlign w:val="superscript"/>
-          <w:lang w:val="es_ES" w:bidi="es_ES"/>
-        </w:rPr>
-        <w:t>31</w:t>
+        <w:t xml:space="preserve"> Si también se llevan a este y le sucede algo malo, harán que descienda con mis canas al lugar de los muertos”.</w:t>
+      </w:r>
+    </w:p>
+    <w:p>
+      <w:pPr/>
+      <w:r>
+        <w:rPr>
+          <w:lang w:val="es_ES" w:bidi="es_ES"/>
+        </w:rPr>
+      </w:r>
+      <w:r>
+        <w:rPr>
+          <w:vertAlign w:val="superscript"/>
+          <w:lang w:val="es_ES" w:bidi="es_ES"/>
+        </w:rPr>
+        <w:t>30-31</w:t>
       </w:r>
       <w:r>
         <w:rPr>
@@ -26706,7 +26706,7 @@
         <w:rPr>
           <w:lang w:val="es_ES" w:bidi="es_ES"/>
         </w:rPr>
-        <w:t xml:space="preserve"> José ya no pudo contener más su emoción y exclamó:—¡Salgan todos de mi presencia! No quedó nadie con él sino sus hermanos. Y les dijo quién era.</w:t>
+        <w:t xml:space="preserve"> José ya no pudo contener más su emoción y exclamó: —¡Salgan todos de mi presencia! No quedó nadie con él sino sus hermanos. Y les dijo quién era.</w:t>
       </w:r>
     </w:p>
     <w:p>
@@ -26769,7 +26769,7 @@
         <w:rPr>
           <w:lang w:val="es_ES" w:bidi="es_ES"/>
         </w:rPr>
-        <w:t xml:space="preserve"> José insistió:—¡Acérquense, por favor! Ellos le obedecieron y él añadió: —Yo soy José, su hermano, a quien ustedes vendieron a Egipto.</w:t>
+        <w:t xml:space="preserve"> José insistió: —¡Acérquense, por favor! Ellos le obedecieron y él añadió: —Yo soy José, su hermano, a quien ustedes vendieron a Egipto.</w:t>
       </w:r>
     </w:p>
     <w:p>
@@ -26811,7 +26811,7 @@
         <w:rPr>
           <w:lang w:val="es_ES" w:bidi="es_ES"/>
         </w:rPr>
-        <w:t xml:space="preserve"> Llevamos dos años de escasez, pero quedan cinco años más de hambre. Durante ese tiempo no habrá siembra ni cosecha.</w:t>
+        <w:t xml:space="preserve"> Llevamos 2 años de escasez, pero quedan 5 años más de hambre. Durante ese tiempo no habrá siembra ni cosecha.</w:t>
       </w:r>
     </w:p>
     <w:p>
@@ -26874,7 +26874,7 @@
         <w:rPr>
           <w:lang w:val="es_ES" w:bidi="es_ES"/>
         </w:rPr>
-        <w:t xml:space="preserve"> Dense prisa. Vuelvan a la casa de mi padre y díganle que así dice su hijo José: "Dios me ha puesto por señor de todo Egipto. Ven a verme sin tardanza.</w:t>
+        <w:t xml:space="preserve"> Dense prisa. Vuelvan a la casa de mi padre y díganle que así dice su hijo José: “Dios me ha puesto por señor de todo Egipto. Ven a verme sin tardanza.</w:t>
       </w:r>
     </w:p>
     <w:p>
@@ -26910,13 +26910,13 @@
           <w:vertAlign w:val="superscript"/>
           <w:lang w:val="es_ES" w:bidi="es_ES"/>
         </w:rPr>
-        <w:t>13</w:t>
-      </w:r>
-      <w:r>
-        <w:rPr>
-          <w:lang w:val="es_ES" w:bidi="es_ES"/>
-        </w:rPr>
-        <w:t xml:space="preserve"> Yo cuidaré que no te falte alimento, porque aún quedan 5 años de hambre. Si no, tú, tu familia y todo lo que tienes quedarán en la pobreza". »Mi hermano Benjamín y ustedes son testigos de lo que les he dicho. Cuéntenle a mi padre la honra que tengo en Egipto y todo lo que han visto. Apúrense y traigan a mi padre.</w:t>
+        <w:t>11-13</w:t>
+      </w:r>
+      <w:r>
+        <w:rPr>
+          <w:lang w:val="es_ES" w:bidi="es_ES"/>
+        </w:rPr>
+        <w:t xml:space="preserve"> Yo cuidaré que no te falte alimento, porque aún quedan 5 años de hambre. Si no, tú, tu familia y todo lo que tienes quedarán en la pobreza”. »Mi hermano Benjamín y ustedes son testigos de lo que les he dicho. Cuéntenle a mi padre la honra que tengo en Egipto y todo lo que han visto. Apúrense y traigan a mi padre.</w:t>
       </w:r>
     </w:p>
     <w:p>
@@ -27000,7 +27000,7 @@
         <w:rPr>
           <w:lang w:val="es_ES" w:bidi="es_ES"/>
         </w:rPr>
-        <w:t xml:space="preserve"> Entonces el faraón le dijo a José:—Diles a tus hermanos que carguen sus animales y vuelvan a Canaán.</w:t>
+        <w:t xml:space="preserve"> Entonces el faraón le dijo a José: —Diles a tus hermanos que carguen sus animales y vuelvan a Canaán.</w:t>
       </w:r>
     </w:p>
     <w:p>
@@ -27105,7 +27105,7 @@
         <w:rPr>
           <w:lang w:val="es_ES" w:bidi="es_ES"/>
         </w:rPr>
-        <w:t xml:space="preserve"> Le dio ropa nueva a cada uno, pero a Benjamín le dio trescientas monedas de plata y cinco mudas de ropa nuevas.</w:t>
+        <w:t xml:space="preserve"> Le dio ropa nueva a cada uno, pero a Benjamín le dio 300 monedas de plata y 5 mudas de ropa nuevas.</w:t>
       </w:r>
     </w:p>
     <w:p>
@@ -27126,7 +27126,7 @@
         <w:rPr>
           <w:lang w:val="es_ES" w:bidi="es_ES"/>
         </w:rPr>
-        <w:t xml:space="preserve"> A su padre le envió diez burros cargados con las mejores cosas de Egipto, diez burras cargadas de trigo y pan, además de alimentos de toda clase para el viaje.</w:t>
+        <w:t xml:space="preserve"> A su padre le envió 10 burros cargados con las mejores cosas de Egipto, 10 burras cargadas de trigo y pan, además de alimentos de toda clase para el viaje.</w:t>
       </w:r>
     </w:p>
     <w:p>
@@ -27147,7 +27147,7 @@
         <w:rPr>
           <w:lang w:val="es_ES" w:bidi="es_ES"/>
         </w:rPr>
-        <w:t xml:space="preserve"> José se despidió de sus hermanos. Cuando ya partían, les dijo:—¡No discutan por el camino!</w:t>
+        <w:t xml:space="preserve"> José se despidió de sus hermanos. Cuando ya partían, les dijo: —¡No discutan por el camino!</w:t>
       </w:r>
     </w:p>
     <w:p>
@@ -27189,7 +27189,7 @@
         <w:rPr>
           <w:lang w:val="es_ES" w:bidi="es_ES"/>
         </w:rPr>
-        <w:t xml:space="preserve"> Al llegar exclamaron:—¡José está vivo! ¡Es el gobernador de todo Egipto! Jacob estaba atónito. No les creía,</w:t>
+        <w:t xml:space="preserve"> Al llegar exclamaron: —¡José está vivo! ¡Es el gobernador de todo Egipto! Jacob estaba atónito. No les creía,</w:t>
       </w:r>
     </w:p>
     <w:p>
@@ -27231,7 +27231,7 @@
         <w:rPr>
           <w:lang w:val="es_ES" w:bidi="es_ES"/>
         </w:rPr>
-        <w:t xml:space="preserve"> Entonces exclamó:—¡Con esto me basta! ¡Mi hijo José sigue vivo! Iré a verlo antes de morir.</w:t>
+        <w:t xml:space="preserve"> Entonces exclamó: —¡Con esto me basta! ¡Mi hijo José sigue vivo! Iré a verlo antes de morir.</w:t>
       </w:r>
     </w:p>
     <w:p>
@@ -27289,7 +27289,7 @@
         <w:rPr>
           <w:lang w:val="es_ES" w:bidi="es_ES"/>
         </w:rPr>
-        <w:t xml:space="preserve"> Aquella noche Dios le habló en visión: ―¡Jacob, Jacob! ―Aquí estoy —respondió.</w:t>
+        <w:t xml:space="preserve"> Aquella noche Dios le habló en visión: —¡Jacob, Jacob! —Aquí estoy —respondió.</w:t>
       </w:r>
     </w:p>
     <w:p>
@@ -27310,7 +27310,7 @@
         <w:rPr>
           <w:lang w:val="es_ES" w:bidi="es_ES"/>
         </w:rPr>
-        <w:t xml:space="preserve"> Dios le dijo:―Yo soy Dios, el Dios de tu padre; no temas descender a Egipto, porque allí haré de ti una gran nación.</w:t>
+        <w:t xml:space="preserve"> Dios le dijo: —Yo soy Dios, el Dios de tu padre; no temas descender a Egipto, porque allí haré de ti una gran nación.</w:t>
       </w:r>
     </w:p>
     <w:p>
@@ -27409,7 +27409,7 @@
           <w:vertAlign w:val="superscript"/>
           <w:lang w:val="es_ES" w:bidi="es_ES"/>
         </w:rPr>
-        <w:t>14</w:t>
+        <w:t>8-14</w:t>
       </w:r>
       <w:r>
         <w:rPr>
@@ -27451,7 +27451,7 @@
           <w:vertAlign w:val="superscript"/>
           <w:lang w:val="es_ES" w:bidi="es_ES"/>
         </w:rPr>
-        <w:t>17</w:t>
+        <w:t>16-17</w:t>
       </w:r>
       <w:r>
         <w:rPr>
@@ -27493,7 +27493,7 @@
           <w:vertAlign w:val="superscript"/>
           <w:lang w:val="es_ES" w:bidi="es_ES"/>
         </w:rPr>
-        <w:t>22</w:t>
+        <w:t>19-22</w:t>
       </w:r>
       <w:r>
         <w:rPr>
@@ -27514,7 +27514,7 @@
           <w:vertAlign w:val="superscript"/>
           <w:lang w:val="es_ES" w:bidi="es_ES"/>
         </w:rPr>
-        <w:t>25</w:t>
+        <w:t>23-25</w:t>
       </w:r>
       <w:r>
         <w:rPr>
@@ -27767,7 +27767,7 @@
         <w:rPr>
           <w:lang w:val="es_ES" w:bidi="es_ES"/>
         </w:rPr>
-        <w:t xml:space="preserve"> José había llevado a cinco de sus hermanos para presentárselos al faraón.</w:t>
+        <w:t xml:space="preserve"> José había llevado a 5 de sus hermanos para presentárselos al faraón.</w:t>
       </w:r>
     </w:p>
     <w:p>
@@ -27788,7 +27788,7 @@
         <w:rPr>
           <w:lang w:val="es_ES" w:bidi="es_ES"/>
         </w:rPr>
-        <w:t xml:space="preserve"> Entonces el faraón les preguntó: —¿Cuál es su oficio?—Nosotros, tus siervos, somos pastores de ovejas —respondieron—, como nuestros antepasados.</w:t>
+        <w:t xml:space="preserve"> Entonces el faraón les preguntó: —¿Cuál es su oficio? —Nosotros, tus siervos, somos pastores de ovejas —respondieron—, como nuestros antepasados.</w:t>
       </w:r>
     </w:p>
     <w:p>
@@ -27824,7 +27824,7 @@
           <w:vertAlign w:val="superscript"/>
           <w:lang w:val="es_ES" w:bidi="es_ES"/>
         </w:rPr>
-        <w:t>6</w:t>
+        <w:t>5-6</w:t>
       </w:r>
       <w:r>
         <w:rPr>
@@ -27893,7 +27893,7 @@
         <w:rPr>
           <w:lang w:val="es_ES" w:bidi="es_ES"/>
         </w:rPr>
-        <w:t xml:space="preserve"> Jacob le respondió: —Tengo ciento treinta años. Han sido años escasos y difíciles peregrinando de un lado a otro. Pero no son comparables con los años de peregrinaje de mis antepasados.</w:t>
+        <w:t xml:space="preserve"> Jacob le respondió: —Tengo 130 años. Han sido años escasos y difíciles peregrinando de un lado a otro. Pero no son comparables con los años de peregrinaje de mis antepasados.</w:t>
       </w:r>
     </w:p>
     <w:p>
@@ -28040,7 +28040,7 @@
         <w:rPr>
           <w:lang w:val="es_ES" w:bidi="es_ES"/>
         </w:rPr>
-        <w:t xml:space="preserve"> José respondió:—Si ya no tienen más dinero, traigan su ganado para que se lo cambie por alimento.</w:t>
+        <w:t xml:space="preserve"> José respondió: —Si ya no tienen más dinero, traigan su ganado para que se lo cambie por alimento.</w:t>
       </w:r>
     </w:p>
     <w:p>
@@ -28082,7 +28082,7 @@
         <w:rPr>
           <w:lang w:val="es_ES" w:bidi="es_ES"/>
         </w:rPr>
-        <w:t xml:space="preserve"> Pasó aquel año y al siguiente fueron a decirle a José:—Señor, ya no tenemos más dinero, y nuestro ganado es ahora tuyo. Ya no tenemos nada, solo podemos ofrecerte nuestros cuerpos y nuestra tierra.</w:t>
+        <w:t xml:space="preserve"> Pasó aquel año y al siguiente fueron a decirle a José: —Señor, ya no tenemos más dinero, y nuestro ganado es ahora tuyo. Ya no tenemos nada, solo podemos ofrecerte nuestros cuerpos y nuestra tierra.</w:t>
       </w:r>
     </w:p>
     <w:p>
@@ -28208,7 +28208,7 @@
         <w:rPr>
           <w:lang w:val="es_ES" w:bidi="es_ES"/>
         </w:rPr>
-        <w:t xml:space="preserve"> Cuando llegue la cosecha, darán la quinta parte al faraón. Las cuatro partes restantes serán para ustedes. Les servirán para tener con qué sembrar y para el alimento de ustedes y sus familias.</w:t>
+        <w:t xml:space="preserve"> Cuando llegue la cosecha, darán la quinta parte al faraón. Las 4 partes restantes serán para ustedes. Les servirán para tener con qué sembrar y para el alimento de ustedes y sus familias.</w:t>
       </w:r>
     </w:p>
     <w:p>
@@ -28292,7 +28292,7 @@
         <w:rPr>
           <w:lang w:val="es_ES" w:bidi="es_ES"/>
         </w:rPr>
-        <w:t xml:space="preserve"> Jacob estuvo en Egipto diecisiete años. En total, llegó a vivir ciento cuarenta y siete años.</w:t>
+        <w:t xml:space="preserve"> Jacob estuvo en Egipto 17 años. En total, llegó a vivir 147 años.</w:t>
       </w:r>
     </w:p>
     <w:p>
@@ -28334,7 +28334,7 @@
         <w:rPr>
           <w:lang w:val="es_ES" w:bidi="es_ES"/>
         </w:rPr>
-        <w:t xml:space="preserve"> Cuando vaya a reunirme con mis antepasados, sácame de Egipto y entiérrame en el sepulcro de ellos.—Así lo haré —contestó José.</w:t>
+        <w:t xml:space="preserve"> Cuando vaya a reunirme con mis antepasados, sácame de Egipto y entiérrame en el sepulcro de ellos. —Así lo haré —contestó José.</w:t>
       </w:r>
     </w:p>
     <w:p>
@@ -28392,7 +28392,7 @@
         <w:rPr>
           <w:lang w:val="es_ES" w:bidi="es_ES"/>
         </w:rPr>
-        <w:t xml:space="preserve"> Poco tiempo después, le dijeron a José que su padre estaba enfermo. Entonces, tomó a sus dos hijos, Manasés y Efraín, y fue a visitarlo.</w:t>
+        <w:t xml:space="preserve"> Poco tiempo después, le dijeron a José que su padre estaba enfermo. Entonces, tomó a sus 2 hijos, Manasés y Efraín, y fue a visitarlo.</w:t>
       </w:r>
     </w:p>
     <w:p>
@@ -28434,7 +28434,7 @@
         <w:rPr>
           <w:lang w:val="es_ES" w:bidi="es_ES"/>
         </w:rPr>
-        <w:t xml:space="preserve"> y le dijo:—El Dios Todopoderoso se me apareció en Luz, en la tierra de Canaán. Me bendijo</w:t>
+        <w:t xml:space="preserve"> y le dijo: —El Dios Todopoderoso se me apareció en Luz, en la tierra de Canaán. Me bendijo</w:t>
       </w:r>
     </w:p>
     <w:p>
@@ -28455,7 +28455,7 @@
         <w:rPr>
           <w:lang w:val="es_ES" w:bidi="es_ES"/>
         </w:rPr>
-        <w:t xml:space="preserve"> con estas palabras: "Te haré fructificar y te multiplicaré. Haré que llegues a formar una gran cantidad de pueblos. A tus descendientes les daré esta tierra como posesión perpetua".</w:t>
+        <w:t xml:space="preserve"> con estas palabras: “Te haré fructificar y te multiplicaré. Haré que llegues a formar una gran cantidad de pueblos. A tus descendientes les daré esta tierra como posesión perpetua”.</w:t>
       </w:r>
     </w:p>
     <w:p>
@@ -28476,7 +28476,7 @@
         <w:rPr>
           <w:lang w:val="es_ES" w:bidi="es_ES"/>
         </w:rPr>
-        <w:t xml:space="preserve"> Los dos hijos que tuviste en Egipto antes de que yo me reuniera contigo serán míos. Efraín y Manasés serán tan míos como Rubén y Simeón.</w:t>
+        <w:t xml:space="preserve"> Los 2 hijos que tuviste en Egipto antes de que yo me reuniera contigo serán míos. Efraín y Manasés serán tan míos como Rubén y Simeón.</w:t>
       </w:r>
     </w:p>
     <w:p>
@@ -28617,7 +28617,7 @@
           <w:vertAlign w:val="superscript"/>
           <w:lang w:val="es_ES" w:bidi="es_ES"/>
         </w:rPr>
-        <w:t>13</w:t>
+        <w:t>12-13</w:t>
       </w:r>
       <w:r>
         <w:rPr>
@@ -28728,7 +28728,7 @@
         <w:rPr>
           <w:lang w:val="es_ES" w:bidi="es_ES"/>
         </w:rPr>
-        <w:t xml:space="preserve"> diciéndole:—¡Así no, padre! Este es el primogénito. Pon tu mano derecha sobre su cabeza.</w:t>
+        <w:t xml:space="preserve"> diciéndole: —¡Así no, padre! Este es el primogénito. Pon tu mano derecha sobre su cabeza.</w:t>
       </w:r>
     </w:p>
     <w:p>
@@ -28770,7 +28770,7 @@
         <w:rPr>
           <w:lang w:val="es_ES" w:bidi="es_ES"/>
         </w:rPr>
-        <w:t xml:space="preserve"> Aquel día Jacob los bendijo diciendo: —El pueblo de Israel usará este dicho como bendición: "Dios haga contigo como hizo con Efraín y Manasés". Así fue como Israel puso a Efraín por encima de Manasés.</w:t>
+        <w:t xml:space="preserve"> Aquel día Jacob los bendijo diciendo: —El pueblo de Israel usará este dicho como bendición: “Dios haga contigo como hizo con Efraín y Manasés”. Así fue como Israel puso a Efraín por encima de Manasés.</w:t>
       </w:r>
     </w:p>
     <w:p>
@@ -29017,7 +29017,7 @@
         <w:rPr>
           <w:lang w:val="es_ES" w:bidi="es_ES"/>
         </w:rPr>
-        <w:t xml:space="preserve"> Judá, mi hijo, es un cachorro de león alimentado de su presa. Se agazapa como un león, se recuesta como una leona,¿quién se atreverá a despertarlo?</w:t>
+        <w:t xml:space="preserve"> Judá, mi hijo, es un cachorro de león alimentado de su presa. Se agazapa como un león, se recuesta como una leona, ¿quién se atreverá a despertarlo?</w:t>
       </w:r>
     </w:p>
     <w:p>
@@ -29143,7 +29143,7 @@
         <w:rPr>
           <w:lang w:val="es_ES" w:bidi="es_ES"/>
         </w:rPr>
-        <w:t xml:space="preserve"> Cuando vio que el establo era bueno y la tierra agradable, inclinó su hombro para cargar el fardoy accedió a ser esclavo.</w:t>
+        <w:t xml:space="preserve"> Cuando vio que el establo era bueno y la tierra agradable, inclinó su hombro para cargar el fardo y accedió a ser esclavo.</w:t>
       </w:r>
     </w:p>
     <w:p>
@@ -29185,7 +29185,7 @@
         <w:rPr>
           <w:lang w:val="es_ES" w:bidi="es_ES"/>
         </w:rPr>
-        <w:t xml:space="preserve"> Será como serpiente en el camino, como víbora junto al sendero, que muerde los talones del caballoy hace caer de espaldas al jinete.</w:t>
+        <w:t xml:space="preserve"> Será como serpiente en el camino, como víbora junto al sendero, que muerde los talones del caballo y hace caer de espaldas al jinete.</w:t>
       </w:r>
     </w:p>
     <w:p>
@@ -29269,7 +29269,7 @@
         <w:rPr>
           <w:lang w:val="es_ES" w:bidi="es_ES"/>
         </w:rPr>
-        <w:t xml:space="preserve"> Neftalí es una cierva en libertadcon preciosos cervatillos.</w:t>
+        <w:t xml:space="preserve"> Neftalí es una cierva en libertad con preciosos cervatillos.</w:t>
       </w:r>
     </w:p>
     <w:p>
@@ -29311,7 +29311,7 @@
         <w:rPr>
           <w:lang w:val="es_ES" w:bidi="es_ES"/>
         </w:rPr>
-        <w:t xml:space="preserve"> Los arqueros lo atacan sin piedad,le lanzan flechas, le amargan la vida.</w:t>
+        <w:t xml:space="preserve"> Los arqueros lo atacan sin piedad, le lanzan flechas, le amargan la vida.</w:t>
       </w:r>
     </w:p>
     <w:p>
@@ -29332,7 +29332,7 @@
         <w:rPr>
           <w:lang w:val="es_ES" w:bidi="es_ES"/>
         </w:rPr>
-        <w:t xml:space="preserve"> Pero su arco se mantuvo firme, fueron fortalecidos sus brazospor la mano del Fuerte de Jacob, por el Pastor, la Roca de Israel.</w:t>
+        <w:t xml:space="preserve"> Pero su arco se mantuvo firme, fueron fortalecidos sus brazos por la mano del Fuerte de Jacob, por el Pastor, la Roca de Israel.</w:t>
       </w:r>
     </w:p>
     <w:p>
@@ -29353,7 +29353,7 @@
         <w:rPr>
           <w:lang w:val="es_ES" w:bidi="es_ES"/>
         </w:rPr>
-        <w:t xml:space="preserve"> El Dios de tus padres te protege, el Todopoderoso te bendice con bendiciones de lo alto,con bendiciones del mar profundo, con bendiciones de los pechos y del seno materno.</w:t>
+        <w:t xml:space="preserve"> El Dios de tus padres te protege, el Todopoderoso te bendice con bendiciones de lo alto, con bendiciones del mar profundo, con bendiciones de los pechos y del seno materno.</w:t>
       </w:r>
     </w:p>
     <w:p>
@@ -29374,7 +29374,7 @@
         <w:rPr>
           <w:lang w:val="es_ES" w:bidi="es_ES"/>
         </w:rPr>
-        <w:t xml:space="preserve"> Las bendiciones de tu padre son mejores que las de los montes antiguos,mejores que las de las colinas eternas.Estas bendiciones reposarán sobre la cabeza de José,sobre la frente del escogidoentre todos sus hermanos.</w:t>
+        <w:t xml:space="preserve"> Las bendiciones de tu padre son mejores que las de los montes antiguos, mejores que las de las colinas eternas. Estas bendiciones reposarán sobre la cabeza de José, sobre la frente del escogido entre todos sus hermanos.</w:t>
       </w:r>
     </w:p>
     <w:p>
@@ -29395,7 +29395,7 @@
         <w:rPr>
           <w:lang w:val="es_ES" w:bidi="es_ES"/>
         </w:rPr>
-        <w:t xml:space="preserve"> Benjamín es un lobo rapaz; por la mañana devora la presay por la tarde reparte los despojos.</w:t>
+        <w:t xml:space="preserve"> Benjamín es un lobo rapaz; por la mañana devora la presa y por la tarde reparte los despojos.</w:t>
       </w:r>
     </w:p>
     <w:p>
@@ -29431,13 +29431,13 @@
           <w:vertAlign w:val="superscript"/>
           <w:lang w:val="es_ES" w:bidi="es_ES"/>
         </w:rPr>
-        <w:t>30</w:t>
-      </w:r>
-      <w:r>
-        <w:rPr>
-          <w:lang w:val="es_ES" w:bidi="es_ES"/>
-        </w:rPr>
-        <w:t xml:space="preserve"> Además, Jacob les dio estas instrucciones:—Yo estoy a punto de ir a encontrarme con mis antepasados. Sepúltenme con mis antepasados en la cueva del campode Macpela, frente a Mamré, en Canaán. Está en el campo que Abraham le compró a Efrón, el hitita, para sepultar allí a su familia.</w:t>
+        <w:t>29-30</w:t>
+      </w:r>
+      <w:r>
+        <w:rPr>
+          <w:lang w:val="es_ES" w:bidi="es_ES"/>
+        </w:rPr>
+        <w:t xml:space="preserve"> Además, Jacob les dio estas instrucciones: —Yo estoy a punto de ir a encontrarme con mis antepasados. Sepúltenme con mis antepasados en la cueva del campo de Macpela, frente a Mamré, en Canaán. Está en el campo que Abraham le compró a Efrón, el hitita, para sepultar allí a su familia.</w:t>
       </w:r>
     </w:p>
     <w:p>
@@ -29500,7 +29500,7 @@
         <w:rPr>
           <w:lang w:val="es_ES" w:bidi="es_ES"/>
         </w:rPr>
-        <w:t xml:space="preserve"> Cuando Jacob terminó de dar estas instrucciones a sus hijos, volvió a la cama. Dio su último suspiro y fue a econtrarse con sus antepasados.</w:t>
+        <w:t xml:space="preserve"> Cuando Jacob terminó de dar estas instrucciones a sus hijos, volvió a la cama. Dio su último suspiro y fue a encontrarse con sus antepasados.</w:t>
       </w:r>
     </w:p>
     <w:p>
@@ -29657,7 +29657,7 @@
           <w:vertAlign w:val="superscript"/>
           <w:lang w:val="es_ES" w:bidi="es_ES"/>
         </w:rPr>
-        <w:t>8</w:t>
+        <w:t>7-8</w:t>
       </w:r>
       <w:r>
         <w:rPr>
@@ -29705,7 +29705,7 @@
         <w:rPr>
           <w:lang w:val="es_ES" w:bidi="es_ES"/>
         </w:rPr>
-        <w:t xml:space="preserve"> Cuando llegaron al campo de Atad, que está al otro lado del Jordán, manifestaron sus lamentaciones con gran solemnidad. Allí José guardó siete días de luto por su padre.</w:t>
+        <w:t xml:space="preserve"> Cuando llegaron al campo de Atad, que está al otro lado del Jordán, manifestaron sus lamentaciones con gran solemnidad. Allí José guardó 7 días de luto por su padre.</w:t>
       </w:r>
     </w:p>
     <w:p>
@@ -29726,22 +29726,22 @@
         <w:rPr>
           <w:lang w:val="es_ES" w:bidi="es_ES"/>
         </w:rPr>
-        <w:t xml:space="preserve"> Los habitantes del lugar, los cananeos, vieron aquellas manifestaciones de duelo en el campo de Atad. Dijeron:—Los egipcios están haciendo un duelo muy solemne. Por eso llamaron Abel Misrayin1 a ese lugar que está al otro lado del Jordán.</w:t>
-      </w:r>
-    </w:p>
-    <w:p>
-      <w:pPr/>
-      <w:r>
-        <w:rPr>
-          <w:lang w:val="es_ES" w:bidi="es_ES"/>
-        </w:rPr>
-      </w:r>
-      <w:r>
-        <w:rPr>
-          <w:vertAlign w:val="superscript"/>
-          <w:lang w:val="es_ES" w:bidi="es_ES"/>
-        </w:rPr>
-        <w:t>13</w:t>
+        <w:t xml:space="preserve"> Los habitantes del lugar, los cananeos, vieron aquellas manifestaciones de duelo en el campo de Atad. Dijeron: —Los egipcios están haciendo un duelo muy solemne. Por eso llamaron Abel Misrayin a ese lugar que está al otro lado del Jordán.</w:t>
+      </w:r>
+    </w:p>
+    <w:p>
+      <w:pPr/>
+      <w:r>
+        <w:rPr>
+          <w:lang w:val="es_ES" w:bidi="es_ES"/>
+        </w:rPr>
+      </w:r>
+      <w:r>
+        <w:rPr>
+          <w:vertAlign w:val="superscript"/>
+          <w:lang w:val="es_ES" w:bidi="es_ES"/>
+        </w:rPr>
+        <w:t>12-13</w:t>
       </w:r>
       <w:r>
         <w:rPr>
@@ -29789,7 +29789,7 @@
         <w:rPr>
           <w:lang w:val="es_ES" w:bidi="es_ES"/>
         </w:rPr>
-        <w:t xml:space="preserve"> Cuando los hermanos de José vieron que su padre había muerto, dijeron:—Tal vez José nos guarde rencor y quiera devolvernos todo el mal que le hicimos.</w:t>
+        <w:t xml:space="preserve"> Cuando los hermanos de José vieron que su padre había muerto, dijeron: —Tal vez José nos guarde rencor y quiera devolvernos todo el mal que le hicimos.</w:t>
       </w:r>
     </w:p>
     <w:p>
@@ -29810,7 +29810,7 @@
         <w:rPr>
           <w:lang w:val="es_ES" w:bidi="es_ES"/>
         </w:rPr>
-        <w:t xml:space="preserve"> Así que le hicieron llegar a José este mensaje:—Antes de morir, tu padre dejó estas instrucciones:</w:t>
+        <w:t xml:space="preserve"> Así que le hicieron llegar a José este mensaje: —Antes de morir, tu padre dejó estas instrucciones:</w:t>
       </w:r>
     </w:p>
     <w:p>
@@ -29831,7 +29831,7 @@
         <w:rPr>
           <w:lang w:val="es_ES" w:bidi="es_ES"/>
         </w:rPr>
-        <w:t xml:space="preserve"> “Díganle a José que perdone el terrible crimen y el pecado que sus hermanos cometieron contra él”. Ahora, por favor, perdona el pecado de los siervos del Dios de tu padre.Cuando José escuchó estas palabras, se conmovió profundamente y se echó a llorar.</w:t>
+        <w:t xml:space="preserve"> “Díganle a José que perdone el terrible crimen y el pecado que sus hermanos cometieron contra él”. Ahora, por favor, perdona el pecado de los siervos del Dios de tu padre. Cuando José escuchó estas palabras, se conmovió profundamente y se echó a llorar.</w:t>
       </w:r>
     </w:p>
     <w:p>
@@ -29936,7 +29936,7 @@
         <w:rPr>
           <w:lang w:val="es_ES" w:bidi="es_ES"/>
         </w:rPr>
-        <w:t xml:space="preserve"> José y la familia de su padre se quedaron en Egipto. José vivió ciento diez años</w:t>
+        <w:t xml:space="preserve"> José y la familia de su padre se quedaron en Egipto. José vivió 110 años</w:t>
       </w:r>
     </w:p>
     <w:p>
@@ -29978,7 +29978,7 @@
         <w:rPr>
           <w:lang w:val="es_ES" w:bidi="es_ES"/>
         </w:rPr>
-        <w:t xml:space="preserve"> Tiempo después, José dijo a sus hermanos:—Ya me queda poco para morir, pero Dios vendrá y los sacará de este país para llevarlos a la tierra que prometió a Abraham, Isaac y Jacob.</w:t>
+        <w:t xml:space="preserve"> Tiempo después, José dijo a sus hermanos: —Ya me queda poco para morir, pero Dios vendrá y los sacará de este país para llevarlos a la tierra que prometió a Abraham, Isaac y Jacob.</w:t>
       </w:r>
     </w:p>
     <w:p>
@@ -29999,7 +29999,7 @@
         <w:rPr>
           <w:lang w:val="es_ES" w:bidi="es_ES"/>
         </w:rPr>
-        <w:t xml:space="preserve"> Entonces José exigió este juramento a sus hijos:—Dios vendrá a ayudarlos. Cuando venga, ustedes se llevarán de aquí mis huesos.</w:t>
+        <w:t xml:space="preserve"> Entonces José exigió este juramento a sus hijos: —Dios vendrá a ayudarlos. Cuando venga, ustedes se llevarán de aquí mis huesos.</w:t>
       </w:r>
     </w:p>
     <w:p>

</xml_diff>